<commit_message>
Added robos.txt configuration instructions for CORTEX Configuration Portal and CORTEX Interaction Portal (#272)
Added robos.txt configuration instructions for CORTEX Configuration Portal and CORTEX Interaction Portal
</commit_message>
<xml_diff>
--- a/content/static/word/CORTEX Interaction Portal - Deployment Guide.docx
+++ b/content/static/word/CORTEX Interaction Portal - Deployment Guide.docx
@@ -252,7 +252,7 @@
           <w:r>
             <w:fldChar w:fldCharType="separate"/>
           </w:r>
-          <w:hyperlink w:anchor="_Toc184734242" w:history="1">
+          <w:hyperlink w:anchor="_Toc226541307" w:history="1">
             <w:r>
               <w:rPr>
                 <w:rStyle w:val="Hyperlink"/>
@@ -279,7 +279,7 @@
                 <w:noProof/>
                 <w:webHidden/>
               </w:rPr>
-              <w:instrText xml:space="preserve"> PAGEREF _Toc184734242 \h </w:instrText>
+              <w:instrText xml:space="preserve"> PAGEREF _Toc226541307 \h </w:instrText>
             </w:r>
             <w:r>
               <w:rPr>
@@ -299,7 +299,7 @@
                 <w:noProof/>
                 <w:webHidden/>
               </w:rPr>
-              <w:t>4</w:t>
+              <w:t>5</w:t>
             </w:r>
             <w:r>
               <w:rPr>
@@ -326,7 +326,7 @@
               <w14:ligatures w14:val="standardContextual"/>
             </w:rPr>
           </w:pPr>
-          <w:hyperlink w:anchor="_Toc184734243" w:history="1">
+          <w:hyperlink w:anchor="_Toc226541308" w:history="1">
             <w:r>
               <w:rPr>
                 <w:rStyle w:val="Hyperlink"/>
@@ -353,7 +353,7 @@
                 <w:noProof/>
                 <w:webHidden/>
               </w:rPr>
-              <w:instrText xml:space="preserve"> PAGEREF _Toc184734243 \h </w:instrText>
+              <w:instrText xml:space="preserve"> PAGEREF _Toc226541308 \h </w:instrText>
             </w:r>
             <w:r>
               <w:rPr>
@@ -373,7 +373,7 @@
                 <w:noProof/>
                 <w:webHidden/>
               </w:rPr>
-              <w:t>4</w:t>
+              <w:t>5</w:t>
             </w:r>
             <w:r>
               <w:rPr>
@@ -400,7 +400,7 @@
               <w14:ligatures w14:val="standardContextual"/>
             </w:rPr>
           </w:pPr>
-          <w:hyperlink w:anchor="_Toc184734244" w:history="1">
+          <w:hyperlink w:anchor="_Toc226541309" w:history="1">
             <w:r>
               <w:rPr>
                 <w:rStyle w:val="Hyperlink"/>
@@ -427,7 +427,7 @@
                 <w:noProof/>
                 <w:webHidden/>
               </w:rPr>
-              <w:instrText xml:space="preserve"> PAGEREF _Toc184734244 \h </w:instrText>
+              <w:instrText xml:space="preserve"> PAGEREF _Toc226541309 \h </w:instrText>
             </w:r>
             <w:r>
               <w:rPr>
@@ -447,7 +447,7 @@
                 <w:noProof/>
                 <w:webHidden/>
               </w:rPr>
-              <w:t>5</w:t>
+              <w:t>6</w:t>
             </w:r>
             <w:r>
               <w:rPr>
@@ -474,7 +474,7 @@
               <w14:ligatures w14:val="standardContextual"/>
             </w:rPr>
           </w:pPr>
-          <w:hyperlink w:anchor="_Toc184734245" w:history="1">
+          <w:hyperlink w:anchor="_Toc226541310" w:history="1">
             <w:r>
               <w:rPr>
                 <w:rStyle w:val="Hyperlink"/>
@@ -501,7 +501,7 @@
                 <w:noProof/>
                 <w:webHidden/>
               </w:rPr>
-              <w:instrText xml:space="preserve"> PAGEREF _Toc184734245 \h </w:instrText>
+              <w:instrText xml:space="preserve"> PAGEREF _Toc226541310 \h </w:instrText>
             </w:r>
             <w:r>
               <w:rPr>
@@ -521,7 +521,7 @@
                 <w:noProof/>
                 <w:webHidden/>
               </w:rPr>
-              <w:t>10</w:t>
+              <w:t>11</w:t>
             </w:r>
             <w:r>
               <w:rPr>
@@ -548,7 +548,7 @@
               <w14:ligatures w14:val="standardContextual"/>
             </w:rPr>
           </w:pPr>
-          <w:hyperlink w:anchor="_Toc184734246" w:history="1">
+          <w:hyperlink w:anchor="_Toc226541311" w:history="1">
             <w:r>
               <w:rPr>
                 <w:rStyle w:val="Hyperlink"/>
@@ -575,7 +575,7 @@
                 <w:noProof/>
                 <w:webHidden/>
               </w:rPr>
-              <w:instrText xml:space="preserve"> PAGEREF _Toc184734246 \h </w:instrText>
+              <w:instrText xml:space="preserve"> PAGEREF _Toc226541311 \h </w:instrText>
             </w:r>
             <w:r>
               <w:rPr>
@@ -595,7 +595,7 @@
                 <w:noProof/>
                 <w:webHidden/>
               </w:rPr>
-              <w:t>10</w:t>
+              <w:t>11</w:t>
             </w:r>
             <w:r>
               <w:rPr>
@@ -622,7 +622,7 @@
               <w14:ligatures w14:val="standardContextual"/>
             </w:rPr>
           </w:pPr>
-          <w:hyperlink w:anchor="_Toc184734247" w:history="1">
+          <w:hyperlink w:anchor="_Toc226541312" w:history="1">
             <w:r>
               <w:rPr>
                 <w:rStyle w:val="Hyperlink"/>
@@ -649,7 +649,7 @@
                 <w:noProof/>
                 <w:webHidden/>
               </w:rPr>
-              <w:instrText xml:space="preserve"> PAGEREF _Toc184734247 \h </w:instrText>
+              <w:instrText xml:space="preserve"> PAGEREF _Toc226541312 \h </w:instrText>
             </w:r>
             <w:r>
               <w:rPr>
@@ -669,7 +669,7 @@
                 <w:noProof/>
                 <w:webHidden/>
               </w:rPr>
-              <w:t>10</w:t>
+              <w:t>11</w:t>
             </w:r>
             <w:r>
               <w:rPr>
@@ -696,7 +696,7 @@
               <w14:ligatures w14:val="standardContextual"/>
             </w:rPr>
           </w:pPr>
-          <w:hyperlink w:anchor="_Toc184734248" w:history="1">
+          <w:hyperlink w:anchor="_Toc226541313" w:history="1">
             <w:r>
               <w:rPr>
                 <w:rStyle w:val="Hyperlink"/>
@@ -723,7 +723,7 @@
                 <w:noProof/>
                 <w:webHidden/>
               </w:rPr>
-              <w:instrText xml:space="preserve"> PAGEREF _Toc184734248 \h </w:instrText>
+              <w:instrText xml:space="preserve"> PAGEREF _Toc226541313 \h </w:instrText>
             </w:r>
             <w:r>
               <w:rPr>
@@ -743,7 +743,7 @@
                 <w:noProof/>
                 <w:webHidden/>
               </w:rPr>
-              <w:t>11</w:t>
+              <w:t>12</w:t>
             </w:r>
             <w:r>
               <w:rPr>
@@ -770,7 +770,7 @@
               <w14:ligatures w14:val="standardContextual"/>
             </w:rPr>
           </w:pPr>
-          <w:hyperlink w:anchor="_Toc184734249" w:history="1">
+          <w:hyperlink w:anchor="_Toc226541314" w:history="1">
             <w:r>
               <w:rPr>
                 <w:rStyle w:val="Hyperlink"/>
@@ -797,7 +797,7 @@
                 <w:noProof/>
                 <w:webHidden/>
               </w:rPr>
-              <w:instrText xml:space="preserve"> PAGEREF _Toc184734249 \h </w:instrText>
+              <w:instrText xml:space="preserve"> PAGEREF _Toc226541314 \h </w:instrText>
             </w:r>
             <w:r>
               <w:rPr>
@@ -817,7 +817,7 @@
                 <w:noProof/>
                 <w:webHidden/>
               </w:rPr>
-              <w:t>12</w:t>
+              <w:t>13</w:t>
             </w:r>
             <w:r>
               <w:rPr>
@@ -844,7 +844,7 @@
               <w14:ligatures w14:val="standardContextual"/>
             </w:rPr>
           </w:pPr>
-          <w:hyperlink w:anchor="_Toc184734250" w:history="1">
+          <w:hyperlink w:anchor="_Toc226541315" w:history="1">
             <w:r>
               <w:rPr>
                 <w:rStyle w:val="Hyperlink"/>
@@ -871,7 +871,7 @@
                 <w:noProof/>
                 <w:webHidden/>
               </w:rPr>
-              <w:instrText xml:space="preserve"> PAGEREF _Toc184734250 \h </w:instrText>
+              <w:instrText xml:space="preserve"> PAGEREF _Toc226541315 \h </w:instrText>
             </w:r>
             <w:r>
               <w:rPr>
@@ -891,7 +891,7 @@
                 <w:noProof/>
                 <w:webHidden/>
               </w:rPr>
-              <w:t>17</w:t>
+              <w:t>18</w:t>
             </w:r>
             <w:r>
               <w:rPr>
@@ -918,7 +918,7 @@
               <w14:ligatures w14:val="standardContextual"/>
             </w:rPr>
           </w:pPr>
-          <w:hyperlink w:anchor="_Toc184734251" w:history="1">
+          <w:hyperlink w:anchor="_Toc226541316" w:history="1">
             <w:r>
               <w:rPr>
                 <w:rStyle w:val="Hyperlink"/>
@@ -945,7 +945,7 @@
                 <w:noProof/>
                 <w:webHidden/>
               </w:rPr>
-              <w:instrText xml:space="preserve"> PAGEREF _Toc184734251 \h </w:instrText>
+              <w:instrText xml:space="preserve"> PAGEREF _Toc226541316 \h </w:instrText>
             </w:r>
             <w:r>
               <w:rPr>
@@ -965,7 +965,7 @@
                 <w:noProof/>
                 <w:webHidden/>
               </w:rPr>
-              <w:t>18</w:t>
+              <w:t>19</w:t>
             </w:r>
             <w:r>
               <w:rPr>
@@ -992,7 +992,7 @@
               <w14:ligatures w14:val="standardContextual"/>
             </w:rPr>
           </w:pPr>
-          <w:hyperlink w:anchor="_Toc184734252" w:history="1">
+          <w:hyperlink w:anchor="_Toc226541317" w:history="1">
             <w:r>
               <w:rPr>
                 <w:rStyle w:val="Hyperlink"/>
@@ -1019,7 +1019,7 @@
                 <w:noProof/>
                 <w:webHidden/>
               </w:rPr>
-              <w:instrText xml:space="preserve"> PAGEREF _Toc184734252 \h </w:instrText>
+              <w:instrText xml:space="preserve"> PAGEREF _Toc226541317 \h </w:instrText>
             </w:r>
             <w:r>
               <w:rPr>
@@ -1039,7 +1039,7 @@
                 <w:noProof/>
                 <w:webHidden/>
               </w:rPr>
-              <w:t>19</w:t>
+              <w:t>20</w:t>
             </w:r>
             <w:r>
               <w:rPr>
@@ -1066,7 +1066,7 @@
               <w14:ligatures w14:val="standardContextual"/>
             </w:rPr>
           </w:pPr>
-          <w:hyperlink w:anchor="_Toc184734253" w:history="1">
+          <w:hyperlink w:anchor="_Toc226541318" w:history="1">
             <w:r>
               <w:rPr>
                 <w:rStyle w:val="Hyperlink"/>
@@ -1093,7 +1093,7 @@
                 <w:noProof/>
                 <w:webHidden/>
               </w:rPr>
-              <w:instrText xml:space="preserve"> PAGEREF _Toc184734253 \h </w:instrText>
+              <w:instrText xml:space="preserve"> PAGEREF _Toc226541318 \h </w:instrText>
             </w:r>
             <w:r>
               <w:rPr>
@@ -1113,7 +1113,7 @@
                 <w:noProof/>
                 <w:webHidden/>
               </w:rPr>
-              <w:t>23</w:t>
+              <w:t>24</w:t>
             </w:r>
             <w:r>
               <w:rPr>
@@ -1140,7 +1140,7 @@
               <w14:ligatures w14:val="standardContextual"/>
             </w:rPr>
           </w:pPr>
-          <w:hyperlink w:anchor="_Toc184734254" w:history="1">
+          <w:hyperlink w:anchor="_Toc226541319" w:history="1">
             <w:r>
               <w:rPr>
                 <w:rStyle w:val="Hyperlink"/>
@@ -1167,7 +1167,7 @@
                 <w:noProof/>
                 <w:webHidden/>
               </w:rPr>
-              <w:instrText xml:space="preserve"> PAGEREF _Toc184734254 \h </w:instrText>
+              <w:instrText xml:space="preserve"> PAGEREF _Toc226541319 \h </w:instrText>
             </w:r>
             <w:r>
               <w:rPr>
@@ -1187,7 +1187,7 @@
                 <w:noProof/>
                 <w:webHidden/>
               </w:rPr>
-              <w:t>23</w:t>
+              <w:t>24</w:t>
             </w:r>
             <w:r>
               <w:rPr>
@@ -1214,7 +1214,7 @@
               <w14:ligatures w14:val="standardContextual"/>
             </w:rPr>
           </w:pPr>
-          <w:hyperlink w:anchor="_Toc184734255" w:history="1">
+          <w:hyperlink w:anchor="_Toc226541320" w:history="1">
             <w:r>
               <w:rPr>
                 <w:rStyle w:val="Hyperlink"/>
@@ -1241,7 +1241,7 @@
                 <w:noProof/>
                 <w:webHidden/>
               </w:rPr>
-              <w:instrText xml:space="preserve"> PAGEREF _Toc184734255 \h </w:instrText>
+              <w:instrText xml:space="preserve"> PAGEREF _Toc226541320 \h </w:instrText>
             </w:r>
             <w:r>
               <w:rPr>
@@ -1261,7 +1261,7 @@
                 <w:noProof/>
                 <w:webHidden/>
               </w:rPr>
-              <w:t>24</w:t>
+              <w:t>25</w:t>
             </w:r>
             <w:r>
               <w:rPr>
@@ -1288,7 +1288,7 @@
               <w14:ligatures w14:val="standardContextual"/>
             </w:rPr>
           </w:pPr>
-          <w:hyperlink w:anchor="_Toc184734256" w:history="1">
+          <w:hyperlink w:anchor="_Toc226541321" w:history="1">
             <w:r>
               <w:rPr>
                 <w:rStyle w:val="Hyperlink"/>
@@ -1315,7 +1315,7 @@
                 <w:noProof/>
                 <w:webHidden/>
               </w:rPr>
-              <w:instrText xml:space="preserve"> PAGEREF _Toc184734256 \h </w:instrText>
+              <w:instrText xml:space="preserve"> PAGEREF _Toc226541321 \h </w:instrText>
             </w:r>
             <w:r>
               <w:rPr>
@@ -1335,7 +1335,7 @@
                 <w:noProof/>
                 <w:webHidden/>
               </w:rPr>
-              <w:t>30</w:t>
+              <w:t>31</w:t>
             </w:r>
             <w:r>
               <w:rPr>
@@ -1362,7 +1362,7 @@
               <w14:ligatures w14:val="standardContextual"/>
             </w:rPr>
           </w:pPr>
-          <w:hyperlink w:anchor="_Toc184734257" w:history="1">
+          <w:hyperlink w:anchor="_Toc226541322" w:history="1">
             <w:r>
               <w:rPr>
                 <w:rStyle w:val="Hyperlink"/>
@@ -1389,7 +1389,7 @@
                 <w:noProof/>
                 <w:webHidden/>
               </w:rPr>
-              <w:instrText xml:space="preserve"> PAGEREF _Toc184734257 \h </w:instrText>
+              <w:instrText xml:space="preserve"> PAGEREF _Toc226541322 \h </w:instrText>
             </w:r>
             <w:r>
               <w:rPr>
@@ -1409,7 +1409,7 @@
                 <w:noProof/>
                 <w:webHidden/>
               </w:rPr>
-              <w:t>31</w:t>
+              <w:t>32</w:t>
             </w:r>
             <w:r>
               <w:rPr>
@@ -1436,7 +1436,7 @@
               <w14:ligatures w14:val="standardContextual"/>
             </w:rPr>
           </w:pPr>
-          <w:hyperlink w:anchor="_Toc184734258" w:history="1">
+          <w:hyperlink w:anchor="_Toc226541323" w:history="1">
             <w:r>
               <w:rPr>
                 <w:rStyle w:val="Hyperlink"/>
@@ -1463,7 +1463,7 @@
                 <w:noProof/>
                 <w:webHidden/>
               </w:rPr>
-              <w:instrText xml:space="preserve"> PAGEREF _Toc184734258 \h </w:instrText>
+              <w:instrText xml:space="preserve"> PAGEREF _Toc226541323 \h </w:instrText>
             </w:r>
             <w:r>
               <w:rPr>
@@ -1483,7 +1483,7 @@
                 <w:noProof/>
                 <w:webHidden/>
               </w:rPr>
-              <w:t>32</w:t>
+              <w:t>33</w:t>
             </w:r>
             <w:r>
               <w:rPr>
@@ -1510,13 +1510,13 @@
               <w14:ligatures w14:val="standardContextual"/>
             </w:rPr>
           </w:pPr>
-          <w:hyperlink w:anchor="_Toc184734259" w:history="1">
+          <w:hyperlink w:anchor="_Toc226541324" w:history="1">
             <w:r>
               <w:rPr>
                 <w:rStyle w:val="Hyperlink"/>
                 <w:noProof/>
               </w:rPr>
-              <w:t>2.14 Web App Redirect Rule</w:t>
+              <w:t>2.14 Copy robots.txt file</w:t>
             </w:r>
             <w:r>
               <w:rPr>
@@ -1537,7 +1537,7 @@
                 <w:noProof/>
                 <w:webHidden/>
               </w:rPr>
-              <w:instrText xml:space="preserve"> PAGEREF _Toc184734259 \h </w:instrText>
+              <w:instrText xml:space="preserve"> PAGEREF _Toc226541324 \h </w:instrText>
             </w:r>
             <w:r>
               <w:rPr>
@@ -1557,7 +1557,7 @@
                 <w:noProof/>
                 <w:webHidden/>
               </w:rPr>
-              <w:t>33</w:t>
+              <w:t>34</w:t>
             </w:r>
             <w:r>
               <w:rPr>
@@ -1584,13 +1584,13 @@
               <w14:ligatures w14:val="standardContextual"/>
             </w:rPr>
           </w:pPr>
-          <w:hyperlink w:anchor="_Toc184734260" w:history="1">
+          <w:hyperlink w:anchor="_Toc226541325" w:history="1">
             <w:r>
               <w:rPr>
                 <w:rStyle w:val="Hyperlink"/>
                 <w:noProof/>
               </w:rPr>
-              <w:t>2.15 CORS Configuration</w:t>
+              <w:t>2.15 Web App Redirect Rule</w:t>
             </w:r>
             <w:r>
               <w:rPr>
@@ -1611,7 +1611,7 @@
                 <w:noProof/>
                 <w:webHidden/>
               </w:rPr>
-              <w:instrText xml:space="preserve"> PAGEREF _Toc184734260 \h </w:instrText>
+              <w:instrText xml:space="preserve"> PAGEREF _Toc226541325 \h </w:instrText>
             </w:r>
             <w:r>
               <w:rPr>
@@ -1631,7 +1631,7 @@
                 <w:noProof/>
                 <w:webHidden/>
               </w:rPr>
-              <w:t>33</w:t>
+              <w:t>34</w:t>
             </w:r>
             <w:r>
               <w:rPr>
@@ -1658,13 +1658,13 @@
               <w14:ligatures w14:val="standardContextual"/>
             </w:rPr>
           </w:pPr>
-          <w:hyperlink w:anchor="_Toc184734261" w:history="1">
+          <w:hyperlink w:anchor="_Toc226541326" w:history="1">
             <w:r>
               <w:rPr>
                 <w:rStyle w:val="Hyperlink"/>
                 <w:noProof/>
               </w:rPr>
-              <w:t>2.16 Housekeeping Tasks</w:t>
+              <w:t>2.16 CORS Configuration</w:t>
             </w:r>
             <w:r>
               <w:rPr>
@@ -1685,7 +1685,7 @@
                 <w:noProof/>
                 <w:webHidden/>
               </w:rPr>
-              <w:instrText xml:space="preserve"> PAGEREF _Toc184734261 \h </w:instrText>
+              <w:instrText xml:space="preserve"> PAGEREF _Toc226541326 \h </w:instrText>
             </w:r>
             <w:r>
               <w:rPr>
@@ -1705,7 +1705,81 @@
                 <w:noProof/>
                 <w:webHidden/>
               </w:rPr>
-              <w:t>34</w:t>
+              <w:t>35</w:t>
+            </w:r>
+            <w:r>
+              <w:rPr>
+                <w:noProof/>
+                <w:webHidden/>
+              </w:rPr>
+              <w:fldChar w:fldCharType="end"/>
+            </w:r>
+          </w:hyperlink>
+        </w:p>
+        <w:p>
+          <w:pPr>
+            <w:pStyle w:val="TOC2"/>
+            <w:tabs>
+              <w:tab w:val="right" w:leader="dot" w:pos="10456"/>
+            </w:tabs>
+            <w:rPr>
+              <w:rFonts w:asciiTheme="minorHAnsi" w:eastAsiaTheme="minorEastAsia" w:hAnsiTheme="minorHAnsi"/>
+              <w:noProof/>
+              <w:kern w:val="2"/>
+              <w:sz w:val="24"/>
+              <w:szCs w:val="24"/>
+              <w:lang w:eastAsia="en-GB"/>
+              <w14:ligatures w14:val="standardContextual"/>
+            </w:rPr>
+          </w:pPr>
+          <w:hyperlink w:anchor="_Toc226541327" w:history="1">
+            <w:r>
+              <w:rPr>
+                <w:rStyle w:val="Hyperlink"/>
+                <w:noProof/>
+              </w:rPr>
+              <w:t>2.17 Housekeeping Tasks</w:t>
+            </w:r>
+            <w:r>
+              <w:rPr>
+                <w:noProof/>
+                <w:webHidden/>
+              </w:rPr>
+              <w:tab/>
+            </w:r>
+            <w:r>
+              <w:rPr>
+                <w:noProof/>
+                <w:webHidden/>
+              </w:rPr>
+              <w:fldChar w:fldCharType="begin"/>
+            </w:r>
+            <w:r>
+              <w:rPr>
+                <w:noProof/>
+                <w:webHidden/>
+              </w:rPr>
+              <w:instrText xml:space="preserve"> PAGEREF _Toc226541327 \h </w:instrText>
+            </w:r>
+            <w:r>
+              <w:rPr>
+                <w:noProof/>
+                <w:webHidden/>
+              </w:rPr>
+            </w:r>
+            <w:r>
+              <w:rPr>
+                <w:noProof/>
+                <w:webHidden/>
+              </w:rPr>
+              <w:fldChar w:fldCharType="separate"/>
+            </w:r>
+            <w:r>
+              <w:rPr>
+                <w:noProof/>
+                <w:webHidden/>
+              </w:rPr>
+              <w:t>36</w:t>
             </w:r>
             <w:r>
               <w:rPr>
@@ -1732,7 +1806,7 @@
               <w14:ligatures w14:val="standardContextual"/>
             </w:rPr>
           </w:pPr>
-          <w:hyperlink w:anchor="_Toc184734262" w:history="1">
+          <w:hyperlink w:anchor="_Toc226541328" w:history="1">
             <w:r>
               <w:rPr>
                 <w:rStyle w:val="Hyperlink"/>
@@ -1759,7 +1833,7 @@
                 <w:noProof/>
                 <w:webHidden/>
               </w:rPr>
-              <w:instrText xml:space="preserve"> PAGEREF _Toc184734262 \h </w:instrText>
+              <w:instrText xml:space="preserve"> PAGEREF _Toc226541328 \h </w:instrText>
             </w:r>
             <w:r>
               <w:rPr>
@@ -1779,7 +1853,7 @@
                 <w:noProof/>
                 <w:webHidden/>
               </w:rPr>
-              <w:t>36</w:t>
+              <w:t>38</w:t>
             </w:r>
             <w:r>
               <w:rPr>
@@ -1806,7 +1880,7 @@
               <w14:ligatures w14:val="standardContextual"/>
             </w:rPr>
           </w:pPr>
-          <w:hyperlink w:anchor="_Toc184734263" w:history="1">
+          <w:hyperlink w:anchor="_Toc226541329" w:history="1">
             <w:r>
               <w:rPr>
                 <w:rStyle w:val="Hyperlink"/>
@@ -1833,7 +1907,7 @@
                 <w:noProof/>
                 <w:webHidden/>
               </w:rPr>
-              <w:instrText xml:space="preserve"> PAGEREF _Toc184734263 \h </w:instrText>
+              <w:instrText xml:space="preserve"> PAGEREF _Toc226541329 \h </w:instrText>
             </w:r>
             <w:r>
               <w:rPr>
@@ -1853,7 +1927,7 @@
                 <w:noProof/>
                 <w:webHidden/>
               </w:rPr>
-              <w:t>36</w:t>
+              <w:t>38</w:t>
             </w:r>
             <w:r>
               <w:rPr>
@@ -1880,7 +1954,7 @@
               <w14:ligatures w14:val="standardContextual"/>
             </w:rPr>
           </w:pPr>
-          <w:hyperlink w:anchor="_Toc184734264" w:history="1">
+          <w:hyperlink w:anchor="_Toc226541330" w:history="1">
             <w:r>
               <w:rPr>
                 <w:rStyle w:val="Hyperlink"/>
@@ -1907,7 +1981,7 @@
                 <w:noProof/>
                 <w:webHidden/>
               </w:rPr>
-              <w:instrText xml:space="preserve"> PAGEREF _Toc184734264 \h </w:instrText>
+              <w:instrText xml:space="preserve"> PAGEREF _Toc226541330 \h </w:instrText>
             </w:r>
             <w:r>
               <w:rPr>
@@ -1927,7 +2001,7 @@
                 <w:noProof/>
                 <w:webHidden/>
               </w:rPr>
-              <w:t>39</w:t>
+              <w:t>41</w:t>
             </w:r>
             <w:r>
               <w:rPr>
@@ -1954,7 +2028,7 @@
               <w14:ligatures w14:val="standardContextual"/>
             </w:rPr>
           </w:pPr>
-          <w:hyperlink w:anchor="_Toc184734265" w:history="1">
+          <w:hyperlink w:anchor="_Toc226541331" w:history="1">
             <w:r>
               <w:rPr>
                 <w:rStyle w:val="Hyperlink"/>
@@ -1981,7 +2055,7 @@
                 <w:noProof/>
                 <w:webHidden/>
               </w:rPr>
-              <w:instrText xml:space="preserve"> PAGEREF _Toc184734265 \h </w:instrText>
+              <w:instrText xml:space="preserve"> PAGEREF _Toc226541331 \h </w:instrText>
             </w:r>
             <w:r>
               <w:rPr>
@@ -2001,7 +2075,7 @@
                 <w:noProof/>
                 <w:webHidden/>
               </w:rPr>
-              <w:t>39</w:t>
+              <w:t>41</w:t>
             </w:r>
             <w:r>
               <w:rPr>
@@ -2028,7 +2102,7 @@
               <w14:ligatures w14:val="standardContextual"/>
             </w:rPr>
           </w:pPr>
-          <w:hyperlink w:anchor="_Toc184734266" w:history="1">
+          <w:hyperlink w:anchor="_Toc226541332" w:history="1">
             <w:r>
               <w:rPr>
                 <w:rStyle w:val="Hyperlink"/>
@@ -2055,7 +2129,7 @@
                 <w:noProof/>
                 <w:webHidden/>
               </w:rPr>
-              <w:instrText xml:space="preserve"> PAGEREF _Toc184734266 \h </w:instrText>
+              <w:instrText xml:space="preserve"> PAGEREF _Toc226541332 \h </w:instrText>
             </w:r>
             <w:r>
               <w:rPr>
@@ -2075,7 +2149,7 @@
                 <w:noProof/>
                 <w:webHidden/>
               </w:rPr>
-              <w:t>40</w:t>
+              <w:t>42</w:t>
             </w:r>
             <w:r>
               <w:rPr>
@@ -2102,7 +2176,7 @@
               <w14:ligatures w14:val="standardContextual"/>
             </w:rPr>
           </w:pPr>
-          <w:hyperlink w:anchor="_Toc184734267" w:history="1">
+          <w:hyperlink w:anchor="_Toc226541333" w:history="1">
             <w:r>
               <w:rPr>
                 <w:rStyle w:val="Hyperlink"/>
@@ -2129,7 +2203,7 @@
                 <w:noProof/>
                 <w:webHidden/>
               </w:rPr>
-              <w:instrText xml:space="preserve"> PAGEREF _Toc184734267 \h </w:instrText>
+              <w:instrText xml:space="preserve"> PAGEREF _Toc226541333 \h </w:instrText>
             </w:r>
             <w:r>
               <w:rPr>
@@ -2149,7 +2223,7 @@
                 <w:noProof/>
                 <w:webHidden/>
               </w:rPr>
-              <w:t>42</w:t>
+              <w:t>44</w:t>
             </w:r>
             <w:r>
               <w:rPr>
@@ -2176,7 +2250,7 @@
               <w14:ligatures w14:val="standardContextual"/>
             </w:rPr>
           </w:pPr>
-          <w:hyperlink w:anchor="_Toc184734268" w:history="1">
+          <w:hyperlink w:anchor="_Toc226541334" w:history="1">
             <w:r>
               <w:rPr>
                 <w:rStyle w:val="Hyperlink"/>
@@ -2203,7 +2277,7 @@
                 <w:noProof/>
                 <w:webHidden/>
               </w:rPr>
-              <w:instrText xml:space="preserve"> PAGEREF _Toc184734268 \h </w:instrText>
+              <w:instrText xml:space="preserve"> PAGEREF _Toc226541334 \h </w:instrText>
             </w:r>
             <w:r>
               <w:rPr>
@@ -2223,7 +2297,7 @@
                 <w:noProof/>
                 <w:webHidden/>
               </w:rPr>
-              <w:t>43</w:t>
+              <w:t>45</w:t>
             </w:r>
             <w:r>
               <w:rPr>
@@ -2250,7 +2324,7 @@
               <w14:ligatures w14:val="standardContextual"/>
             </w:rPr>
           </w:pPr>
-          <w:hyperlink w:anchor="_Toc184734269" w:history="1">
+          <w:hyperlink w:anchor="_Toc226541335" w:history="1">
             <w:r>
               <w:rPr>
                 <w:rStyle w:val="Hyperlink"/>
@@ -2277,7 +2351,7 @@
                 <w:noProof/>
                 <w:webHidden/>
               </w:rPr>
-              <w:instrText xml:space="preserve"> PAGEREF _Toc184734269 \h </w:instrText>
+              <w:instrText xml:space="preserve"> PAGEREF _Toc226541335 \h </w:instrText>
             </w:r>
             <w:r>
               <w:rPr>
@@ -2297,7 +2371,7 @@
                 <w:noProof/>
                 <w:webHidden/>
               </w:rPr>
-              <w:t>44</w:t>
+              <w:t>46</w:t>
             </w:r>
             <w:r>
               <w:rPr>
@@ -2324,7 +2398,7 @@
               <w14:ligatures w14:val="standardContextual"/>
             </w:rPr>
           </w:pPr>
-          <w:hyperlink w:anchor="_Toc184734270" w:history="1">
+          <w:hyperlink w:anchor="_Toc226541336" w:history="1">
             <w:r>
               <w:rPr>
                 <w:rStyle w:val="Hyperlink"/>
@@ -2351,7 +2425,7 @@
                 <w:noProof/>
                 <w:webHidden/>
               </w:rPr>
-              <w:instrText xml:space="preserve"> PAGEREF _Toc184734270 \h </w:instrText>
+              <w:instrText xml:space="preserve"> PAGEREF _Toc226541336 \h </w:instrText>
             </w:r>
             <w:r>
               <w:rPr>
@@ -2371,7 +2445,7 @@
                 <w:noProof/>
                 <w:webHidden/>
               </w:rPr>
-              <w:t>44</w:t>
+              <w:t>46</w:t>
             </w:r>
             <w:r>
               <w:rPr>
@@ -2398,7 +2472,7 @@
               <w14:ligatures w14:val="standardContextual"/>
             </w:rPr>
           </w:pPr>
-          <w:hyperlink w:anchor="_Toc184734271" w:history="1">
+          <w:hyperlink w:anchor="_Toc226541337" w:history="1">
             <w:r>
               <w:rPr>
                 <w:rStyle w:val="Hyperlink"/>
@@ -2425,7 +2499,7 @@
                 <w:noProof/>
                 <w:webHidden/>
               </w:rPr>
-              <w:instrText xml:space="preserve"> PAGEREF _Toc184734271 \h </w:instrText>
+              <w:instrText xml:space="preserve"> PAGEREF _Toc226541337 \h </w:instrText>
             </w:r>
             <w:r>
               <w:rPr>
@@ -2445,7 +2519,7 @@
                 <w:noProof/>
                 <w:webHidden/>
               </w:rPr>
-              <w:t>46</w:t>
+              <w:t>48</w:t>
             </w:r>
             <w:r>
               <w:rPr>
@@ -2466,6 +2540,7 @@
     <w:p>
       <w:bookmarkStart w:id="2" w:name="_Toc131666169"/>
       <w:r>
+        <w:lastRenderedPageBreak/>
         <w:br w:type="page"/>
       </w:r>
     </w:p>
@@ -2859,9 +2934,14 @@
             </w:r>
             <w:proofErr w:type="gramEnd"/>
             <w:r>
-              <w:t>_collection.json</w:t>
+              <w:t>_</w:t>
+            </w:r>
+            <w:proofErr w:type="gramStart"/>
+            <w:r>
+              <w:t>collection.json</w:t>
             </w:r>
             <w:proofErr w:type="spellEnd"/>
+            <w:proofErr w:type="gramEnd"/>
           </w:p>
         </w:tc>
         <w:tc>
@@ -3072,7 +3152,7 @@
       </w:pPr>
       <w:bookmarkStart w:id="13" w:name="_Toc130996328"/>
       <w:bookmarkStart w:id="14" w:name="_Toc142058380"/>
-      <w:bookmarkStart w:id="15" w:name="_Toc184734242"/>
+      <w:bookmarkStart w:id="15" w:name="_Toc226541307"/>
       <w:bookmarkEnd w:id="1"/>
       <w:r>
         <w:lastRenderedPageBreak/>
@@ -3088,7 +3168,7 @@
       </w:pPr>
       <w:bookmarkStart w:id="16" w:name="_Toc130996329"/>
       <w:bookmarkStart w:id="17" w:name="_Toc142058381"/>
-      <w:bookmarkStart w:id="18" w:name="_Toc184734243"/>
+      <w:bookmarkStart w:id="18" w:name="_Toc226541308"/>
       <w:proofErr w:type="spellStart"/>
       <w:r>
         <w:t>AppGyver</w:t>
@@ -3166,7 +3246,7 @@
         <w:pStyle w:val="Heading2"/>
       </w:pPr>
       <w:bookmarkStart w:id="20" w:name="_Toc142058382"/>
-      <w:bookmarkStart w:id="21" w:name="_Toc184734244"/>
+      <w:bookmarkStart w:id="21" w:name="_Toc226541309"/>
       <w:r>
         <w:lastRenderedPageBreak/>
         <w:t>High-Level Architecture</w:t>
@@ -3702,7 +3782,15 @@
     </w:p>
     <w:p>
       <w:r>
-        <w:t xml:space="preserve">The Web Application could also be hosted on a single server and configured to send requests to the Load Balancer which would then forward them to an available node, however, this server would not have the </w:t>
+        <w:t xml:space="preserve">The Web Application could also be hosted on a single server and configured to send requests to the Load Balancer which would then forward them to an available </w:t>
+      </w:r>
+      <w:proofErr w:type="gramStart"/>
+      <w:r>
+        <w:t>node,</w:t>
+      </w:r>
+      <w:proofErr w:type="gramEnd"/>
+      <w:r>
+        <w:t xml:space="preserve"> however, this server would not have the </w:t>
       </w:r>
       <w:proofErr w:type="gramStart"/>
       <w:r>
@@ -3941,7 +4029,7 @@
       </w:pPr>
       <w:bookmarkStart w:id="26" w:name="_Toc130996333"/>
       <w:bookmarkStart w:id="27" w:name="_Toc142058383"/>
-      <w:bookmarkStart w:id="28" w:name="_Toc184734245"/>
+      <w:bookmarkStart w:id="28" w:name="_Toc226541310"/>
       <w:r>
         <w:lastRenderedPageBreak/>
         <w:t>Setup and Deployment</w:t>
@@ -3973,7 +4061,7 @@
         <w:pStyle w:val="Heading2"/>
       </w:pPr>
       <w:bookmarkStart w:id="29" w:name="_Toc142058384"/>
-      <w:bookmarkStart w:id="30" w:name="_Toc184734246"/>
+      <w:bookmarkStart w:id="30" w:name="_Toc226541311"/>
       <w:r>
         <w:t>Pre-Requisites</w:t>
       </w:r>
@@ -4100,7 +4188,7 @@
               <w:rPr>
                 <w:rStyle w:val="ui-provider"/>
               </w:rPr>
-              <w:t>2025.1</w:t>
+              <w:t>2026.3</w:t>
             </w:r>
             <w:r>
               <w:rPr>
@@ -4446,7 +4534,7 @@
         <w:pStyle w:val="Heading2"/>
       </w:pPr>
       <w:bookmarkStart w:id="31" w:name="_Ref184734029"/>
-      <w:bookmarkStart w:id="32" w:name="_Toc184734247"/>
+      <w:bookmarkStart w:id="32" w:name="_Toc226541312"/>
       <w:r>
         <w:t>Deployment Package Preparation</w:t>
       </w:r>
@@ -4508,7 +4596,7 @@
         <w:rPr>
           <w:rStyle w:val="ui-provider"/>
         </w:rPr>
-        <w:t>2025.1</w:t>
+        <w:t>2026.3</w:t>
       </w:r>
       <w:r>
         <w:rPr>
@@ -4547,7 +4635,7 @@
       </w:pPr>
       <w:bookmarkStart w:id="33" w:name="_Toc130996335"/>
       <w:bookmarkStart w:id="34" w:name="_Toc142058386"/>
-      <w:bookmarkStart w:id="35" w:name="_Toc184734248"/>
+      <w:bookmarkStart w:id="35" w:name="_Toc226541313"/>
       <w:proofErr w:type="spellStart"/>
       <w:r>
         <w:t>AppGyver</w:t>
@@ -4740,7 +4828,7 @@
       </w:pPr>
       <w:bookmarkStart w:id="36" w:name="_Toc130996336"/>
       <w:bookmarkStart w:id="37" w:name="_Toc142058387"/>
-      <w:bookmarkStart w:id="38" w:name="_Toc184734249"/>
+      <w:bookmarkStart w:id="38" w:name="_Toc226541314"/>
       <w:r>
         <w:lastRenderedPageBreak/>
         <w:t>App Variables Setup</w:t>
@@ -4843,7 +4931,7 @@
       </w:r>
       <w:fldSimple w:instr=" DOCPROPERTY  ReleaseVersion  \* MERGEFORMAT ">
         <w:r>
-          <w:t>2025.1</w:t>
+          <w:t>2026.3</w:t>
         </w:r>
       </w:fldSimple>
       <w:r>
@@ -5642,7 +5730,6 @@
                 <w:szCs w:val="18"/>
               </w:rPr>
             </w:pPr>
-            <w:proofErr w:type="spellStart"/>
             <w:r>
               <w:rPr>
                 <w:sz w:val="18"/>
@@ -5650,7 +5737,6 @@
               </w:rPr>
               <w:t>ApplicationName</w:t>
             </w:r>
-            <w:proofErr w:type="spellEnd"/>
           </w:p>
         </w:tc>
         <w:tc>
@@ -6663,7 +6749,7 @@
       </w:pPr>
       <w:bookmarkStart w:id="39" w:name="_Toc130996337"/>
       <w:bookmarkStart w:id="40" w:name="_Toc142058388"/>
-      <w:bookmarkStart w:id="41" w:name="_Toc184734250"/>
+      <w:bookmarkStart w:id="41" w:name="_Toc226541315"/>
       <w:r>
         <w:lastRenderedPageBreak/>
         <w:t>Theme Variables</w:t>
@@ -6864,7 +6950,7 @@
       </w:pPr>
       <w:bookmarkStart w:id="42" w:name="_Toc130996338"/>
       <w:bookmarkStart w:id="43" w:name="_Toc142058389"/>
-      <w:bookmarkStart w:id="44" w:name="_Toc184734251"/>
+      <w:bookmarkStart w:id="44" w:name="_Toc226541316"/>
       <w:r>
         <w:t xml:space="preserve">Import </w:t>
       </w:r>
@@ -7143,7 +7229,7 @@
       </w:pPr>
       <w:bookmarkStart w:id="45" w:name="_Toc130996339"/>
       <w:bookmarkStart w:id="46" w:name="_Toc142058390"/>
-      <w:bookmarkStart w:id="47" w:name="_Toc184734252"/>
+      <w:bookmarkStart w:id="47" w:name="_Toc226541317"/>
       <w:r>
         <w:lastRenderedPageBreak/>
         <w:t>Config Flow Configuration</w:t>
@@ -7861,6 +7947,7 @@
               <w:t>=</w:t>
             </w:r>
             <w:proofErr w:type="spellStart"/>
+            <w:proofErr w:type="gramStart"/>
             <w:r>
               <w:t>CortexUsers</w:t>
             </w:r>
@@ -7868,6 +7955,7 @@
               <w:t>,DC</w:t>
             </w:r>
             <w:proofErr w:type="spellEnd"/>
+            <w:proofErr w:type="gramEnd"/>
             <w:r>
               <w:t>=com</w:t>
             </w:r>
@@ -8103,7 +8191,7 @@
         <w:pStyle w:val="Heading2"/>
       </w:pPr>
       <w:bookmarkStart w:id="49" w:name="_Toc142058391"/>
-      <w:bookmarkStart w:id="50" w:name="_Toc184734253"/>
+      <w:bookmarkStart w:id="50" w:name="_Toc226541318"/>
       <w:r>
         <w:lastRenderedPageBreak/>
         <w:t xml:space="preserve">Publish </w:t>
@@ -8311,7 +8399,7 @@
         <w:pStyle w:val="Heading2"/>
       </w:pPr>
       <w:bookmarkStart w:id="51" w:name="_Toc142058392"/>
-      <w:bookmarkStart w:id="52" w:name="_Toc184734254"/>
+      <w:bookmarkStart w:id="52" w:name="_Toc226541319"/>
       <w:r>
         <w:t>Setup OAuth Published for Flows</w:t>
       </w:r>
@@ -8449,7 +8537,7 @@
         <w:pStyle w:val="Heading2"/>
       </w:pPr>
       <w:bookmarkStart w:id="53" w:name="_Toc142058393"/>
-      <w:bookmarkStart w:id="54" w:name="_Toc184734255"/>
+      <w:bookmarkStart w:id="54" w:name="_Toc226541320"/>
       <w:r>
         <w:lastRenderedPageBreak/>
         <w:t>Initialise Shared Data (Reliable Collections)</w:t>
@@ -8823,7 +8911,7 @@
         <w:rPr>
           <w:lang w:val="fr-FR"/>
         </w:rPr>
-        <w:t>2025.1</w:t>
+        <w:t>2026.3</w:t>
       </w:r>
       <w:r>
         <w:fldChar w:fldCharType="end"/>
@@ -9029,15 +9117,7 @@
         <w:pStyle w:val="Style1"/>
       </w:pPr>
       <w:r>
-        <w:t>-</w:t>
-      </w:r>
-      <w:proofErr w:type="spellStart"/>
-      <w:r>
-        <w:t>ApplicationName</w:t>
-      </w:r>
-      <w:proofErr w:type="spellEnd"/>
-      <w:r>
-        <w:t xml:space="preserve"> </w:t>
+        <w:t xml:space="preserve">-ApplicationName </w:t>
       </w:r>
       <w:r>
         <w:t>"</w:t>
@@ -9440,11 +9520,9 @@
             <w:tcW w:w="2591" w:type="dxa"/>
           </w:tcPr>
           <w:p>
-            <w:proofErr w:type="spellStart"/>
             <w:r>
               <w:t>ApplicationName</w:t>
             </w:r>
-            <w:proofErr w:type="spellEnd"/>
           </w:p>
         </w:tc>
         <w:tc>
@@ -9668,7 +9746,7 @@
         <w:rPr>
           <w:lang w:val="fr-FR"/>
         </w:rPr>
-        <w:t>2025.1</w:t>
+        <w:t>2026.3</w:t>
       </w:r>
       <w:r>
         <w:fldChar w:fldCharType="end"/>
@@ -9973,15 +10051,7 @@
         <w:pStyle w:val="Style1"/>
       </w:pPr>
       <w:r>
-        <w:t>-</w:t>
-      </w:r>
-      <w:proofErr w:type="spellStart"/>
-      <w:r>
-        <w:t>ApplicationName</w:t>
-      </w:r>
-      <w:proofErr w:type="spellEnd"/>
-      <w:r>
-        <w:t xml:space="preserve"> </w:t>
+        <w:t xml:space="preserve">-ApplicationName </w:t>
       </w:r>
       <w:r>
         <w:t>"</w:t>
@@ -10565,11 +10635,9 @@
             <w:tcW w:w="2851" w:type="dxa"/>
           </w:tcPr>
           <w:p>
-            <w:proofErr w:type="spellStart"/>
             <w:r>
               <w:t>ApplicationName</w:t>
             </w:r>
-            <w:proofErr w:type="spellEnd"/>
           </w:p>
         </w:tc>
         <w:tc>
@@ -10771,7 +10839,7 @@
         <w:rPr>
           <w:lang w:val="fr-FR"/>
         </w:rPr>
-        <w:t>2025.1</w:t>
+        <w:t>2026.3</w:t>
       </w:r>
       <w:r>
         <w:fldChar w:fldCharType="end"/>
@@ -10987,15 +11055,7 @@
         <w:pStyle w:val="Style1"/>
       </w:pPr>
       <w:r>
-        <w:t>-</w:t>
-      </w:r>
-      <w:proofErr w:type="spellStart"/>
-      <w:r>
-        <w:t>ApplicationName</w:t>
-      </w:r>
-      <w:proofErr w:type="spellEnd"/>
-      <w:r>
-        <w:t xml:space="preserve"> </w:t>
+        <w:t xml:space="preserve">-ApplicationName </w:t>
       </w:r>
       <w:r>
         <w:t>"</w:t>
@@ -11461,11 +11521,9 @@
             <w:tcW w:w="2591" w:type="dxa"/>
           </w:tcPr>
           <w:p>
-            <w:proofErr w:type="spellStart"/>
             <w:r>
               <w:t>ApplicationName</w:t>
             </w:r>
-            <w:proofErr w:type="spellEnd"/>
           </w:p>
         </w:tc>
         <w:tc>
@@ -11520,7 +11578,7 @@
       </w:pPr>
       <w:bookmarkStart w:id="55" w:name="_Toc130996341"/>
       <w:bookmarkStart w:id="56" w:name="_Toc142058394"/>
-      <w:bookmarkStart w:id="57" w:name="_Toc184734256"/>
+      <w:bookmarkStart w:id="57" w:name="_Toc226541321"/>
       <w:r>
         <w:t>Website Deployment</w:t>
       </w:r>
@@ -11694,7 +11752,7 @@
         <w:rPr>
           <w:lang w:val="fr-FR"/>
         </w:rPr>
-        <w:t>2025.1</w:t>
+        <w:t>2026.3</w:t>
       </w:r>
       <w:r>
         <w:fldChar w:fldCharType="end"/>
@@ -12049,23 +12107,7 @@
                 <w:i/>
                 <w:iCs/>
               </w:rPr>
-              <w:t xml:space="preserve">Note that this has no relation to the </w:t>
-            </w:r>
-            <w:proofErr w:type="spellStart"/>
-            <w:r>
-              <w:rPr>
-                <w:i/>
-                <w:iCs/>
-              </w:rPr>
-              <w:t>ApplicationName</w:t>
-            </w:r>
-            <w:proofErr w:type="spellEnd"/>
-            <w:r>
-              <w:rPr>
-                <w:i/>
-                <w:iCs/>
-              </w:rPr>
-              <w:t xml:space="preserve"> used in </w:t>
+              <w:t xml:space="preserve">Note that this has no relation to the ApplicationName used in </w:t>
             </w:r>
             <w:proofErr w:type="spellStart"/>
             <w:r>
@@ -12354,7 +12396,7 @@
       </w:pPr>
       <w:bookmarkStart w:id="58" w:name="_Toc130996342"/>
       <w:bookmarkStart w:id="59" w:name="_Toc142058395"/>
-      <w:bookmarkStart w:id="60" w:name="_Toc184734257"/>
+      <w:bookmarkStart w:id="60" w:name="_Toc226541322"/>
       <w:r>
         <w:t>Web Application Deployment</w:t>
       </w:r>
@@ -12757,7 +12799,7 @@
       <w:pPr>
         <w:pStyle w:val="Heading2"/>
       </w:pPr>
-      <w:bookmarkStart w:id="61" w:name="_Toc184734258"/>
+      <w:bookmarkStart w:id="61" w:name="_Toc226541323"/>
       <w:r>
         <w:t xml:space="preserve">Deploy </w:t>
       </w:r>
@@ -12834,7 +12876,7 @@
         <w:rPr>
           <w:rStyle w:val="ui-provider"/>
         </w:rPr>
-        <w:t>2025.1</w:t>
+        <w:t>2026.3</w:t>
       </w:r>
       <w:r>
         <w:rPr>
@@ -13087,19 +13129,229 @@
       <w:pPr>
         <w:pStyle w:val="Heading2"/>
       </w:pPr>
-      <w:bookmarkStart w:id="62" w:name="_Toc142058396"/>
-      <w:bookmarkStart w:id="63" w:name="_Toc184734259"/>
+      <w:bookmarkStart w:id="62" w:name="_Toc226541324"/>
+      <w:bookmarkStart w:id="63" w:name="_Toc142058396"/>
+      <w:r>
+        <w:t xml:space="preserve">Copy robots.txt </w:t>
+      </w:r>
+      <w:r>
+        <w:t>F</w:t>
+      </w:r>
+      <w:r>
+        <w:t>ile</w:t>
+      </w:r>
+      <w:bookmarkEnd w:id="62"/>
+    </w:p>
+    <w:p>
+      <w:r>
+        <w:t xml:space="preserve">To provide guidance for search engine crawlers </w:t>
+      </w:r>
+      <w:r>
+        <w:t xml:space="preserve">and common AI bots </w:t>
+      </w:r>
+      <w:r>
+        <w:t>not</w:t>
+      </w:r>
+      <w:r>
+        <w:t xml:space="preserve"> to index CORTEX Interaction Portal, it is necessary for the robots.txt file to reside in the site’s root directory of the CORTEX Interaction Portal. This is only necessary if CORTEX Interaction Portal is being installed on a different machine than </w:t>
+      </w:r>
+      <w:r>
+        <w:t xml:space="preserve">either </w:t>
+      </w:r>
+      <w:r>
+        <w:t xml:space="preserve">CORTEX Gateway </w:t>
+      </w:r>
+      <w:r>
+        <w:t xml:space="preserve">or CORTEX Configuration Portal </w:t>
+      </w:r>
+      <w:r>
+        <w:t>has been installed.</w:t>
+      </w:r>
+    </w:p>
+    <w:p>
+      <w:pPr>
+        <w:pStyle w:val="ListParagraph"/>
+        <w:numPr>
+          <w:ilvl w:val="0"/>
+          <w:numId w:val="147"/>
+        </w:numPr>
+      </w:pPr>
+      <w:r>
+        <w:t>Navigate to the</w:t>
+      </w:r>
+      <w:r>
+        <w:t xml:space="preserve"> </w:t>
+      </w:r>
+      <w:r>
+        <w:t xml:space="preserve">CORTEX Interaction Portal subfolder </w:t>
+      </w:r>
+      <w:r>
+        <w:t xml:space="preserve">of the extracted </w:t>
+      </w:r>
+      <w:r>
+        <w:rPr>
+          <w:rStyle w:val="ui-provider"/>
+        </w:rPr>
+        <w:t xml:space="preserve">Cortex Innovation </w:t>
+      </w:r>
+      <w:r>
+        <w:rPr>
+          <w:rStyle w:val="ui-provider"/>
+        </w:rPr>
+        <w:fldChar w:fldCharType="begin"/>
+      </w:r>
+      <w:r>
+        <w:rPr>
+          <w:rStyle w:val="ui-provider"/>
+        </w:rPr>
+        <w:instrText xml:space="preserve"> DOCPROPERTY  ReleaseVersion  \* MERGEFORMAT </w:instrText>
+      </w:r>
+      <w:r>
+        <w:rPr>
+          <w:rStyle w:val="ui-provider"/>
+        </w:rPr>
+        <w:fldChar w:fldCharType="separate"/>
+      </w:r>
+      <w:r>
+        <w:rPr>
+          <w:rStyle w:val="ui-provider"/>
+        </w:rPr>
+        <w:t>2026.3</w:t>
+      </w:r>
+      <w:r>
+        <w:rPr>
+          <w:rStyle w:val="ui-provider"/>
+        </w:rPr>
+        <w:fldChar w:fldCharType="end"/>
+      </w:r>
+      <w:r>
+        <w:rPr>
+          <w:rStyle w:val="ui-provider"/>
+        </w:rPr>
+        <w:t xml:space="preserve"> - Interaction Portal.zip</w:t>
+      </w:r>
+      <w:r>
+        <w:t>.</w:t>
+      </w:r>
+      <w:r>
+        <w:t xml:space="preserve"> For example, </w:t>
+      </w:r>
+      <w:r>
+        <w:t xml:space="preserve">C:\Install\Cortex Innovation </w:t>
+      </w:r>
+      <w:fldSimple w:instr=" DOCPROPERTY  ReleaseVersion  \* MERGEFORMAT ">
+        <w:r>
+          <w:t>2026.3</w:t>
+        </w:r>
+      </w:fldSimple>
+      <w:r>
+        <w:t xml:space="preserve"> </w:t>
+      </w:r>
+      <w:r>
+        <w:t>- Interaction Portal\Cortex Interaction Portal</w:t>
+      </w:r>
+    </w:p>
+    <w:p>
+      <w:pPr>
+        <w:pStyle w:val="ListParagraph"/>
+        <w:numPr>
+          <w:ilvl w:val="0"/>
+          <w:numId w:val="147"/>
+        </w:numPr>
+      </w:pPr>
+      <w:r>
+        <w:t>Copy the robots.txt file</w:t>
+      </w:r>
+    </w:p>
+    <w:p>
+      <w:pPr>
+        <w:pStyle w:val="ListParagraph"/>
+        <w:numPr>
+          <w:ilvl w:val="0"/>
+          <w:numId w:val="147"/>
+        </w:numPr>
+      </w:pPr>
+      <w:r>
+        <w:t>Navigate to the IIS Directory, for example, C:\inetpub\wwwroot\Cortex</w:t>
+      </w:r>
+    </w:p>
+    <w:p>
+      <w:pPr>
+        <w:pStyle w:val="ListParagraph"/>
+        <w:numPr>
+          <w:ilvl w:val="1"/>
+          <w:numId w:val="147"/>
+        </w:numPr>
+      </w:pPr>
+      <w:r>
+        <w:t>You should see subdirectories for both the Interaction Portal and Gateway here</w:t>
+      </w:r>
+    </w:p>
+    <w:p>
+      <w:pPr>
+        <w:pStyle w:val="ListParagraph"/>
+        <w:numPr>
+          <w:ilvl w:val="0"/>
+          <w:numId w:val="147"/>
+        </w:numPr>
+      </w:pPr>
+      <w:r>
+        <w:t>Paste the robots.txt file</w:t>
+      </w:r>
+    </w:p>
+    <w:p>
+      <w:pPr>
+        <w:pStyle w:val="Heading2"/>
+      </w:pPr>
+      <w:bookmarkStart w:id="64" w:name="_Toc226541325"/>
       <w:r>
         <w:t>Web App Redirect Rule</w:t>
       </w:r>
-      <w:bookmarkEnd w:id="62"/>
       <w:bookmarkEnd w:id="63"/>
-    </w:p>
-    <w:p>
-      <w:r>
-        <w:t>If CORTEX Gateway is installed on the same server (and within the same website in IIS) as the CORTEX Interaction Portal, there are some redirect rules which will prevent a user from accessing the Interaction Portal.</w:t>
-      </w:r>
-    </w:p>
+      <w:bookmarkEnd w:id="64"/>
+    </w:p>
+    <w:p>
+      <w:r>
+        <w:t xml:space="preserve">If CORTEX Gateway is installed on the same server (and within the same website in IIS) as the CORTEX Interaction Portal, there are some redirect rules which </w:t>
+      </w:r>
+      <w:r>
+        <w:t xml:space="preserve">need to be applied to </w:t>
+      </w:r>
+      <w:r>
+        <w:t>prevent</w:t>
+      </w:r>
+      <w:r>
+        <w:t>:</w:t>
+      </w:r>
+    </w:p>
+    <w:p>
+      <w:pPr>
+        <w:pStyle w:val="ListParagraph"/>
+        <w:numPr>
+          <w:ilvl w:val="0"/>
+          <w:numId w:val="146"/>
+        </w:numPr>
+      </w:pPr>
+      <w:r>
+        <w:t>a user from accessing the Interaction Portal</w:t>
+      </w:r>
+      <w:r>
+        <w:t>,</w:t>
+      </w:r>
+    </w:p>
+    <w:p>
+      <w:pPr>
+        <w:pStyle w:val="ListParagraph"/>
+        <w:numPr>
+          <w:ilvl w:val="0"/>
+          <w:numId w:val="146"/>
+        </w:numPr>
+      </w:pPr>
+      <w:r>
+        <w:t>a search engine crawler or AI bot from accessing the robots.txt file.</w:t>
+      </w:r>
+    </w:p>
+    <w:p/>
     <w:p>
       <w:pPr>
         <w:pStyle w:val="ListParagraph"/>
@@ -13155,11 +13407,9 @@
       <w:r>
         <w:t xml:space="preserve">If this file is not present within the top level (e.g. ‘Cortex’) IIS directory, this change will not be </w:t>
       </w:r>
-      <w:proofErr w:type="gramStart"/>
-      <w:r>
-        <w:t>necessary</w:t>
-      </w:r>
-      <w:proofErr w:type="gramEnd"/>
+      <w:r>
+        <w:t>necessary,</w:t>
+      </w:r>
       <w:r>
         <w:t xml:space="preserve"> and you can proceed to the next section.</w:t>
       </w:r>
@@ -13173,7 +13423,22 @@
         </w:numPr>
       </w:pPr>
       <w:r>
-        <w:t>If there is a ‘Redirect Cortex to gateway’ rule present, you will need to add the below line to it, replacing the ‘</w:t>
+        <w:t>If there is a ‘Redirect Cortex to gateway’ rule present, you will need to</w:t>
+      </w:r>
+      <w:r>
+        <w:t>:</w:t>
+      </w:r>
+    </w:p>
+    <w:p>
+      <w:pPr>
+        <w:pStyle w:val="ListParagraph"/>
+        <w:numPr>
+          <w:ilvl w:val="1"/>
+          <w:numId w:val="130"/>
+        </w:numPr>
+      </w:pPr>
+      <w:r>
+        <w:t>add the below line to it, replacing the ‘</w:t>
       </w:r>
       <w:proofErr w:type="spellStart"/>
       <w:r>
@@ -13198,8 +13463,10 @@
     <w:p>
       <w:pPr>
         <w:pStyle w:val="Style1"/>
-      </w:pPr>
-      <w:r>
+        <w:ind w:left="1440"/>
+      </w:pPr>
+      <w:r>
+        <w:lastRenderedPageBreak/>
         <w:t>&lt;add input="{REQUEST_URI}" pattern=</w:t>
       </w:r>
       <w:proofErr w:type="gramStart"/>
@@ -13211,12 +13478,48 @@
         <w:t>\/</w:t>
       </w:r>
       <w:proofErr w:type="spellStart"/>
+      <w:proofErr w:type="gramStart"/>
       <w:r>
         <w:t>CortexInteractionPortal</w:t>
       </w:r>
       <w:proofErr w:type="spellEnd"/>
       <w:r>
-        <w:t>.*" negate="true" /&gt;</w:t>
+        <w:t>.*</w:t>
+      </w:r>
+      <w:proofErr w:type="gramEnd"/>
+      <w:r>
+        <w:t>" negate="true" /&gt;</w:t>
+      </w:r>
+    </w:p>
+    <w:p>
+      <w:pPr>
+        <w:pStyle w:val="ListParagraph"/>
+        <w:numPr>
+          <w:ilvl w:val="1"/>
+          <w:numId w:val="130"/>
+        </w:numPr>
+      </w:pPr>
+      <w:bookmarkStart w:id="65" w:name="_Toc130996343"/>
+      <w:r>
+        <w:t xml:space="preserve">add the below line to it, </w:t>
+      </w:r>
+      <w:r>
+        <w:t>i</w:t>
+      </w:r>
+      <w:r>
+        <w:t>f it is not already present:</w:t>
+      </w:r>
+    </w:p>
+    <w:p>
+      <w:pPr>
+        <w:pStyle w:val="Style1"/>
+        <w:pBdr>
+          <w:left w:val="single" w:sz="4" w:space="0" w:color="auto"/>
+        </w:pBdr>
+        <w:ind w:left="1440"/>
+      </w:pPr>
+      <w:r>
+        <w:t>&lt;add input="{REQUEST_URI}" pattern="^/robots\.txt$" negate="true" /&gt;</w:t>
       </w:r>
     </w:p>
     <w:p>
@@ -13227,7 +13530,6 @@
           <w:numId w:val="130"/>
         </w:numPr>
       </w:pPr>
-      <w:bookmarkStart w:id="64" w:name="_Toc130996343"/>
       <w:r>
         <w:t>Save and exit the file.</w:t>
       </w:r>
@@ -13236,14 +13538,14 @@
       <w:pPr>
         <w:pStyle w:val="Heading2"/>
       </w:pPr>
-      <w:bookmarkStart w:id="65" w:name="_Toc142058397"/>
-      <w:bookmarkStart w:id="66" w:name="_Toc184734260"/>
+      <w:bookmarkStart w:id="66" w:name="_Toc142058397"/>
+      <w:bookmarkStart w:id="67" w:name="_Toc226541326"/>
       <w:r>
         <w:t>CORS Configuration</w:t>
       </w:r>
-      <w:bookmarkEnd w:id="64"/>
       <w:bookmarkEnd w:id="65"/>
       <w:bookmarkEnd w:id="66"/>
+      <w:bookmarkEnd w:id="67"/>
     </w:p>
     <w:p>
       <w:r>
@@ -13299,7 +13601,15 @@
       </w:r>
       <w:proofErr w:type="gramEnd"/>
       <w:r>
-        <w:t>Node&gt;\Fabric\work\ImageCache\Store\Cortex.Innovation.Core\ApiGatewayPkg.Code.&lt;Version&gt;</w:t>
+        <w:t>Node&gt;</w:t>
+      </w:r>
+      <w:proofErr w:type="gramStart"/>
+      <w:r>
+        <w:t>\Fabric\work\ImageCache\Store\Cortex.Innovation.Core\ApiGatewayPkg.Code.&lt;</w:t>
+      </w:r>
+      <w:proofErr w:type="gramEnd"/>
+      <w:r>
+        <w:t>Version&gt;</w:t>
       </w:r>
     </w:p>
     <w:p>
@@ -13381,7 +13691,6 @@
           </w:tcPr>
           <w:p>
             <w:r>
-              <w:lastRenderedPageBreak/>
               <w:t>Parameter</w:t>
             </w:r>
           </w:p>
@@ -13651,6 +13960,7 @@
     <w:p/>
     <w:p>
       <w:r>
+        <w:lastRenderedPageBreak/>
         <w:t>Once this is done, navigate to the Service Fabric Explorer page and restart any Service Fabric nodes for the changes to take effect.</w:t>
       </w:r>
     </w:p>
@@ -13738,15 +14048,15 @@
       <w:pPr>
         <w:pStyle w:val="Heading2"/>
       </w:pPr>
-      <w:bookmarkStart w:id="67" w:name="_Toc130996344"/>
-      <w:bookmarkStart w:id="68" w:name="_Toc142058398"/>
-      <w:bookmarkStart w:id="69" w:name="_Toc184734261"/>
+      <w:bookmarkStart w:id="68" w:name="_Toc130996344"/>
+      <w:bookmarkStart w:id="69" w:name="_Toc142058398"/>
+      <w:bookmarkStart w:id="70" w:name="_Toc226541327"/>
       <w:r>
         <w:t>Housekeeping Tasks</w:t>
       </w:r>
-      <w:bookmarkEnd w:id="67"/>
       <w:bookmarkEnd w:id="68"/>
       <w:bookmarkEnd w:id="69"/>
+      <w:bookmarkEnd w:id="70"/>
     </w:p>
     <w:p>
       <w:r>
@@ -13793,15 +14103,7 @@
         <w:t>’</w:t>
       </w:r>
       <w:r>
-        <w:t>. This needs to be a list which contains each ‘</w:t>
-      </w:r>
-      <w:proofErr w:type="spellStart"/>
-      <w:r>
-        <w:t>ApplicationName</w:t>
-      </w:r>
-      <w:proofErr w:type="spellEnd"/>
-      <w:r>
-        <w:t xml:space="preserve">’ (from the </w:t>
+        <w:t xml:space="preserve">. This needs to be a list which contains each ‘ApplicationName’ (from the </w:t>
       </w:r>
       <w:proofErr w:type="spellStart"/>
       <w:r>
@@ -13870,7 +14172,6 @@
         <w:spacing w:after="0"/>
       </w:pPr>
       <w:r>
-        <w:lastRenderedPageBreak/>
         <w:t>    "",</w:t>
       </w:r>
     </w:p>
@@ -14118,6 +14419,7 @@
           </w:tcPr>
           <w:p>
             <w:r>
+              <w:lastRenderedPageBreak/>
               <w:t>Flow Name</w:t>
             </w:r>
           </w:p>
@@ -14246,28 +14548,28 @@
       <w:pPr>
         <w:pStyle w:val="Heading1"/>
       </w:pPr>
-      <w:bookmarkStart w:id="70" w:name="_Toc142058399"/>
-      <w:bookmarkStart w:id="71" w:name="_Toc184734262"/>
+      <w:bookmarkStart w:id="71" w:name="_Toc142058399"/>
+      <w:bookmarkStart w:id="72" w:name="_Toc226541328"/>
       <w:r>
         <w:lastRenderedPageBreak/>
         <w:t>Testing</w:t>
       </w:r>
-      <w:bookmarkEnd w:id="70"/>
       <w:bookmarkEnd w:id="71"/>
+      <w:bookmarkEnd w:id="72"/>
     </w:p>
     <w:p>
       <w:pPr>
         <w:pStyle w:val="Heading2"/>
       </w:pPr>
-      <w:bookmarkStart w:id="72" w:name="_Toc130996346"/>
-      <w:bookmarkStart w:id="73" w:name="_Toc142058400"/>
-      <w:bookmarkStart w:id="74" w:name="_Toc184734263"/>
+      <w:bookmarkStart w:id="73" w:name="_Toc130996346"/>
+      <w:bookmarkStart w:id="74" w:name="_Toc142058400"/>
+      <w:bookmarkStart w:id="75" w:name="_Toc226541329"/>
       <w:r>
         <w:t>Testing User Access Management Flows</w:t>
       </w:r>
-      <w:bookmarkEnd w:id="72"/>
       <w:bookmarkEnd w:id="73"/>
       <w:bookmarkEnd w:id="74"/>
+      <w:bookmarkEnd w:id="75"/>
     </w:p>
     <w:p>
       <w:r>
@@ -14469,9 +14771,18 @@
           <w:b/>
           <w:bCs/>
         </w:rPr>
-        <w:t>_collection.json</w:t>
+        <w:t>_</w:t>
+      </w:r>
+      <w:proofErr w:type="gramStart"/>
+      <w:r>
+        <w:rPr>
+          <w:b/>
+          <w:bCs/>
+        </w:rPr>
+        <w:t>collection.json</w:t>
       </w:r>
       <w:proofErr w:type="spellEnd"/>
+      <w:proofErr w:type="gramEnd"/>
       <w:r>
         <w:t>, provided as part of the package obtained in Section 2.</w:t>
       </w:r>
@@ -15306,16 +15617,16 @@
       <w:pPr>
         <w:pStyle w:val="Heading2"/>
       </w:pPr>
-      <w:bookmarkStart w:id="75" w:name="_Toc130996347"/>
-      <w:bookmarkStart w:id="76" w:name="_Toc142058401"/>
-      <w:bookmarkStart w:id="77" w:name="_Toc184734264"/>
+      <w:bookmarkStart w:id="76" w:name="_Toc130996347"/>
+      <w:bookmarkStart w:id="77" w:name="_Toc142058401"/>
+      <w:bookmarkStart w:id="78" w:name="_Toc226541330"/>
       <w:r>
         <w:lastRenderedPageBreak/>
         <w:t>Testing the Web Application</w:t>
       </w:r>
-      <w:bookmarkEnd w:id="75"/>
       <w:bookmarkEnd w:id="76"/>
       <w:bookmarkEnd w:id="77"/>
+      <w:bookmarkEnd w:id="78"/>
     </w:p>
     <w:p>
       <w:pPr>
@@ -15336,7 +15647,15 @@
       </w:r>
       <w:proofErr w:type="spellEnd"/>
       <w:r>
-        <w:t xml:space="preserve"> preview mode and this step can be skipped.</w:t>
+        <w:t xml:space="preserve"> preview </w:t>
+      </w:r>
+      <w:proofErr w:type="gramStart"/>
+      <w:r>
+        <w:t>mode</w:t>
+      </w:r>
+      <w:proofErr w:type="gramEnd"/>
+      <w:r>
+        <w:t xml:space="preserve"> and this step can be skipped.</w:t>
       </w:r>
     </w:p>
     <w:p>
@@ -15459,15 +15778,15 @@
       <w:pPr>
         <w:pStyle w:val="Heading2"/>
       </w:pPr>
-      <w:bookmarkStart w:id="78" w:name="_Toc130996348"/>
-      <w:bookmarkStart w:id="79" w:name="_Toc142058402"/>
-      <w:bookmarkStart w:id="80" w:name="_Toc184734265"/>
+      <w:bookmarkStart w:id="79" w:name="_Toc130996348"/>
+      <w:bookmarkStart w:id="80" w:name="_Toc142058402"/>
+      <w:bookmarkStart w:id="81" w:name="_Toc226541331"/>
       <w:r>
         <w:t>Testing UI-Driven Process (Service Requests)</w:t>
       </w:r>
-      <w:bookmarkEnd w:id="78"/>
       <w:bookmarkEnd w:id="79"/>
       <w:bookmarkEnd w:id="80"/>
+      <w:bookmarkEnd w:id="81"/>
     </w:p>
     <w:p>
       <w:pPr>
@@ -15594,16 +15913,16 @@
       <w:pPr>
         <w:pStyle w:val="Heading2"/>
       </w:pPr>
-      <w:bookmarkStart w:id="81" w:name="_Toc130996349"/>
-      <w:bookmarkStart w:id="82" w:name="_Toc142058403"/>
-      <w:bookmarkStart w:id="83" w:name="_Toc184734266"/>
+      <w:bookmarkStart w:id="82" w:name="_Toc130996349"/>
+      <w:bookmarkStart w:id="83" w:name="_Toc142058403"/>
+      <w:bookmarkStart w:id="84" w:name="_Toc226541332"/>
       <w:r>
         <w:lastRenderedPageBreak/>
         <w:t>Testing Process-Driven UI (Process Dashboard)</w:t>
       </w:r>
-      <w:bookmarkEnd w:id="81"/>
       <w:bookmarkEnd w:id="82"/>
       <w:bookmarkEnd w:id="83"/>
+      <w:bookmarkEnd w:id="84"/>
     </w:p>
     <w:p>
       <w:pPr>
@@ -16250,16 +16569,16 @@
       <w:pPr>
         <w:pStyle w:val="Heading1"/>
       </w:pPr>
-      <w:bookmarkStart w:id="84" w:name="_Toc130996350"/>
-      <w:bookmarkStart w:id="85" w:name="_Toc142058404"/>
-      <w:bookmarkStart w:id="86" w:name="_Toc184734267"/>
+      <w:bookmarkStart w:id="85" w:name="_Toc130996350"/>
+      <w:bookmarkStart w:id="86" w:name="_Toc142058404"/>
+      <w:bookmarkStart w:id="87" w:name="_Toc226541333"/>
       <w:r>
         <w:lastRenderedPageBreak/>
         <w:t>Appendix A: Renaming Web App Title</w:t>
       </w:r>
-      <w:bookmarkEnd w:id="84"/>
       <w:bookmarkEnd w:id="85"/>
       <w:bookmarkEnd w:id="86"/>
+      <w:bookmarkEnd w:id="87"/>
     </w:p>
     <w:p>
       <w:pPr>
@@ -16595,7 +16914,23 @@
       </w:r>
       <w:proofErr w:type="gramEnd"/>
       <w:r>
-        <w:t>("(""title"",null,""AppGyver"")","(""title"",null,""$websiteName"")") | Set-Content $_</w:t>
+        <w:t>("(""title"</w:t>
+      </w:r>
+      <w:proofErr w:type="gramStart"/>
+      <w:r>
+        <w:t>",null</w:t>
+      </w:r>
+      <w:proofErr w:type="gramEnd"/>
+      <w:r>
+        <w:t>,""AppGyver"")","(""title"</w:t>
+      </w:r>
+      <w:proofErr w:type="gramStart"/>
+      <w:r>
+        <w:t>",null</w:t>
+      </w:r>
+      <w:proofErr w:type="gramEnd"/>
+      <w:r>
+        <w:t>,""$websiteName"")") | Set-Content $_</w:t>
       </w:r>
     </w:p>
     <w:p>
@@ -16612,9 +16947,9 @@
       <w:pPr>
         <w:pStyle w:val="Heading1"/>
       </w:pPr>
-      <w:bookmarkStart w:id="87" w:name="_Toc130996356"/>
-      <w:bookmarkStart w:id="88" w:name="_Toc142058405"/>
-      <w:bookmarkStart w:id="89" w:name="_Toc184734268"/>
+      <w:bookmarkStart w:id="88" w:name="_Toc130996356"/>
+      <w:bookmarkStart w:id="89" w:name="_Toc142058405"/>
+      <w:bookmarkStart w:id="90" w:name="_Toc226541334"/>
       <w:r>
         <w:lastRenderedPageBreak/>
         <w:t xml:space="preserve">Appendix </w:t>
@@ -16625,9 +16960,9 @@
       <w:r>
         <w:t>: Issues with Self Signed Certificates</w:t>
       </w:r>
-      <w:bookmarkEnd w:id="87"/>
       <w:bookmarkEnd w:id="88"/>
       <w:bookmarkEnd w:id="89"/>
+      <w:bookmarkEnd w:id="90"/>
       <w:r>
         <w:t xml:space="preserve"> </w:t>
       </w:r>
@@ -16747,8 +17082,8 @@
       <w:pPr>
         <w:pStyle w:val="Heading1"/>
       </w:pPr>
-      <w:bookmarkStart w:id="90" w:name="_Toc142058406"/>
-      <w:bookmarkStart w:id="91" w:name="_Toc184734269"/>
+      <w:bookmarkStart w:id="91" w:name="_Toc142058406"/>
+      <w:bookmarkStart w:id="92" w:name="_Toc226541335"/>
       <w:r>
         <w:lastRenderedPageBreak/>
         <w:t xml:space="preserve">Appendix </w:t>
@@ -16759,8 +17094,8 @@
       <w:r>
         <w:t>: Load Balancer Configurations</w:t>
       </w:r>
-      <w:bookmarkEnd w:id="90"/>
       <w:bookmarkEnd w:id="91"/>
+      <w:bookmarkEnd w:id="92"/>
     </w:p>
     <w:p>
       <w:r>
@@ -16771,13 +17106,13 @@
       <w:pPr>
         <w:pStyle w:val="Heading2"/>
       </w:pPr>
-      <w:bookmarkStart w:id="92" w:name="_Toc142058407"/>
-      <w:bookmarkStart w:id="93" w:name="_Toc184734270"/>
+      <w:bookmarkStart w:id="93" w:name="_Toc142058407"/>
+      <w:bookmarkStart w:id="94" w:name="_Toc226541336"/>
       <w:r>
         <w:t>Single-Portal Setup</w:t>
       </w:r>
-      <w:bookmarkEnd w:id="92"/>
       <w:bookmarkEnd w:id="93"/>
+      <w:bookmarkEnd w:id="94"/>
     </w:p>
     <w:p>
       <w:r>
@@ -16988,15 +17323,7 @@
       </w:r>
       <w:r>
         <w:tab/>
-        <w:t>"</w:t>
-      </w:r>
-      <w:proofErr w:type="spellStart"/>
-      <w:r>
-        <w:t>CortexNodes</w:t>
-      </w:r>
-      <w:proofErr w:type="spellEnd"/>
-      <w:r>
-        <w:t>": {</w:t>
+        <w:t>"CortexNodes": {</w:t>
       </w:r>
     </w:p>
     <w:p>
@@ -18310,14 +18637,14 @@
       <w:pPr>
         <w:pStyle w:val="Heading2"/>
       </w:pPr>
-      <w:bookmarkStart w:id="94" w:name="_Toc142058408"/>
-      <w:bookmarkStart w:id="95" w:name="_Toc184734271"/>
+      <w:bookmarkStart w:id="95" w:name="_Toc142058408"/>
+      <w:bookmarkStart w:id="96" w:name="_Toc226541337"/>
       <w:r>
         <w:t>Multi-Portal Setup</w:t>
       </w:r>
-      <w:bookmarkStart w:id="96" w:name="_Hlk142920278"/>
-      <w:bookmarkEnd w:id="94"/>
+      <w:bookmarkStart w:id="97" w:name="_Hlk142920278"/>
       <w:bookmarkEnd w:id="95"/>
+      <w:bookmarkEnd w:id="96"/>
     </w:p>
     <w:p>
       <w:r>
@@ -18544,15 +18871,7 @@
       </w:r>
       <w:r>
         <w:tab/>
-        <w:t>"</w:t>
-      </w:r>
-      <w:proofErr w:type="spellStart"/>
-      <w:r>
-        <w:t>CortexNodes</w:t>
-      </w:r>
-      <w:proofErr w:type="spellEnd"/>
-      <w:r>
-        <w:t>": {</w:t>
+        <w:t>"CortexNodes": {</w:t>
       </w:r>
     </w:p>
     <w:p>
@@ -19514,11 +19833,11 @@
         <w:tab/>
         <w:t>"</w:t>
       </w:r>
-      <w:bookmarkStart w:id="97" w:name="_Hlk139367522"/>
+      <w:bookmarkStart w:id="98" w:name="_Hlk139367522"/>
       <w:r>
         <w:t>node1.domain.com</w:t>
       </w:r>
-      <w:bookmarkEnd w:id="97"/>
+      <w:bookmarkEnd w:id="98"/>
       <w:r>
         <w:t>:8722",</w:t>
       </w:r>
@@ -20467,7 +20786,7 @@
         <w:t>}</w:t>
       </w:r>
     </w:p>
-    <w:bookmarkEnd w:id="96"/>
+    <w:bookmarkEnd w:id="97"/>
     <w:p/>
     <w:bookmarkEnd w:id="0"/>
     <w:p/>
@@ -21835,6 +22154,119 @@
     </w:lvl>
   </w:abstractNum>
   <w:abstractNum w:abstractNumId="3" w15:restartNumberingAfterBreak="0">
+    <w:nsid w:val="01B0625A"/>
+    <w:multiLevelType w:val="hybridMultilevel"/>
+    <w:tmpl w:val="B1186C7E"/>
+    <w:lvl w:ilvl="0" w:tplc="08090001">
+      <w:start w:val="1"/>
+      <w:numFmt w:val="bullet"/>
+      <w:lvlText w:val=""/>
+      <w:lvlJc w:val="left"/>
+      <w:pPr>
+        <w:ind w:left="770" w:hanging="360"/>
+      </w:pPr>
+      <w:rPr>
+        <w:rFonts w:ascii="Symbol" w:hAnsi="Symbol" w:hint="default"/>
+      </w:rPr>
+    </w:lvl>
+    <w:lvl w:ilvl="1" w:tplc="08090003" w:tentative="1">
+      <w:start w:val="1"/>
+      <w:numFmt w:val="bullet"/>
+      <w:lvlText w:val="o"/>
+      <w:lvlJc w:val="left"/>
+      <w:pPr>
+        <w:ind w:left="1490" w:hanging="360"/>
+      </w:pPr>
+      <w:rPr>
+        <w:rFonts w:ascii="Courier New" w:hAnsi="Courier New" w:cs="Courier New" w:hint="default"/>
+      </w:rPr>
+    </w:lvl>
+    <w:lvl w:ilvl="2" w:tplc="08090005" w:tentative="1">
+      <w:start w:val="1"/>
+      <w:numFmt w:val="bullet"/>
+      <w:lvlText w:val=""/>
+      <w:lvlJc w:val="left"/>
+      <w:pPr>
+        <w:ind w:left="2210" w:hanging="360"/>
+      </w:pPr>
+      <w:rPr>
+        <w:rFonts w:ascii="Wingdings" w:hAnsi="Wingdings" w:hint="default"/>
+      </w:rPr>
+    </w:lvl>
+    <w:lvl w:ilvl="3" w:tplc="08090001" w:tentative="1">
+      <w:start w:val="1"/>
+      <w:numFmt w:val="bullet"/>
+      <w:lvlText w:val=""/>
+      <w:lvlJc w:val="left"/>
+      <w:pPr>
+        <w:ind w:left="2930" w:hanging="360"/>
+      </w:pPr>
+      <w:rPr>
+        <w:rFonts w:ascii="Symbol" w:hAnsi="Symbol" w:hint="default"/>
+      </w:rPr>
+    </w:lvl>
+    <w:lvl w:ilvl="4" w:tplc="08090003" w:tentative="1">
+      <w:start w:val="1"/>
+      <w:numFmt w:val="bullet"/>
+      <w:lvlText w:val="o"/>
+      <w:lvlJc w:val="left"/>
+      <w:pPr>
+        <w:ind w:left="3650" w:hanging="360"/>
+      </w:pPr>
+      <w:rPr>
+        <w:rFonts w:ascii="Courier New" w:hAnsi="Courier New" w:cs="Courier New" w:hint="default"/>
+      </w:rPr>
+    </w:lvl>
+    <w:lvl w:ilvl="5" w:tplc="08090005" w:tentative="1">
+      <w:start w:val="1"/>
+      <w:numFmt w:val="bullet"/>
+      <w:lvlText w:val=""/>
+      <w:lvlJc w:val="left"/>
+      <w:pPr>
+        <w:ind w:left="4370" w:hanging="360"/>
+      </w:pPr>
+      <w:rPr>
+        <w:rFonts w:ascii="Wingdings" w:hAnsi="Wingdings" w:hint="default"/>
+      </w:rPr>
+    </w:lvl>
+    <w:lvl w:ilvl="6" w:tplc="08090001" w:tentative="1">
+      <w:start w:val="1"/>
+      <w:numFmt w:val="bullet"/>
+      <w:lvlText w:val=""/>
+      <w:lvlJc w:val="left"/>
+      <w:pPr>
+        <w:ind w:left="5090" w:hanging="360"/>
+      </w:pPr>
+      <w:rPr>
+        <w:rFonts w:ascii="Symbol" w:hAnsi="Symbol" w:hint="default"/>
+      </w:rPr>
+    </w:lvl>
+    <w:lvl w:ilvl="7" w:tplc="08090003" w:tentative="1">
+      <w:start w:val="1"/>
+      <w:numFmt w:val="bullet"/>
+      <w:lvlText w:val="o"/>
+      <w:lvlJc w:val="left"/>
+      <w:pPr>
+        <w:ind w:left="5810" w:hanging="360"/>
+      </w:pPr>
+      <w:rPr>
+        <w:rFonts w:ascii="Courier New" w:hAnsi="Courier New" w:cs="Courier New" w:hint="default"/>
+      </w:rPr>
+    </w:lvl>
+    <w:lvl w:ilvl="8" w:tplc="08090005" w:tentative="1">
+      <w:start w:val="1"/>
+      <w:numFmt w:val="bullet"/>
+      <w:lvlText w:val=""/>
+      <w:lvlJc w:val="left"/>
+      <w:pPr>
+        <w:ind w:left="6530" w:hanging="360"/>
+      </w:pPr>
+      <w:rPr>
+        <w:rFonts w:ascii="Wingdings" w:hAnsi="Wingdings" w:hint="default"/>
+      </w:rPr>
+    </w:lvl>
+  </w:abstractNum>
+  <w:abstractNum w:abstractNumId="4" w15:restartNumberingAfterBreak="0">
     <w:nsid w:val="022F7EEB"/>
     <w:multiLevelType w:val="hybridMultilevel"/>
     <w:tmpl w:val="B3F68EDC"/>
@@ -21920,7 +22352,7 @@
       </w:pPr>
     </w:lvl>
   </w:abstractNum>
-  <w:abstractNum w:abstractNumId="4" w15:restartNumberingAfterBreak="0">
+  <w:abstractNum w:abstractNumId="5" w15:restartNumberingAfterBreak="0">
     <w:nsid w:val="031145BA"/>
     <w:multiLevelType w:val="hybridMultilevel"/>
     <w:tmpl w:val="4836D3B4"/>
@@ -22006,7 +22438,7 @@
       </w:pPr>
     </w:lvl>
   </w:abstractNum>
-  <w:abstractNum w:abstractNumId="5" w15:restartNumberingAfterBreak="0">
+  <w:abstractNum w:abstractNumId="6" w15:restartNumberingAfterBreak="0">
     <w:nsid w:val="03544DA3"/>
     <w:multiLevelType w:val="hybridMultilevel"/>
     <w:tmpl w:val="78E8C106"/>
@@ -22119,7 +22551,7 @@
       </w:rPr>
     </w:lvl>
   </w:abstractNum>
-  <w:abstractNum w:abstractNumId="6" w15:restartNumberingAfterBreak="0">
+  <w:abstractNum w:abstractNumId="7" w15:restartNumberingAfterBreak="0">
     <w:nsid w:val="03A176D9"/>
     <w:multiLevelType w:val="hybridMultilevel"/>
     <w:tmpl w:val="DC4CDF8C"/>
@@ -22205,7 +22637,7 @@
       </w:pPr>
     </w:lvl>
   </w:abstractNum>
-  <w:abstractNum w:abstractNumId="7" w15:restartNumberingAfterBreak="0">
+  <w:abstractNum w:abstractNumId="8" w15:restartNumberingAfterBreak="0">
     <w:nsid w:val="03BF5F7D"/>
     <w:multiLevelType w:val="hybridMultilevel"/>
     <w:tmpl w:val="EE3C1ABE"/>
@@ -22294,7 +22726,7 @@
       </w:pPr>
     </w:lvl>
   </w:abstractNum>
-  <w:abstractNum w:abstractNumId="8" w15:restartNumberingAfterBreak="0">
+  <w:abstractNum w:abstractNumId="9" w15:restartNumberingAfterBreak="0">
     <w:nsid w:val="03D52A6E"/>
     <w:multiLevelType w:val="hybridMultilevel"/>
     <w:tmpl w:val="EDDA7938"/>
@@ -22407,7 +22839,93 @@
       </w:rPr>
     </w:lvl>
   </w:abstractNum>
-  <w:abstractNum w:abstractNumId="9" w15:restartNumberingAfterBreak="0">
+  <w:abstractNum w:abstractNumId="10" w15:restartNumberingAfterBreak="0">
+    <w:nsid w:val="042370A4"/>
+    <w:multiLevelType w:val="hybridMultilevel"/>
+    <w:tmpl w:val="095EB1D2"/>
+    <w:lvl w:ilvl="0" w:tplc="FFFFFFFF">
+      <w:start w:val="1"/>
+      <w:numFmt w:val="decimal"/>
+      <w:lvlText w:val="%1."/>
+      <w:lvlJc w:val="left"/>
+      <w:pPr>
+        <w:ind w:left="720" w:hanging="360"/>
+      </w:pPr>
+    </w:lvl>
+    <w:lvl w:ilvl="1" w:tplc="FFFFFFFF">
+      <w:start w:val="1"/>
+      <w:numFmt w:val="lowerLetter"/>
+      <w:lvlText w:val="%2."/>
+      <w:lvlJc w:val="left"/>
+      <w:pPr>
+        <w:ind w:left="1440" w:hanging="360"/>
+      </w:pPr>
+    </w:lvl>
+    <w:lvl w:ilvl="2" w:tplc="FFFFFFFF" w:tentative="1">
+      <w:start w:val="1"/>
+      <w:numFmt w:val="lowerRoman"/>
+      <w:lvlText w:val="%3."/>
+      <w:lvlJc w:val="right"/>
+      <w:pPr>
+        <w:ind w:left="2160" w:hanging="180"/>
+      </w:pPr>
+    </w:lvl>
+    <w:lvl w:ilvl="3" w:tplc="FFFFFFFF" w:tentative="1">
+      <w:start w:val="1"/>
+      <w:numFmt w:val="decimal"/>
+      <w:lvlText w:val="%4."/>
+      <w:lvlJc w:val="left"/>
+      <w:pPr>
+        <w:ind w:left="2880" w:hanging="360"/>
+      </w:pPr>
+    </w:lvl>
+    <w:lvl w:ilvl="4" w:tplc="FFFFFFFF" w:tentative="1">
+      <w:start w:val="1"/>
+      <w:numFmt w:val="lowerLetter"/>
+      <w:lvlText w:val="%5."/>
+      <w:lvlJc w:val="left"/>
+      <w:pPr>
+        <w:ind w:left="3600" w:hanging="360"/>
+      </w:pPr>
+    </w:lvl>
+    <w:lvl w:ilvl="5" w:tplc="FFFFFFFF" w:tentative="1">
+      <w:start w:val="1"/>
+      <w:numFmt w:val="lowerRoman"/>
+      <w:lvlText w:val="%6."/>
+      <w:lvlJc w:val="right"/>
+      <w:pPr>
+        <w:ind w:left="4320" w:hanging="180"/>
+      </w:pPr>
+    </w:lvl>
+    <w:lvl w:ilvl="6" w:tplc="FFFFFFFF" w:tentative="1">
+      <w:start w:val="1"/>
+      <w:numFmt w:val="decimal"/>
+      <w:lvlText w:val="%7."/>
+      <w:lvlJc w:val="left"/>
+      <w:pPr>
+        <w:ind w:left="5040" w:hanging="360"/>
+      </w:pPr>
+    </w:lvl>
+    <w:lvl w:ilvl="7" w:tplc="FFFFFFFF" w:tentative="1">
+      <w:start w:val="1"/>
+      <w:numFmt w:val="lowerLetter"/>
+      <w:lvlText w:val="%8."/>
+      <w:lvlJc w:val="left"/>
+      <w:pPr>
+        <w:ind w:left="5760" w:hanging="360"/>
+      </w:pPr>
+    </w:lvl>
+    <w:lvl w:ilvl="8" w:tplc="FFFFFFFF" w:tentative="1">
+      <w:start w:val="1"/>
+      <w:numFmt w:val="lowerRoman"/>
+      <w:lvlText w:val="%9."/>
+      <w:lvlJc w:val="right"/>
+      <w:pPr>
+        <w:ind w:left="6480" w:hanging="180"/>
+      </w:pPr>
+    </w:lvl>
+  </w:abstractNum>
+  <w:abstractNum w:abstractNumId="11" w15:restartNumberingAfterBreak="0">
     <w:nsid w:val="0471186A"/>
     <w:multiLevelType w:val="hybridMultilevel"/>
     <w:tmpl w:val="931E91A4"/>
@@ -22493,7 +23011,7 @@
       </w:pPr>
     </w:lvl>
   </w:abstractNum>
-  <w:abstractNum w:abstractNumId="10" w15:restartNumberingAfterBreak="0">
+  <w:abstractNum w:abstractNumId="12" w15:restartNumberingAfterBreak="0">
     <w:nsid w:val="070740EA"/>
     <w:multiLevelType w:val="hybridMultilevel"/>
     <w:tmpl w:val="3C38A894"/>
@@ -22579,7 +23097,7 @@
       </w:pPr>
     </w:lvl>
   </w:abstractNum>
-  <w:abstractNum w:abstractNumId="11" w15:restartNumberingAfterBreak="0">
+  <w:abstractNum w:abstractNumId="13" w15:restartNumberingAfterBreak="0">
     <w:nsid w:val="081B194D"/>
     <w:multiLevelType w:val="hybridMultilevel"/>
     <w:tmpl w:val="8A6E05D6"/>
@@ -22665,7 +23183,7 @@
       </w:pPr>
     </w:lvl>
   </w:abstractNum>
-  <w:abstractNum w:abstractNumId="12" w15:restartNumberingAfterBreak="0">
+  <w:abstractNum w:abstractNumId="14" w15:restartNumberingAfterBreak="0">
     <w:nsid w:val="0DC57402"/>
     <w:multiLevelType w:val="hybridMultilevel"/>
     <w:tmpl w:val="705CEC2E"/>
@@ -22778,7 +23296,7 @@
       </w:rPr>
     </w:lvl>
   </w:abstractNum>
-  <w:abstractNum w:abstractNumId="13" w15:restartNumberingAfterBreak="0">
+  <w:abstractNum w:abstractNumId="15" w15:restartNumberingAfterBreak="0">
     <w:nsid w:val="0FA67B8B"/>
     <w:multiLevelType w:val="hybridMultilevel"/>
     <w:tmpl w:val="7BB8BFCA"/>
@@ -22891,7 +23409,7 @@
       </w:rPr>
     </w:lvl>
   </w:abstractNum>
-  <w:abstractNum w:abstractNumId="14" w15:restartNumberingAfterBreak="0">
+  <w:abstractNum w:abstractNumId="16" w15:restartNumberingAfterBreak="0">
     <w:nsid w:val="1028797A"/>
     <w:multiLevelType w:val="hybridMultilevel"/>
     <w:tmpl w:val="279E63F0"/>
@@ -22977,7 +23495,7 @@
       </w:pPr>
     </w:lvl>
   </w:abstractNum>
-  <w:abstractNum w:abstractNumId="15" w15:restartNumberingAfterBreak="0">
+  <w:abstractNum w:abstractNumId="17" w15:restartNumberingAfterBreak="0">
     <w:nsid w:val="10C03A65"/>
     <w:multiLevelType w:val="hybridMultilevel"/>
     <w:tmpl w:val="C54EC466"/>
@@ -23066,7 +23584,7 @@
       </w:pPr>
     </w:lvl>
   </w:abstractNum>
-  <w:abstractNum w:abstractNumId="16" w15:restartNumberingAfterBreak="0">
+  <w:abstractNum w:abstractNumId="18" w15:restartNumberingAfterBreak="0">
     <w:nsid w:val="123A78DC"/>
     <w:multiLevelType w:val="hybridMultilevel"/>
     <w:tmpl w:val="301AAE84"/>
@@ -23155,7 +23673,7 @@
       </w:pPr>
     </w:lvl>
   </w:abstractNum>
-  <w:abstractNum w:abstractNumId="17" w15:restartNumberingAfterBreak="0">
+  <w:abstractNum w:abstractNumId="19" w15:restartNumberingAfterBreak="0">
     <w:nsid w:val="13F7193E"/>
     <w:multiLevelType w:val="hybridMultilevel"/>
     <w:tmpl w:val="E80C9B92"/>
@@ -23244,7 +23762,7 @@
       </w:pPr>
     </w:lvl>
   </w:abstractNum>
-  <w:abstractNum w:abstractNumId="18" w15:restartNumberingAfterBreak="0">
+  <w:abstractNum w:abstractNumId="20" w15:restartNumberingAfterBreak="0">
     <w:nsid w:val="14D15C14"/>
     <w:multiLevelType w:val="hybridMultilevel"/>
     <w:tmpl w:val="819CE4DA"/>
@@ -23330,7 +23848,7 @@
       </w:pPr>
     </w:lvl>
   </w:abstractNum>
-  <w:abstractNum w:abstractNumId="19" w15:restartNumberingAfterBreak="0">
+  <w:abstractNum w:abstractNumId="21" w15:restartNumberingAfterBreak="0">
     <w:nsid w:val="161F5ADC"/>
     <w:multiLevelType w:val="hybridMultilevel"/>
     <w:tmpl w:val="E01076CA"/>
@@ -23416,7 +23934,7 @@
       </w:pPr>
     </w:lvl>
   </w:abstractNum>
-  <w:abstractNum w:abstractNumId="20" w15:restartNumberingAfterBreak="0">
+  <w:abstractNum w:abstractNumId="22" w15:restartNumberingAfterBreak="0">
     <w:nsid w:val="16543D5E"/>
     <w:multiLevelType w:val="hybridMultilevel"/>
     <w:tmpl w:val="FC260200"/>
@@ -23529,7 +24047,7 @@
       </w:rPr>
     </w:lvl>
   </w:abstractNum>
-  <w:abstractNum w:abstractNumId="21" w15:restartNumberingAfterBreak="0">
+  <w:abstractNum w:abstractNumId="23" w15:restartNumberingAfterBreak="0">
     <w:nsid w:val="17373C56"/>
     <w:multiLevelType w:val="hybridMultilevel"/>
     <w:tmpl w:val="BBA2DCB6"/>
@@ -23615,7 +24133,7 @@
       </w:pPr>
     </w:lvl>
   </w:abstractNum>
-  <w:abstractNum w:abstractNumId="22" w15:restartNumberingAfterBreak="0">
+  <w:abstractNum w:abstractNumId="24" w15:restartNumberingAfterBreak="0">
     <w:nsid w:val="185C3BC0"/>
     <w:multiLevelType w:val="hybridMultilevel"/>
     <w:tmpl w:val="D8B2A07E"/>
@@ -23701,7 +24219,7 @@
       </w:pPr>
     </w:lvl>
   </w:abstractNum>
-  <w:abstractNum w:abstractNumId="23" w15:restartNumberingAfterBreak="0">
+  <w:abstractNum w:abstractNumId="25" w15:restartNumberingAfterBreak="0">
     <w:nsid w:val="18825A88"/>
     <w:multiLevelType w:val="hybridMultilevel"/>
     <w:tmpl w:val="79622982"/>
@@ -23790,7 +24308,7 @@
       </w:pPr>
     </w:lvl>
   </w:abstractNum>
-  <w:abstractNum w:abstractNumId="24" w15:restartNumberingAfterBreak="0">
+  <w:abstractNum w:abstractNumId="26" w15:restartNumberingAfterBreak="0">
     <w:nsid w:val="1A9C7956"/>
     <w:multiLevelType w:val="hybridMultilevel"/>
     <w:tmpl w:val="D6EE20FC"/>
@@ -23876,7 +24394,7 @@
       </w:pPr>
     </w:lvl>
   </w:abstractNum>
-  <w:abstractNum w:abstractNumId="25" w15:restartNumberingAfterBreak="0">
+  <w:abstractNum w:abstractNumId="27" w15:restartNumberingAfterBreak="0">
     <w:nsid w:val="1CBA4AA3"/>
     <w:multiLevelType w:val="hybridMultilevel"/>
     <w:tmpl w:val="274AB738"/>
@@ -23962,7 +24480,7 @@
       </w:pPr>
     </w:lvl>
   </w:abstractNum>
-  <w:abstractNum w:abstractNumId="26" w15:restartNumberingAfterBreak="0">
+  <w:abstractNum w:abstractNumId="28" w15:restartNumberingAfterBreak="0">
     <w:nsid w:val="1E671883"/>
     <w:multiLevelType w:val="multilevel"/>
     <w:tmpl w:val="FB8E42D6"/>
@@ -24075,7 +24593,7 @@
       </w:rPr>
     </w:lvl>
   </w:abstractNum>
-  <w:abstractNum w:abstractNumId="27" w15:restartNumberingAfterBreak="0">
+  <w:abstractNum w:abstractNumId="29" w15:restartNumberingAfterBreak="0">
     <w:nsid w:val="1F681B79"/>
     <w:multiLevelType w:val="hybridMultilevel"/>
     <w:tmpl w:val="39640AD6"/>
@@ -24188,7 +24706,7 @@
       </w:rPr>
     </w:lvl>
   </w:abstractNum>
-  <w:abstractNum w:abstractNumId="28" w15:restartNumberingAfterBreak="0">
+  <w:abstractNum w:abstractNumId="30" w15:restartNumberingAfterBreak="0">
     <w:nsid w:val="1FA251B3"/>
     <w:multiLevelType w:val="hybridMultilevel"/>
     <w:tmpl w:val="133082C2"/>
@@ -24301,7 +24819,7 @@
       </w:rPr>
     </w:lvl>
   </w:abstractNum>
-  <w:abstractNum w:abstractNumId="29" w15:restartNumberingAfterBreak="0">
+  <w:abstractNum w:abstractNumId="31" w15:restartNumberingAfterBreak="0">
     <w:nsid w:val="1FC45341"/>
     <w:multiLevelType w:val="hybridMultilevel"/>
     <w:tmpl w:val="14AC6F0C"/>
@@ -24387,7 +24905,7 @@
       </w:pPr>
     </w:lvl>
   </w:abstractNum>
-  <w:abstractNum w:abstractNumId="30" w15:restartNumberingAfterBreak="0">
+  <w:abstractNum w:abstractNumId="32" w15:restartNumberingAfterBreak="0">
     <w:nsid w:val="201877C7"/>
     <w:multiLevelType w:val="hybridMultilevel"/>
     <w:tmpl w:val="D5EEA2A6"/>
@@ -24473,7 +24991,7 @@
       </w:pPr>
     </w:lvl>
   </w:abstractNum>
-  <w:abstractNum w:abstractNumId="31" w15:restartNumberingAfterBreak="0">
+  <w:abstractNum w:abstractNumId="33" w15:restartNumberingAfterBreak="0">
     <w:nsid w:val="21016D8F"/>
     <w:multiLevelType w:val="hybridMultilevel"/>
     <w:tmpl w:val="9E407058"/>
@@ -24559,7 +25077,7 @@
       </w:pPr>
     </w:lvl>
   </w:abstractNum>
-  <w:abstractNum w:abstractNumId="32" w15:restartNumberingAfterBreak="0">
+  <w:abstractNum w:abstractNumId="34" w15:restartNumberingAfterBreak="0">
     <w:nsid w:val="210A3909"/>
     <w:multiLevelType w:val="hybridMultilevel"/>
     <w:tmpl w:val="DAA45776"/>
@@ -24673,7 +25191,7 @@
       </w:rPr>
     </w:lvl>
   </w:abstractNum>
-  <w:abstractNum w:abstractNumId="33" w15:restartNumberingAfterBreak="0">
+  <w:abstractNum w:abstractNumId="35" w15:restartNumberingAfterBreak="0">
     <w:nsid w:val="21F5693D"/>
     <w:multiLevelType w:val="hybridMultilevel"/>
     <w:tmpl w:val="6EDA2B2C"/>
@@ -24759,7 +25277,7 @@
       </w:pPr>
     </w:lvl>
   </w:abstractNum>
-  <w:abstractNum w:abstractNumId="34" w15:restartNumberingAfterBreak="0">
+  <w:abstractNum w:abstractNumId="36" w15:restartNumberingAfterBreak="0">
     <w:nsid w:val="24867081"/>
     <w:multiLevelType w:val="hybridMultilevel"/>
     <w:tmpl w:val="5EFED0E4"/>
@@ -24845,7 +25363,7 @@
       </w:pPr>
     </w:lvl>
   </w:abstractNum>
-  <w:abstractNum w:abstractNumId="35" w15:restartNumberingAfterBreak="0">
+  <w:abstractNum w:abstractNumId="37" w15:restartNumberingAfterBreak="0">
     <w:nsid w:val="24D24565"/>
     <w:multiLevelType w:val="hybridMultilevel"/>
     <w:tmpl w:val="118A3A32"/>
@@ -24934,7 +25452,7 @@
       </w:pPr>
     </w:lvl>
   </w:abstractNum>
-  <w:abstractNum w:abstractNumId="36" w15:restartNumberingAfterBreak="0">
+  <w:abstractNum w:abstractNumId="38" w15:restartNumberingAfterBreak="0">
     <w:nsid w:val="25A43E93"/>
     <w:multiLevelType w:val="hybridMultilevel"/>
     <w:tmpl w:val="C2803C64"/>
@@ -25020,7 +25538,7 @@
       </w:pPr>
     </w:lvl>
   </w:abstractNum>
-  <w:abstractNum w:abstractNumId="37" w15:restartNumberingAfterBreak="0">
+  <w:abstractNum w:abstractNumId="39" w15:restartNumberingAfterBreak="0">
     <w:nsid w:val="264E2EA1"/>
     <w:multiLevelType w:val="hybridMultilevel"/>
     <w:tmpl w:val="2C260AC4"/>
@@ -25133,7 +25651,7 @@
       </w:rPr>
     </w:lvl>
   </w:abstractNum>
-  <w:abstractNum w:abstractNumId="38" w15:restartNumberingAfterBreak="0">
+  <w:abstractNum w:abstractNumId="40" w15:restartNumberingAfterBreak="0">
     <w:nsid w:val="271220DB"/>
     <w:multiLevelType w:val="hybridMultilevel"/>
     <w:tmpl w:val="BD8E7B1A"/>
@@ -25222,7 +25740,7 @@
       </w:pPr>
     </w:lvl>
   </w:abstractNum>
-  <w:abstractNum w:abstractNumId="39" w15:restartNumberingAfterBreak="0">
+  <w:abstractNum w:abstractNumId="41" w15:restartNumberingAfterBreak="0">
     <w:nsid w:val="27941DBE"/>
     <w:multiLevelType w:val="hybridMultilevel"/>
     <w:tmpl w:val="72B644C8"/>
@@ -25308,7 +25826,7 @@
       </w:pPr>
     </w:lvl>
   </w:abstractNum>
-  <w:abstractNum w:abstractNumId="40" w15:restartNumberingAfterBreak="0">
+  <w:abstractNum w:abstractNumId="42" w15:restartNumberingAfterBreak="0">
     <w:nsid w:val="28A20D9D"/>
     <w:multiLevelType w:val="hybridMultilevel"/>
     <w:tmpl w:val="E4680B2C"/>
@@ -25394,7 +25912,7 @@
       </w:pPr>
     </w:lvl>
   </w:abstractNum>
-  <w:abstractNum w:abstractNumId="41" w15:restartNumberingAfterBreak="0">
+  <w:abstractNum w:abstractNumId="43" w15:restartNumberingAfterBreak="0">
     <w:nsid w:val="294D32F4"/>
     <w:multiLevelType w:val="hybridMultilevel"/>
     <w:tmpl w:val="CE24D8E4"/>
@@ -25507,7 +26025,7 @@
       </w:rPr>
     </w:lvl>
   </w:abstractNum>
-  <w:abstractNum w:abstractNumId="42" w15:restartNumberingAfterBreak="0">
+  <w:abstractNum w:abstractNumId="44" w15:restartNumberingAfterBreak="0">
     <w:nsid w:val="2A681469"/>
     <w:multiLevelType w:val="hybridMultilevel"/>
     <w:tmpl w:val="CC960BA6"/>
@@ -25593,7 +26111,7 @@
       </w:pPr>
     </w:lvl>
   </w:abstractNum>
-  <w:abstractNum w:abstractNumId="43" w15:restartNumberingAfterBreak="0">
+  <w:abstractNum w:abstractNumId="45" w15:restartNumberingAfterBreak="0">
     <w:nsid w:val="2AD15B9C"/>
     <w:multiLevelType w:val="hybridMultilevel"/>
     <w:tmpl w:val="71788734"/>
@@ -25679,7 +26197,7 @@
       </w:pPr>
     </w:lvl>
   </w:abstractNum>
-  <w:abstractNum w:abstractNumId="44" w15:restartNumberingAfterBreak="0">
+  <w:abstractNum w:abstractNumId="46" w15:restartNumberingAfterBreak="0">
     <w:nsid w:val="2BFE6300"/>
     <w:multiLevelType w:val="hybridMultilevel"/>
     <w:tmpl w:val="7986A5B8"/>
@@ -25765,7 +26283,7 @@
       </w:pPr>
     </w:lvl>
   </w:abstractNum>
-  <w:abstractNum w:abstractNumId="45" w15:restartNumberingAfterBreak="0">
+  <w:abstractNum w:abstractNumId="47" w15:restartNumberingAfterBreak="0">
     <w:nsid w:val="2C172F4E"/>
     <w:multiLevelType w:val="hybridMultilevel"/>
     <w:tmpl w:val="D9D41188"/>
@@ -25851,7 +26369,7 @@
       </w:pPr>
     </w:lvl>
   </w:abstractNum>
-  <w:abstractNum w:abstractNumId="46" w15:restartNumberingAfterBreak="0">
+  <w:abstractNum w:abstractNumId="48" w15:restartNumberingAfterBreak="0">
     <w:nsid w:val="2C1D1FA4"/>
     <w:multiLevelType w:val="hybridMultilevel"/>
     <w:tmpl w:val="0A0A94CC"/>
@@ -25937,7 +26455,7 @@
       </w:pPr>
     </w:lvl>
   </w:abstractNum>
-  <w:abstractNum w:abstractNumId="47" w15:restartNumberingAfterBreak="0">
+  <w:abstractNum w:abstractNumId="49" w15:restartNumberingAfterBreak="0">
     <w:nsid w:val="2F435A31"/>
     <w:multiLevelType w:val="hybridMultilevel"/>
     <w:tmpl w:val="E7B486FE"/>
@@ -26026,7 +26544,7 @@
       </w:pPr>
     </w:lvl>
   </w:abstractNum>
-  <w:abstractNum w:abstractNumId="48" w15:restartNumberingAfterBreak="0">
+  <w:abstractNum w:abstractNumId="50" w15:restartNumberingAfterBreak="0">
     <w:nsid w:val="2F7256E6"/>
     <w:multiLevelType w:val="hybridMultilevel"/>
     <w:tmpl w:val="10141916"/>
@@ -26112,7 +26630,7 @@
       </w:pPr>
     </w:lvl>
   </w:abstractNum>
-  <w:abstractNum w:abstractNumId="49" w15:restartNumberingAfterBreak="0">
+  <w:abstractNum w:abstractNumId="51" w15:restartNumberingAfterBreak="0">
     <w:nsid w:val="30EA3355"/>
     <w:multiLevelType w:val="hybridMultilevel"/>
     <w:tmpl w:val="1B62E6DC"/>
@@ -26198,7 +26716,7 @@
       </w:pPr>
     </w:lvl>
   </w:abstractNum>
-  <w:abstractNum w:abstractNumId="50" w15:restartNumberingAfterBreak="0">
+  <w:abstractNum w:abstractNumId="52" w15:restartNumberingAfterBreak="0">
     <w:nsid w:val="31CE7188"/>
     <w:multiLevelType w:val="hybridMultilevel"/>
     <w:tmpl w:val="FC70FA0A"/>
@@ -26287,7 +26805,7 @@
       </w:pPr>
     </w:lvl>
   </w:abstractNum>
-  <w:abstractNum w:abstractNumId="51" w15:restartNumberingAfterBreak="0">
+  <w:abstractNum w:abstractNumId="53" w15:restartNumberingAfterBreak="0">
     <w:nsid w:val="32774060"/>
     <w:multiLevelType w:val="hybridMultilevel"/>
     <w:tmpl w:val="7FCE930A"/>
@@ -26373,7 +26891,7 @@
       </w:pPr>
     </w:lvl>
   </w:abstractNum>
-  <w:abstractNum w:abstractNumId="52" w15:restartNumberingAfterBreak="0">
+  <w:abstractNum w:abstractNumId="54" w15:restartNumberingAfterBreak="0">
     <w:nsid w:val="32FF12C5"/>
     <w:multiLevelType w:val="hybridMultilevel"/>
     <w:tmpl w:val="DC7C2780"/>
@@ -26459,7 +26977,7 @@
       </w:pPr>
     </w:lvl>
   </w:abstractNum>
-  <w:abstractNum w:abstractNumId="53" w15:restartNumberingAfterBreak="0">
+  <w:abstractNum w:abstractNumId="55" w15:restartNumberingAfterBreak="0">
     <w:nsid w:val="3306223D"/>
     <w:multiLevelType w:val="hybridMultilevel"/>
     <w:tmpl w:val="E85A637E"/>
@@ -26545,7 +27063,7 @@
       </w:pPr>
     </w:lvl>
   </w:abstractNum>
-  <w:abstractNum w:abstractNumId="54" w15:restartNumberingAfterBreak="0">
+  <w:abstractNum w:abstractNumId="56" w15:restartNumberingAfterBreak="0">
     <w:nsid w:val="33405277"/>
     <w:multiLevelType w:val="hybridMultilevel"/>
     <w:tmpl w:val="C26A05A8"/>
@@ -26658,7 +27176,7 @@
       </w:rPr>
     </w:lvl>
   </w:abstractNum>
-  <w:abstractNum w:abstractNumId="55" w15:restartNumberingAfterBreak="0">
+  <w:abstractNum w:abstractNumId="57" w15:restartNumberingAfterBreak="0">
     <w:nsid w:val="33701C31"/>
     <w:multiLevelType w:val="hybridMultilevel"/>
     <w:tmpl w:val="5CCEC8DA"/>
@@ -26744,7 +27262,7 @@
       </w:pPr>
     </w:lvl>
   </w:abstractNum>
-  <w:abstractNum w:abstractNumId="56" w15:restartNumberingAfterBreak="0">
+  <w:abstractNum w:abstractNumId="58" w15:restartNumberingAfterBreak="0">
     <w:nsid w:val="3489309C"/>
     <w:multiLevelType w:val="hybridMultilevel"/>
     <w:tmpl w:val="D6EE20FC"/>
@@ -26830,7 +27348,7 @@
       </w:pPr>
     </w:lvl>
   </w:abstractNum>
-  <w:abstractNum w:abstractNumId="57" w15:restartNumberingAfterBreak="0">
+  <w:abstractNum w:abstractNumId="59" w15:restartNumberingAfterBreak="0">
     <w:nsid w:val="35677F28"/>
     <w:multiLevelType w:val="hybridMultilevel"/>
     <w:tmpl w:val="C9C637EC"/>
@@ -26916,7 +27434,7 @@
       </w:pPr>
     </w:lvl>
   </w:abstractNum>
-  <w:abstractNum w:abstractNumId="58" w15:restartNumberingAfterBreak="0">
+  <w:abstractNum w:abstractNumId="60" w15:restartNumberingAfterBreak="0">
     <w:nsid w:val="357F7892"/>
     <w:multiLevelType w:val="hybridMultilevel"/>
     <w:tmpl w:val="A59AA3C2"/>
@@ -27005,7 +27523,7 @@
       </w:pPr>
     </w:lvl>
   </w:abstractNum>
-  <w:abstractNum w:abstractNumId="59" w15:restartNumberingAfterBreak="0">
+  <w:abstractNum w:abstractNumId="61" w15:restartNumberingAfterBreak="0">
     <w:nsid w:val="360E7F55"/>
     <w:multiLevelType w:val="multilevel"/>
     <w:tmpl w:val="4DDEC27C"/>
@@ -27123,7 +27641,7 @@
       </w:rPr>
     </w:lvl>
   </w:abstractNum>
-  <w:abstractNum w:abstractNumId="60" w15:restartNumberingAfterBreak="0">
+  <w:abstractNum w:abstractNumId="62" w15:restartNumberingAfterBreak="0">
     <w:nsid w:val="378473C2"/>
     <w:multiLevelType w:val="hybridMultilevel"/>
     <w:tmpl w:val="6DACEA8E"/>
@@ -27209,7 +27727,7 @@
       </w:pPr>
     </w:lvl>
   </w:abstractNum>
-  <w:abstractNum w:abstractNumId="61" w15:restartNumberingAfterBreak="0">
+  <w:abstractNum w:abstractNumId="63" w15:restartNumberingAfterBreak="0">
     <w:nsid w:val="398721B7"/>
     <w:multiLevelType w:val="hybridMultilevel"/>
     <w:tmpl w:val="55F8A288"/>
@@ -27295,7 +27813,7 @@
       </w:pPr>
     </w:lvl>
   </w:abstractNum>
-  <w:abstractNum w:abstractNumId="62" w15:restartNumberingAfterBreak="0">
+  <w:abstractNum w:abstractNumId="64" w15:restartNumberingAfterBreak="0">
     <w:nsid w:val="3A7F4972"/>
     <w:multiLevelType w:val="hybridMultilevel"/>
     <w:tmpl w:val="DA441096"/>
@@ -27408,7 +27926,7 @@
       </w:rPr>
     </w:lvl>
   </w:abstractNum>
-  <w:abstractNum w:abstractNumId="63" w15:restartNumberingAfterBreak="0">
+  <w:abstractNum w:abstractNumId="65" w15:restartNumberingAfterBreak="0">
     <w:nsid w:val="3B3468CB"/>
     <w:multiLevelType w:val="hybridMultilevel"/>
     <w:tmpl w:val="FE36E4BC"/>
@@ -27494,7 +28012,7 @@
       </w:pPr>
     </w:lvl>
   </w:abstractNum>
-  <w:abstractNum w:abstractNumId="64" w15:restartNumberingAfterBreak="0">
+  <w:abstractNum w:abstractNumId="66" w15:restartNumberingAfterBreak="0">
     <w:nsid w:val="3D2C7974"/>
     <w:multiLevelType w:val="hybridMultilevel"/>
     <w:tmpl w:val="6A90B5CA"/>
@@ -27580,7 +28098,7 @@
       </w:pPr>
     </w:lvl>
   </w:abstractNum>
-  <w:abstractNum w:abstractNumId="65" w15:restartNumberingAfterBreak="0">
+  <w:abstractNum w:abstractNumId="67" w15:restartNumberingAfterBreak="0">
     <w:nsid w:val="3DBA3842"/>
     <w:multiLevelType w:val="hybridMultilevel"/>
     <w:tmpl w:val="6024A38C"/>
@@ -27666,7 +28184,7 @@
       </w:pPr>
     </w:lvl>
   </w:abstractNum>
-  <w:abstractNum w:abstractNumId="66" w15:restartNumberingAfterBreak="0">
+  <w:abstractNum w:abstractNumId="68" w15:restartNumberingAfterBreak="0">
     <w:nsid w:val="3DD84A66"/>
     <w:multiLevelType w:val="hybridMultilevel"/>
     <w:tmpl w:val="CC882E9C"/>
@@ -27752,7 +28270,7 @@
       </w:pPr>
     </w:lvl>
   </w:abstractNum>
-  <w:abstractNum w:abstractNumId="67" w15:restartNumberingAfterBreak="0">
+  <w:abstractNum w:abstractNumId="69" w15:restartNumberingAfterBreak="0">
     <w:nsid w:val="3FB66F45"/>
     <w:multiLevelType w:val="hybridMultilevel"/>
     <w:tmpl w:val="9D10EB5E"/>
@@ -27841,7 +28359,7 @@
       </w:pPr>
     </w:lvl>
   </w:abstractNum>
-  <w:abstractNum w:abstractNumId="68" w15:restartNumberingAfterBreak="0">
+  <w:abstractNum w:abstractNumId="70" w15:restartNumberingAfterBreak="0">
     <w:nsid w:val="40571080"/>
     <w:multiLevelType w:val="hybridMultilevel"/>
     <w:tmpl w:val="7842128A"/>
@@ -27930,7 +28448,7 @@
       </w:pPr>
     </w:lvl>
   </w:abstractNum>
-  <w:abstractNum w:abstractNumId="69" w15:restartNumberingAfterBreak="0">
+  <w:abstractNum w:abstractNumId="71" w15:restartNumberingAfterBreak="0">
     <w:nsid w:val="410771E6"/>
     <w:multiLevelType w:val="hybridMultilevel"/>
     <w:tmpl w:val="88B4D054"/>
@@ -28043,7 +28561,7 @@
       </w:rPr>
     </w:lvl>
   </w:abstractNum>
-  <w:abstractNum w:abstractNumId="70" w15:restartNumberingAfterBreak="0">
+  <w:abstractNum w:abstractNumId="72" w15:restartNumberingAfterBreak="0">
     <w:nsid w:val="42673A8B"/>
     <w:multiLevelType w:val="hybridMultilevel"/>
     <w:tmpl w:val="FB2A0018"/>
@@ -28132,7 +28650,7 @@
       </w:pPr>
     </w:lvl>
   </w:abstractNum>
-  <w:abstractNum w:abstractNumId="71" w15:restartNumberingAfterBreak="0">
+  <w:abstractNum w:abstractNumId="73" w15:restartNumberingAfterBreak="0">
     <w:nsid w:val="428F1DD7"/>
     <w:multiLevelType w:val="hybridMultilevel"/>
     <w:tmpl w:val="14AC6F0C"/>
@@ -28218,7 +28736,7 @@
       </w:pPr>
     </w:lvl>
   </w:abstractNum>
-  <w:abstractNum w:abstractNumId="72" w15:restartNumberingAfterBreak="0">
+  <w:abstractNum w:abstractNumId="74" w15:restartNumberingAfterBreak="0">
     <w:nsid w:val="42D35B8C"/>
     <w:multiLevelType w:val="hybridMultilevel"/>
     <w:tmpl w:val="8B2A55F2"/>
@@ -28331,7 +28849,7 @@
       </w:rPr>
     </w:lvl>
   </w:abstractNum>
-  <w:abstractNum w:abstractNumId="73" w15:restartNumberingAfterBreak="0">
+  <w:abstractNum w:abstractNumId="75" w15:restartNumberingAfterBreak="0">
     <w:nsid w:val="434316E6"/>
     <w:multiLevelType w:val="hybridMultilevel"/>
     <w:tmpl w:val="41CA4298"/>
@@ -28417,7 +28935,7 @@
       </w:pPr>
     </w:lvl>
   </w:abstractNum>
-  <w:abstractNum w:abstractNumId="74" w15:restartNumberingAfterBreak="0">
+  <w:abstractNum w:abstractNumId="76" w15:restartNumberingAfterBreak="0">
     <w:nsid w:val="43D75A96"/>
     <w:multiLevelType w:val="hybridMultilevel"/>
     <w:tmpl w:val="07661E98"/>
@@ -28503,7 +29021,7 @@
       </w:pPr>
     </w:lvl>
   </w:abstractNum>
-  <w:abstractNum w:abstractNumId="75" w15:restartNumberingAfterBreak="0">
+  <w:abstractNum w:abstractNumId="77" w15:restartNumberingAfterBreak="0">
     <w:nsid w:val="442C1038"/>
     <w:multiLevelType w:val="hybridMultilevel"/>
     <w:tmpl w:val="F0B02F38"/>
@@ -28589,7 +29107,7 @@
       </w:pPr>
     </w:lvl>
   </w:abstractNum>
-  <w:abstractNum w:abstractNumId="76" w15:restartNumberingAfterBreak="0">
+  <w:abstractNum w:abstractNumId="78" w15:restartNumberingAfterBreak="0">
     <w:nsid w:val="46DA5AB4"/>
     <w:multiLevelType w:val="hybridMultilevel"/>
     <w:tmpl w:val="1664374C"/>
@@ -28675,7 +29193,7 @@
       </w:pPr>
     </w:lvl>
   </w:abstractNum>
-  <w:abstractNum w:abstractNumId="77" w15:restartNumberingAfterBreak="0">
+  <w:abstractNum w:abstractNumId="79" w15:restartNumberingAfterBreak="0">
     <w:nsid w:val="470F5A95"/>
     <w:multiLevelType w:val="hybridMultilevel"/>
     <w:tmpl w:val="D2E4276C"/>
@@ -28761,7 +29279,7 @@
       </w:pPr>
     </w:lvl>
   </w:abstractNum>
-  <w:abstractNum w:abstractNumId="78" w15:restartNumberingAfterBreak="0">
+  <w:abstractNum w:abstractNumId="80" w15:restartNumberingAfterBreak="0">
     <w:nsid w:val="47235797"/>
     <w:multiLevelType w:val="hybridMultilevel"/>
     <w:tmpl w:val="2B0CEE0E"/>
@@ -28847,7 +29365,7 @@
       </w:pPr>
     </w:lvl>
   </w:abstractNum>
-  <w:abstractNum w:abstractNumId="79" w15:restartNumberingAfterBreak="0">
+  <w:abstractNum w:abstractNumId="81" w15:restartNumberingAfterBreak="0">
     <w:nsid w:val="47AD0C17"/>
     <w:multiLevelType w:val="hybridMultilevel"/>
     <w:tmpl w:val="2CA89B3C"/>
@@ -28933,7 +29451,7 @@
       </w:pPr>
     </w:lvl>
   </w:abstractNum>
-  <w:abstractNum w:abstractNumId="80" w15:restartNumberingAfterBreak="0">
+  <w:abstractNum w:abstractNumId="82" w15:restartNumberingAfterBreak="0">
     <w:nsid w:val="49382B5B"/>
     <w:multiLevelType w:val="hybridMultilevel"/>
     <w:tmpl w:val="4B9AAC54"/>
@@ -29022,7 +29540,7 @@
       </w:pPr>
     </w:lvl>
   </w:abstractNum>
-  <w:abstractNum w:abstractNumId="81" w15:restartNumberingAfterBreak="0">
+  <w:abstractNum w:abstractNumId="83" w15:restartNumberingAfterBreak="0">
     <w:nsid w:val="497309FA"/>
     <w:multiLevelType w:val="hybridMultilevel"/>
     <w:tmpl w:val="B9AA2312"/>
@@ -29108,7 +29626,7 @@
       </w:pPr>
     </w:lvl>
   </w:abstractNum>
-  <w:abstractNum w:abstractNumId="82" w15:restartNumberingAfterBreak="0">
+  <w:abstractNum w:abstractNumId="84" w15:restartNumberingAfterBreak="0">
     <w:nsid w:val="49EA5515"/>
     <w:multiLevelType w:val="hybridMultilevel"/>
     <w:tmpl w:val="237CD6DC"/>
@@ -29197,7 +29715,7 @@
       </w:pPr>
     </w:lvl>
   </w:abstractNum>
-  <w:abstractNum w:abstractNumId="83" w15:restartNumberingAfterBreak="0">
+  <w:abstractNum w:abstractNumId="85" w15:restartNumberingAfterBreak="0">
     <w:nsid w:val="49F8744D"/>
     <w:multiLevelType w:val="hybridMultilevel"/>
     <w:tmpl w:val="F7A05594"/>
@@ -29283,7 +29801,7 @@
       </w:pPr>
     </w:lvl>
   </w:abstractNum>
-  <w:abstractNum w:abstractNumId="84" w15:restartNumberingAfterBreak="0">
+  <w:abstractNum w:abstractNumId="86" w15:restartNumberingAfterBreak="0">
     <w:nsid w:val="4A3475DC"/>
     <w:multiLevelType w:val="hybridMultilevel"/>
     <w:tmpl w:val="DC4CDF8C"/>
@@ -29369,7 +29887,7 @@
       </w:pPr>
     </w:lvl>
   </w:abstractNum>
-  <w:abstractNum w:abstractNumId="85" w15:restartNumberingAfterBreak="0">
+  <w:abstractNum w:abstractNumId="87" w15:restartNumberingAfterBreak="0">
     <w:nsid w:val="4A7647F2"/>
     <w:multiLevelType w:val="hybridMultilevel"/>
     <w:tmpl w:val="B4163748"/>
@@ -29455,7 +29973,7 @@
       </w:pPr>
     </w:lvl>
   </w:abstractNum>
-  <w:abstractNum w:abstractNumId="86" w15:restartNumberingAfterBreak="0">
+  <w:abstractNum w:abstractNumId="88" w15:restartNumberingAfterBreak="0">
     <w:nsid w:val="4A974545"/>
     <w:multiLevelType w:val="multilevel"/>
     <w:tmpl w:val="A7B68454"/>
@@ -29575,7 +30093,7 @@
       </w:rPr>
     </w:lvl>
   </w:abstractNum>
-  <w:abstractNum w:abstractNumId="87" w15:restartNumberingAfterBreak="0">
+  <w:abstractNum w:abstractNumId="89" w15:restartNumberingAfterBreak="0">
     <w:nsid w:val="4EC178C4"/>
     <w:multiLevelType w:val="hybridMultilevel"/>
     <w:tmpl w:val="87EE415C"/>
@@ -29661,7 +30179,7 @@
       </w:pPr>
     </w:lvl>
   </w:abstractNum>
-  <w:abstractNum w:abstractNumId="88" w15:restartNumberingAfterBreak="0">
+  <w:abstractNum w:abstractNumId="90" w15:restartNumberingAfterBreak="0">
     <w:nsid w:val="4EE90446"/>
     <w:multiLevelType w:val="hybridMultilevel"/>
     <w:tmpl w:val="22EE8736"/>
@@ -29774,7 +30292,7 @@
       </w:rPr>
     </w:lvl>
   </w:abstractNum>
-  <w:abstractNum w:abstractNumId="89" w15:restartNumberingAfterBreak="0">
+  <w:abstractNum w:abstractNumId="91" w15:restartNumberingAfterBreak="0">
     <w:nsid w:val="4EF42827"/>
     <w:multiLevelType w:val="hybridMultilevel"/>
     <w:tmpl w:val="56A0D1E2"/>
@@ -29860,7 +30378,7 @@
       </w:pPr>
     </w:lvl>
   </w:abstractNum>
-  <w:abstractNum w:abstractNumId="90" w15:restartNumberingAfterBreak="0">
+  <w:abstractNum w:abstractNumId="92" w15:restartNumberingAfterBreak="0">
     <w:nsid w:val="4F070D52"/>
     <w:multiLevelType w:val="hybridMultilevel"/>
     <w:tmpl w:val="71E286D4"/>
@@ -29946,7 +30464,7 @@
       </w:pPr>
     </w:lvl>
   </w:abstractNum>
-  <w:abstractNum w:abstractNumId="91" w15:restartNumberingAfterBreak="0">
+  <w:abstractNum w:abstractNumId="93" w15:restartNumberingAfterBreak="0">
     <w:nsid w:val="50A458C7"/>
     <w:multiLevelType w:val="hybridMultilevel"/>
     <w:tmpl w:val="40BCF09E"/>
@@ -30032,7 +30550,7 @@
       </w:pPr>
     </w:lvl>
   </w:abstractNum>
-  <w:abstractNum w:abstractNumId="92" w15:restartNumberingAfterBreak="0">
+  <w:abstractNum w:abstractNumId="94" w15:restartNumberingAfterBreak="0">
     <w:nsid w:val="5388625B"/>
     <w:multiLevelType w:val="hybridMultilevel"/>
     <w:tmpl w:val="EF66C28A"/>
@@ -30118,7 +30636,7 @@
       </w:pPr>
     </w:lvl>
   </w:abstractNum>
-  <w:abstractNum w:abstractNumId="93" w15:restartNumberingAfterBreak="0">
+  <w:abstractNum w:abstractNumId="95" w15:restartNumberingAfterBreak="0">
     <w:nsid w:val="54091A35"/>
     <w:multiLevelType w:val="hybridMultilevel"/>
     <w:tmpl w:val="0F2672CC"/>
@@ -30231,7 +30749,7 @@
       </w:rPr>
     </w:lvl>
   </w:abstractNum>
-  <w:abstractNum w:abstractNumId="94" w15:restartNumberingAfterBreak="0">
+  <w:abstractNum w:abstractNumId="96" w15:restartNumberingAfterBreak="0">
     <w:nsid w:val="54D23A4B"/>
     <w:multiLevelType w:val="hybridMultilevel"/>
     <w:tmpl w:val="4B9AAC54"/>
@@ -30320,7 +30838,7 @@
       </w:pPr>
     </w:lvl>
   </w:abstractNum>
-  <w:abstractNum w:abstractNumId="95" w15:restartNumberingAfterBreak="0">
+  <w:abstractNum w:abstractNumId="97" w15:restartNumberingAfterBreak="0">
     <w:nsid w:val="557418B7"/>
     <w:multiLevelType w:val="hybridMultilevel"/>
     <w:tmpl w:val="C7C2DF34"/>
@@ -30406,7 +30924,7 @@
       </w:pPr>
     </w:lvl>
   </w:abstractNum>
-  <w:abstractNum w:abstractNumId="96" w15:restartNumberingAfterBreak="0">
+  <w:abstractNum w:abstractNumId="98" w15:restartNumberingAfterBreak="0">
     <w:nsid w:val="55CB06CA"/>
     <w:multiLevelType w:val="hybridMultilevel"/>
     <w:tmpl w:val="FF62D6D4"/>
@@ -30492,7 +31010,7 @@
       </w:pPr>
     </w:lvl>
   </w:abstractNum>
-  <w:abstractNum w:abstractNumId="97" w15:restartNumberingAfterBreak="0">
+  <w:abstractNum w:abstractNumId="99" w15:restartNumberingAfterBreak="0">
     <w:nsid w:val="562F16FC"/>
     <w:multiLevelType w:val="hybridMultilevel"/>
     <w:tmpl w:val="E352403E"/>
@@ -30578,7 +31096,7 @@
       </w:pPr>
     </w:lvl>
   </w:abstractNum>
-  <w:abstractNum w:abstractNumId="98" w15:restartNumberingAfterBreak="0">
+  <w:abstractNum w:abstractNumId="100" w15:restartNumberingAfterBreak="0">
     <w:nsid w:val="574838B0"/>
     <w:multiLevelType w:val="hybridMultilevel"/>
     <w:tmpl w:val="DFF447BC"/>
@@ -30664,7 +31182,7 @@
       </w:pPr>
     </w:lvl>
   </w:abstractNum>
-  <w:abstractNum w:abstractNumId="99" w15:restartNumberingAfterBreak="0">
+  <w:abstractNum w:abstractNumId="101" w15:restartNumberingAfterBreak="0">
     <w:nsid w:val="57830B85"/>
     <w:multiLevelType w:val="hybridMultilevel"/>
     <w:tmpl w:val="198A4D4E"/>
@@ -30750,7 +31268,7 @@
       </w:pPr>
     </w:lvl>
   </w:abstractNum>
-  <w:abstractNum w:abstractNumId="100" w15:restartNumberingAfterBreak="0">
+  <w:abstractNum w:abstractNumId="102" w15:restartNumberingAfterBreak="0">
     <w:nsid w:val="59C76ED1"/>
     <w:multiLevelType w:val="hybridMultilevel"/>
     <w:tmpl w:val="4796AAC4"/>
@@ -30836,7 +31354,7 @@
       </w:pPr>
     </w:lvl>
   </w:abstractNum>
-  <w:abstractNum w:abstractNumId="101" w15:restartNumberingAfterBreak="0">
+  <w:abstractNum w:abstractNumId="103" w15:restartNumberingAfterBreak="0">
     <w:nsid w:val="5AD2677B"/>
     <w:multiLevelType w:val="multilevel"/>
     <w:tmpl w:val="7FB0E9DA"/>
@@ -30950,7 +31468,7 @@
       </w:rPr>
     </w:lvl>
   </w:abstractNum>
-  <w:abstractNum w:abstractNumId="102" w15:restartNumberingAfterBreak="0">
+  <w:abstractNum w:abstractNumId="104" w15:restartNumberingAfterBreak="0">
     <w:nsid w:val="5B9B0F71"/>
     <w:multiLevelType w:val="hybridMultilevel"/>
     <w:tmpl w:val="0FB88C34"/>
@@ -31036,7 +31554,7 @@
       </w:pPr>
     </w:lvl>
   </w:abstractNum>
-  <w:abstractNum w:abstractNumId="103" w15:restartNumberingAfterBreak="0">
+  <w:abstractNum w:abstractNumId="105" w15:restartNumberingAfterBreak="0">
     <w:nsid w:val="5CF9180C"/>
     <w:multiLevelType w:val="hybridMultilevel"/>
     <w:tmpl w:val="A2B231D6"/>
@@ -31122,7 +31640,7 @@
       </w:pPr>
     </w:lvl>
   </w:abstractNum>
-  <w:abstractNum w:abstractNumId="104" w15:restartNumberingAfterBreak="0">
+  <w:abstractNum w:abstractNumId="106" w15:restartNumberingAfterBreak="0">
     <w:nsid w:val="5EB042C1"/>
     <w:multiLevelType w:val="hybridMultilevel"/>
     <w:tmpl w:val="709CB084"/>
@@ -31235,7 +31753,7 @@
       </w:rPr>
     </w:lvl>
   </w:abstractNum>
-  <w:abstractNum w:abstractNumId="105" w15:restartNumberingAfterBreak="0">
+  <w:abstractNum w:abstractNumId="107" w15:restartNumberingAfterBreak="0">
     <w:nsid w:val="5EB769F1"/>
     <w:multiLevelType w:val="hybridMultilevel"/>
     <w:tmpl w:val="14AC6F0C"/>
@@ -31321,7 +31839,7 @@
       </w:pPr>
     </w:lvl>
   </w:abstractNum>
-  <w:abstractNum w:abstractNumId="106" w15:restartNumberingAfterBreak="0">
+  <w:abstractNum w:abstractNumId="108" w15:restartNumberingAfterBreak="0">
     <w:nsid w:val="5ED14F56"/>
     <w:multiLevelType w:val="hybridMultilevel"/>
     <w:tmpl w:val="97286C8C"/>
@@ -31410,7 +31928,7 @@
       </w:pPr>
     </w:lvl>
   </w:abstractNum>
-  <w:abstractNum w:abstractNumId="107" w15:restartNumberingAfterBreak="0">
+  <w:abstractNum w:abstractNumId="109" w15:restartNumberingAfterBreak="0">
     <w:nsid w:val="5F187894"/>
     <w:multiLevelType w:val="hybridMultilevel"/>
     <w:tmpl w:val="5AD88F06"/>
@@ -31496,7 +32014,7 @@
       </w:pPr>
     </w:lvl>
   </w:abstractNum>
-  <w:abstractNum w:abstractNumId="108" w15:restartNumberingAfterBreak="0">
+  <w:abstractNum w:abstractNumId="110" w15:restartNumberingAfterBreak="0">
     <w:nsid w:val="5F532FAF"/>
     <w:multiLevelType w:val="hybridMultilevel"/>
     <w:tmpl w:val="095EB1D2"/>
@@ -31582,7 +32100,7 @@
       </w:pPr>
     </w:lvl>
   </w:abstractNum>
-  <w:abstractNum w:abstractNumId="109" w15:restartNumberingAfterBreak="0">
+  <w:abstractNum w:abstractNumId="111" w15:restartNumberingAfterBreak="0">
     <w:nsid w:val="610D7AB3"/>
     <w:multiLevelType w:val="hybridMultilevel"/>
     <w:tmpl w:val="A74C93A8"/>
@@ -31668,7 +32186,7 @@
       </w:pPr>
     </w:lvl>
   </w:abstractNum>
-  <w:abstractNum w:abstractNumId="110" w15:restartNumberingAfterBreak="0">
+  <w:abstractNum w:abstractNumId="112" w15:restartNumberingAfterBreak="0">
     <w:nsid w:val="640B427E"/>
     <w:multiLevelType w:val="hybridMultilevel"/>
     <w:tmpl w:val="53EAC12C"/>
@@ -31754,7 +32272,7 @@
       </w:pPr>
     </w:lvl>
   </w:abstractNum>
-  <w:abstractNum w:abstractNumId="111" w15:restartNumberingAfterBreak="0">
+  <w:abstractNum w:abstractNumId="113" w15:restartNumberingAfterBreak="0">
     <w:nsid w:val="647F37FD"/>
     <w:multiLevelType w:val="hybridMultilevel"/>
     <w:tmpl w:val="6DACEA8E"/>
@@ -31840,7 +32358,7 @@
       </w:pPr>
     </w:lvl>
   </w:abstractNum>
-  <w:abstractNum w:abstractNumId="112" w15:restartNumberingAfterBreak="0">
+  <w:abstractNum w:abstractNumId="114" w15:restartNumberingAfterBreak="0">
     <w:nsid w:val="657F1144"/>
     <w:multiLevelType w:val="hybridMultilevel"/>
     <w:tmpl w:val="03148084"/>
@@ -31926,7 +32444,7 @@
       </w:pPr>
     </w:lvl>
   </w:abstractNum>
-  <w:abstractNum w:abstractNumId="113" w15:restartNumberingAfterBreak="0">
+  <w:abstractNum w:abstractNumId="115" w15:restartNumberingAfterBreak="0">
     <w:nsid w:val="65F2421C"/>
     <w:multiLevelType w:val="hybridMultilevel"/>
     <w:tmpl w:val="DC4CDF8C"/>
@@ -32012,7 +32530,7 @@
       </w:pPr>
     </w:lvl>
   </w:abstractNum>
-  <w:abstractNum w:abstractNumId="114" w15:restartNumberingAfterBreak="0">
+  <w:abstractNum w:abstractNumId="116" w15:restartNumberingAfterBreak="0">
     <w:nsid w:val="669F3642"/>
     <w:multiLevelType w:val="hybridMultilevel"/>
     <w:tmpl w:val="BE9AB696"/>
@@ -32098,7 +32616,7 @@
       </w:pPr>
     </w:lvl>
   </w:abstractNum>
-  <w:abstractNum w:abstractNumId="115" w15:restartNumberingAfterBreak="0">
+  <w:abstractNum w:abstractNumId="117" w15:restartNumberingAfterBreak="0">
     <w:nsid w:val="67F62797"/>
     <w:multiLevelType w:val="hybridMultilevel"/>
     <w:tmpl w:val="3B46462A"/>
@@ -32187,7 +32705,7 @@
       </w:pPr>
     </w:lvl>
   </w:abstractNum>
-  <w:abstractNum w:abstractNumId="116" w15:restartNumberingAfterBreak="0">
+  <w:abstractNum w:abstractNumId="118" w15:restartNumberingAfterBreak="0">
     <w:nsid w:val="68303C08"/>
     <w:multiLevelType w:val="multilevel"/>
     <w:tmpl w:val="FB8E42D6"/>
@@ -32300,7 +32818,7 @@
       </w:rPr>
     </w:lvl>
   </w:abstractNum>
-  <w:abstractNum w:abstractNumId="117" w15:restartNumberingAfterBreak="0">
+  <w:abstractNum w:abstractNumId="119" w15:restartNumberingAfterBreak="0">
     <w:nsid w:val="68B077E3"/>
     <w:multiLevelType w:val="hybridMultilevel"/>
     <w:tmpl w:val="FE84B984"/>
@@ -32413,7 +32931,7 @@
       </w:rPr>
     </w:lvl>
   </w:abstractNum>
-  <w:abstractNum w:abstractNumId="118" w15:restartNumberingAfterBreak="0">
+  <w:abstractNum w:abstractNumId="120" w15:restartNumberingAfterBreak="0">
     <w:nsid w:val="6A6A39DD"/>
     <w:multiLevelType w:val="hybridMultilevel"/>
     <w:tmpl w:val="215C11FC"/>
@@ -32499,7 +33017,7 @@
       </w:pPr>
     </w:lvl>
   </w:abstractNum>
-  <w:abstractNum w:abstractNumId="119" w15:restartNumberingAfterBreak="0">
+  <w:abstractNum w:abstractNumId="121" w15:restartNumberingAfterBreak="0">
     <w:nsid w:val="6CC515EB"/>
     <w:multiLevelType w:val="hybridMultilevel"/>
     <w:tmpl w:val="05247A10"/>
@@ -32612,7 +33130,7 @@
       </w:rPr>
     </w:lvl>
   </w:abstractNum>
-  <w:abstractNum w:abstractNumId="120" w15:restartNumberingAfterBreak="0">
+  <w:abstractNum w:abstractNumId="122" w15:restartNumberingAfterBreak="0">
     <w:nsid w:val="6D551FD7"/>
     <w:multiLevelType w:val="hybridMultilevel"/>
     <w:tmpl w:val="8920F0B8"/>
@@ -32698,7 +33216,7 @@
       </w:pPr>
     </w:lvl>
   </w:abstractNum>
-  <w:abstractNum w:abstractNumId="121" w15:restartNumberingAfterBreak="0">
+  <w:abstractNum w:abstractNumId="123" w15:restartNumberingAfterBreak="0">
     <w:nsid w:val="6DF35189"/>
     <w:multiLevelType w:val="hybridMultilevel"/>
     <w:tmpl w:val="49884FC8"/>
@@ -32787,7 +33305,7 @@
       </w:pPr>
     </w:lvl>
   </w:abstractNum>
-  <w:abstractNum w:abstractNumId="122" w15:restartNumberingAfterBreak="0">
+  <w:abstractNum w:abstractNumId="124" w15:restartNumberingAfterBreak="0">
     <w:nsid w:val="6E42254F"/>
     <w:multiLevelType w:val="hybridMultilevel"/>
     <w:tmpl w:val="E04A134C"/>
@@ -32900,7 +33418,7 @@
       </w:rPr>
     </w:lvl>
   </w:abstractNum>
-  <w:abstractNum w:abstractNumId="123" w15:restartNumberingAfterBreak="0">
+  <w:abstractNum w:abstractNumId="125" w15:restartNumberingAfterBreak="0">
     <w:nsid w:val="71297023"/>
     <w:multiLevelType w:val="hybridMultilevel"/>
     <w:tmpl w:val="04FEBF50"/>
@@ -32986,7 +33504,7 @@
       </w:pPr>
     </w:lvl>
   </w:abstractNum>
-  <w:abstractNum w:abstractNumId="124" w15:restartNumberingAfterBreak="0">
+  <w:abstractNum w:abstractNumId="126" w15:restartNumberingAfterBreak="0">
     <w:nsid w:val="713830B8"/>
     <w:multiLevelType w:val="multilevel"/>
     <w:tmpl w:val="89A4D122"/>
@@ -33099,7 +33617,7 @@
       </w:rPr>
     </w:lvl>
   </w:abstractNum>
-  <w:abstractNum w:abstractNumId="125" w15:restartNumberingAfterBreak="0">
+  <w:abstractNum w:abstractNumId="127" w15:restartNumberingAfterBreak="0">
     <w:nsid w:val="733A35BA"/>
     <w:multiLevelType w:val="hybridMultilevel"/>
     <w:tmpl w:val="A74C93A8"/>
@@ -33185,7 +33703,7 @@
       </w:pPr>
     </w:lvl>
   </w:abstractNum>
-  <w:abstractNum w:abstractNumId="126" w15:restartNumberingAfterBreak="0">
+  <w:abstractNum w:abstractNumId="128" w15:restartNumberingAfterBreak="0">
     <w:nsid w:val="737363D6"/>
     <w:multiLevelType w:val="hybridMultilevel"/>
     <w:tmpl w:val="D5EEA2A6"/>
@@ -33271,7 +33789,7 @@
       </w:pPr>
     </w:lvl>
   </w:abstractNum>
-  <w:abstractNum w:abstractNumId="127" w15:restartNumberingAfterBreak="0">
+  <w:abstractNum w:abstractNumId="129" w15:restartNumberingAfterBreak="0">
     <w:nsid w:val="742E6740"/>
     <w:multiLevelType w:val="hybridMultilevel"/>
     <w:tmpl w:val="71E286D4"/>
@@ -33357,7 +33875,7 @@
       </w:pPr>
     </w:lvl>
   </w:abstractNum>
-  <w:abstractNum w:abstractNumId="128" w15:restartNumberingAfterBreak="0">
+  <w:abstractNum w:abstractNumId="130" w15:restartNumberingAfterBreak="0">
     <w:nsid w:val="759E73C5"/>
     <w:multiLevelType w:val="hybridMultilevel"/>
     <w:tmpl w:val="F13053C4"/>
@@ -33443,7 +33961,7 @@
       </w:pPr>
     </w:lvl>
   </w:abstractNum>
-  <w:abstractNum w:abstractNumId="129" w15:restartNumberingAfterBreak="0">
+  <w:abstractNum w:abstractNumId="131" w15:restartNumberingAfterBreak="0">
     <w:nsid w:val="76E860F8"/>
     <w:multiLevelType w:val="multilevel"/>
     <w:tmpl w:val="49D4AF66"/>
@@ -33558,7 +34076,7 @@
       </w:rPr>
     </w:lvl>
   </w:abstractNum>
-  <w:abstractNum w:abstractNumId="130" w15:restartNumberingAfterBreak="0">
+  <w:abstractNum w:abstractNumId="132" w15:restartNumberingAfterBreak="0">
     <w:nsid w:val="77886ACF"/>
     <w:multiLevelType w:val="hybridMultilevel"/>
     <w:tmpl w:val="C05AD402"/>
@@ -33644,7 +34162,7 @@
       </w:pPr>
     </w:lvl>
   </w:abstractNum>
-  <w:abstractNum w:abstractNumId="131" w15:restartNumberingAfterBreak="0">
+  <w:abstractNum w:abstractNumId="133" w15:restartNumberingAfterBreak="0">
     <w:nsid w:val="79E9317C"/>
     <w:multiLevelType w:val="hybridMultilevel"/>
     <w:tmpl w:val="522CBB4C"/>
@@ -33757,7 +34275,7 @@
       </w:rPr>
     </w:lvl>
   </w:abstractNum>
-  <w:abstractNum w:abstractNumId="132" w15:restartNumberingAfterBreak="0">
+  <w:abstractNum w:abstractNumId="134" w15:restartNumberingAfterBreak="0">
     <w:nsid w:val="7B400D17"/>
     <w:multiLevelType w:val="hybridMultilevel"/>
     <w:tmpl w:val="D5442D82"/>
@@ -33843,7 +34361,7 @@
       </w:pPr>
     </w:lvl>
   </w:abstractNum>
-  <w:abstractNum w:abstractNumId="133" w15:restartNumberingAfterBreak="0">
+  <w:abstractNum w:abstractNumId="135" w15:restartNumberingAfterBreak="0">
     <w:nsid w:val="7BA81EC7"/>
     <w:multiLevelType w:val="hybridMultilevel"/>
     <w:tmpl w:val="E3CEE5FC"/>
@@ -33929,7 +34447,7 @@
       </w:pPr>
     </w:lvl>
   </w:abstractNum>
-  <w:abstractNum w:abstractNumId="134" w15:restartNumberingAfterBreak="0">
+  <w:abstractNum w:abstractNumId="136" w15:restartNumberingAfterBreak="0">
     <w:nsid w:val="7C715C3C"/>
     <w:multiLevelType w:val="hybridMultilevel"/>
     <w:tmpl w:val="9CF4D138"/>
@@ -34015,7 +34533,7 @@
       </w:pPr>
     </w:lvl>
   </w:abstractNum>
-  <w:abstractNum w:abstractNumId="135" w15:restartNumberingAfterBreak="0">
+  <w:abstractNum w:abstractNumId="137" w15:restartNumberingAfterBreak="0">
     <w:nsid w:val="7D306548"/>
     <w:multiLevelType w:val="hybridMultilevel"/>
     <w:tmpl w:val="93721EE0"/>
@@ -34101,7 +34619,7 @@
       </w:pPr>
     </w:lvl>
   </w:abstractNum>
-  <w:abstractNum w:abstractNumId="136" w15:restartNumberingAfterBreak="0">
+  <w:abstractNum w:abstractNumId="138" w15:restartNumberingAfterBreak="0">
     <w:nsid w:val="7E5E3972"/>
     <w:multiLevelType w:val="hybridMultilevel"/>
     <w:tmpl w:val="208AB6B6"/>
@@ -34214,7 +34732,7 @@
       </w:rPr>
     </w:lvl>
   </w:abstractNum>
-  <w:abstractNum w:abstractNumId="137" w15:restartNumberingAfterBreak="0">
+  <w:abstractNum w:abstractNumId="139" w15:restartNumberingAfterBreak="0">
     <w:nsid w:val="7F4E263E"/>
     <w:multiLevelType w:val="hybridMultilevel"/>
     <w:tmpl w:val="DC4CDF8C"/>
@@ -34301,85 +34819,85 @@
     </w:lvl>
   </w:abstractNum>
   <w:num w:numId="1" w16cid:durableId="1169441479">
-    <w:abstractNumId w:val="136"/>
+    <w:abstractNumId w:val="138"/>
   </w:num>
   <w:num w:numId="2" w16cid:durableId="1224488658">
-    <w:abstractNumId w:val="86"/>
+    <w:abstractNumId w:val="88"/>
   </w:num>
   <w:num w:numId="3" w16cid:durableId="367610968">
+    <w:abstractNumId w:val="61"/>
+  </w:num>
+  <w:num w:numId="4" w16cid:durableId="1672872309">
+    <w:abstractNumId w:val="133"/>
+  </w:num>
+  <w:num w:numId="5" w16cid:durableId="312216491">
+    <w:abstractNumId w:val="103"/>
+  </w:num>
+  <w:num w:numId="6" w16cid:durableId="1648365566">
+    <w:abstractNumId w:val="29"/>
+  </w:num>
+  <w:num w:numId="7" w16cid:durableId="616765277">
+    <w:abstractNumId w:val="32"/>
+  </w:num>
+  <w:num w:numId="8" w16cid:durableId="308635608">
+    <w:abstractNumId w:val="128"/>
+  </w:num>
+  <w:num w:numId="9" w16cid:durableId="578248999">
     <w:abstractNumId w:val="59"/>
   </w:num>
-  <w:num w:numId="4" w16cid:durableId="1672872309">
-    <w:abstractNumId w:val="131"/>
+  <w:num w:numId="10" w16cid:durableId="1693875659">
+    <w:abstractNumId w:val="5"/>
   </w:num>
-  <w:num w:numId="5" w16cid:durableId="312216491">
-    <w:abstractNumId w:val="101"/>
+  <w:num w:numId="11" w16cid:durableId="614680718">
+    <w:abstractNumId w:val="22"/>
   </w:num>
-  <w:num w:numId="6" w16cid:durableId="1648365566">
-    <w:abstractNumId w:val="27"/>
+  <w:num w:numId="12" w16cid:durableId="955258897">
+    <w:abstractNumId w:val="95"/>
   </w:num>
-  <w:num w:numId="7" w16cid:durableId="616765277">
+  <w:num w:numId="13" w16cid:durableId="63797138">
+    <w:abstractNumId w:val="127"/>
+  </w:num>
+  <w:num w:numId="14" w16cid:durableId="3755019">
+    <w:abstractNumId w:val="6"/>
+  </w:num>
+  <w:num w:numId="15" w16cid:durableId="13117400">
+    <w:abstractNumId w:val="111"/>
+  </w:num>
+  <w:num w:numId="16" w16cid:durableId="1245187564">
+    <w:abstractNumId w:val="102"/>
+  </w:num>
+  <w:num w:numId="17" w16cid:durableId="1123962075">
+    <w:abstractNumId w:val="91"/>
+  </w:num>
+  <w:num w:numId="18" w16cid:durableId="1077478397">
+    <w:abstractNumId w:val="71"/>
+  </w:num>
+  <w:num w:numId="19" w16cid:durableId="876116031">
     <w:abstractNumId w:val="30"/>
   </w:num>
-  <w:num w:numId="8" w16cid:durableId="308635608">
-    <w:abstractNumId w:val="126"/>
-  </w:num>
-  <w:num w:numId="9" w16cid:durableId="578248999">
-    <w:abstractNumId w:val="57"/>
-  </w:num>
-  <w:num w:numId="10" w16cid:durableId="1693875659">
-    <w:abstractNumId w:val="4"/>
-  </w:num>
-  <w:num w:numId="11" w16cid:durableId="614680718">
-    <w:abstractNumId w:val="20"/>
-  </w:num>
-  <w:num w:numId="12" w16cid:durableId="955258897">
-    <w:abstractNumId w:val="93"/>
-  </w:num>
-  <w:num w:numId="13" w16cid:durableId="63797138">
-    <w:abstractNumId w:val="125"/>
-  </w:num>
-  <w:num w:numId="14" w16cid:durableId="3755019">
-    <w:abstractNumId w:val="5"/>
-  </w:num>
-  <w:num w:numId="15" w16cid:durableId="13117400">
-    <w:abstractNumId w:val="109"/>
-  </w:num>
-  <w:num w:numId="16" w16cid:durableId="1245187564">
-    <w:abstractNumId w:val="100"/>
-  </w:num>
-  <w:num w:numId="17" w16cid:durableId="1123962075">
-    <w:abstractNumId w:val="89"/>
-  </w:num>
-  <w:num w:numId="18" w16cid:durableId="1077478397">
-    <w:abstractNumId w:val="69"/>
-  </w:num>
-  <w:num w:numId="19" w16cid:durableId="876116031">
-    <w:abstractNumId w:val="28"/>
-  </w:num>
   <w:num w:numId="20" w16cid:durableId="1483736930">
-    <w:abstractNumId w:val="62"/>
+    <w:abstractNumId w:val="64"/>
   </w:num>
   <w:num w:numId="21" w16cid:durableId="1531718874">
+    <w:abstractNumId w:val="124"/>
+  </w:num>
+  <w:num w:numId="22" w16cid:durableId="1607731165">
+    <w:abstractNumId w:val="65"/>
+  </w:num>
+  <w:num w:numId="23" w16cid:durableId="1384409685">
+    <w:abstractNumId w:val="34"/>
+  </w:num>
+  <w:num w:numId="24" w16cid:durableId="400953851">
+    <w:abstractNumId w:val="19"/>
+  </w:num>
+  <w:num w:numId="25" w16cid:durableId="2124179503">
+    <w:abstractNumId w:val="123"/>
+  </w:num>
+  <w:num w:numId="26" w16cid:durableId="627975122">
     <w:abstractNumId w:val="122"/>
   </w:num>
-  <w:num w:numId="22" w16cid:durableId="1607731165">
-    <w:abstractNumId w:val="63"/>
-  </w:num>
-  <w:num w:numId="23" w16cid:durableId="1384409685">
-    <w:abstractNumId w:val="32"/>
-  </w:num>
-  <w:num w:numId="24" w16cid:durableId="400953851">
-    <w:abstractNumId w:val="17"/>
-  </w:num>
-  <w:num w:numId="25" w16cid:durableId="2124179503">
-    <w:abstractNumId w:val="121"/>
-  </w:num>
-  <w:num w:numId="26" w16cid:durableId="627975122">
-    <w:abstractNumId w:val="120"/>
-  </w:num>
   <w:num w:numId="27" w16cid:durableId="544953491">
-    <w:abstractNumId w:val="124"/>
+    <w:abstractNumId w:val="126"/>
     <w:lvlOverride w:ilvl="0">
       <w:startOverride w:val="1"/>
     </w:lvlOverride>
@@ -34409,7 +34927,7 @@
     </w:lvlOverride>
   </w:num>
   <w:num w:numId="28" w16cid:durableId="976953244">
-    <w:abstractNumId w:val="124"/>
+    <w:abstractNumId w:val="126"/>
     <w:lvlOverride w:ilvl="0">
       <w:lvl w:ilvl="0">
         <w:start w:val="1"/>
@@ -34538,19 +35056,19 @@
     </w:lvlOverride>
   </w:num>
   <w:num w:numId="29" w16cid:durableId="838733075">
-    <w:abstractNumId w:val="124"/>
+    <w:abstractNumId w:val="126"/>
   </w:num>
   <w:num w:numId="30" w16cid:durableId="959799532">
-    <w:abstractNumId w:val="64"/>
+    <w:abstractNumId w:val="66"/>
   </w:num>
   <w:num w:numId="31" w16cid:durableId="383333748">
-    <w:abstractNumId w:val="81"/>
+    <w:abstractNumId w:val="83"/>
   </w:num>
   <w:num w:numId="32" w16cid:durableId="1406218275">
-    <w:abstractNumId w:val="133"/>
+    <w:abstractNumId w:val="135"/>
   </w:num>
   <w:num w:numId="33" w16cid:durableId="1631126602">
-    <w:abstractNumId w:val="124"/>
+    <w:abstractNumId w:val="126"/>
     <w:lvlOverride w:ilvl="0">
       <w:startOverride w:val="1"/>
       <w:lvl w:ilvl="0">
@@ -34688,19 +35206,19 @@
     </w:lvlOverride>
   </w:num>
   <w:num w:numId="34" w16cid:durableId="1561749603">
-    <w:abstractNumId w:val="48"/>
+    <w:abstractNumId w:val="50"/>
   </w:num>
   <w:num w:numId="35" w16cid:durableId="1719283007">
-    <w:abstractNumId w:val="42"/>
+    <w:abstractNumId w:val="44"/>
   </w:num>
   <w:num w:numId="36" w16cid:durableId="292760641">
-    <w:abstractNumId w:val="97"/>
+    <w:abstractNumId w:val="99"/>
   </w:num>
   <w:num w:numId="37" w16cid:durableId="46728653">
-    <w:abstractNumId w:val="14"/>
+    <w:abstractNumId w:val="16"/>
   </w:num>
   <w:num w:numId="38" w16cid:durableId="1608267567">
-    <w:abstractNumId w:val="124"/>
+    <w:abstractNumId w:val="126"/>
     <w:lvlOverride w:ilvl="0">
       <w:startOverride w:val="1"/>
     </w:lvlOverride>
@@ -34730,46 +35248,46 @@
     </w:lvlOverride>
   </w:num>
   <w:num w:numId="39" w16cid:durableId="1378046198">
-    <w:abstractNumId w:val="52"/>
+    <w:abstractNumId w:val="54"/>
   </w:num>
   <w:num w:numId="40" w16cid:durableId="992412021">
-    <w:abstractNumId w:val="38"/>
+    <w:abstractNumId w:val="40"/>
   </w:num>
   <w:num w:numId="41" w16cid:durableId="559705852">
-    <w:abstractNumId w:val="51"/>
+    <w:abstractNumId w:val="53"/>
   </w:num>
   <w:num w:numId="42" w16cid:durableId="379548987">
-    <w:abstractNumId w:val="18"/>
+    <w:abstractNumId w:val="20"/>
   </w:num>
   <w:num w:numId="43" w16cid:durableId="529344989">
-    <w:abstractNumId w:val="116"/>
+    <w:abstractNumId w:val="118"/>
   </w:num>
   <w:num w:numId="44" w16cid:durableId="746462521">
-    <w:abstractNumId w:val="29"/>
+    <w:abstractNumId w:val="31"/>
   </w:num>
   <w:num w:numId="45" w16cid:durableId="1487937325">
-    <w:abstractNumId w:val="10"/>
+    <w:abstractNumId w:val="12"/>
   </w:num>
   <w:num w:numId="46" w16cid:durableId="905070205">
-    <w:abstractNumId w:val="82"/>
+    <w:abstractNumId w:val="84"/>
   </w:num>
   <w:num w:numId="47" w16cid:durableId="2110805660">
-    <w:abstractNumId w:val="111"/>
+    <w:abstractNumId w:val="113"/>
   </w:num>
   <w:num w:numId="48" w16cid:durableId="1721398750">
-    <w:abstractNumId w:val="91"/>
+    <w:abstractNumId w:val="93"/>
   </w:num>
   <w:num w:numId="49" w16cid:durableId="178857690">
-    <w:abstractNumId w:val="113"/>
+    <w:abstractNumId w:val="115"/>
   </w:num>
   <w:num w:numId="50" w16cid:durableId="798694169">
-    <w:abstractNumId w:val="3"/>
+    <w:abstractNumId w:val="4"/>
   </w:num>
   <w:num w:numId="51" w16cid:durableId="904953036">
-    <w:abstractNumId w:val="68"/>
+    <w:abstractNumId w:val="70"/>
   </w:num>
   <w:num w:numId="52" w16cid:durableId="1284115476">
-    <w:abstractNumId w:val="124"/>
+    <w:abstractNumId w:val="126"/>
     <w:lvlOverride w:ilvl="0">
       <w:startOverride w:val="1"/>
       <w:lvl w:ilvl="0">
@@ -34907,85 +35425,85 @@
     </w:lvlOverride>
   </w:num>
   <w:num w:numId="53" w16cid:durableId="1446121308">
-    <w:abstractNumId w:val="129"/>
+    <w:abstractNumId w:val="131"/>
   </w:num>
   <w:num w:numId="54" w16cid:durableId="1817645881">
-    <w:abstractNumId w:val="26"/>
+    <w:abstractNumId w:val="28"/>
   </w:num>
   <w:num w:numId="55" w16cid:durableId="581376065">
-    <w:abstractNumId w:val="46"/>
+    <w:abstractNumId w:val="48"/>
   </w:num>
   <w:num w:numId="56" w16cid:durableId="1003703099">
+    <w:abstractNumId w:val="80"/>
+  </w:num>
+  <w:num w:numId="57" w16cid:durableId="1658462522">
+    <w:abstractNumId w:val="25"/>
+  </w:num>
+  <w:num w:numId="58" w16cid:durableId="1909219221">
+    <w:abstractNumId w:val="17"/>
+  </w:num>
+  <w:num w:numId="59" w16cid:durableId="662589505">
+    <w:abstractNumId w:val="36"/>
+  </w:num>
+  <w:num w:numId="60" w16cid:durableId="515731612">
+    <w:abstractNumId w:val="101"/>
+  </w:num>
+  <w:num w:numId="61" w16cid:durableId="1447504213">
+    <w:abstractNumId w:val="69"/>
+  </w:num>
+  <w:num w:numId="62" w16cid:durableId="1742021667">
+    <w:abstractNumId w:val="18"/>
+  </w:num>
+  <w:num w:numId="63" w16cid:durableId="2066682632">
+    <w:abstractNumId w:val="77"/>
+  </w:num>
+  <w:num w:numId="64" w16cid:durableId="1151481317">
+    <w:abstractNumId w:val="47"/>
+  </w:num>
+  <w:num w:numId="65" w16cid:durableId="1244413112">
     <w:abstractNumId w:val="78"/>
   </w:num>
-  <w:num w:numId="57" w16cid:durableId="1658462522">
-    <w:abstractNumId w:val="23"/>
+  <w:num w:numId="66" w16cid:durableId="448478745">
+    <w:abstractNumId w:val="13"/>
   </w:num>
-  <w:num w:numId="58" w16cid:durableId="1909219221">
-    <w:abstractNumId w:val="15"/>
+  <w:num w:numId="67" w16cid:durableId="402678510">
+    <w:abstractNumId w:val="104"/>
   </w:num>
-  <w:num w:numId="59" w16cid:durableId="662589505">
-    <w:abstractNumId w:val="34"/>
-  </w:num>
-  <w:num w:numId="60" w16cid:durableId="515731612">
-    <w:abstractNumId w:val="99"/>
-  </w:num>
-  <w:num w:numId="61" w16cid:durableId="1447504213">
+  <w:num w:numId="68" w16cid:durableId="74939744">
     <w:abstractNumId w:val="67"/>
   </w:num>
-  <w:num w:numId="62" w16cid:durableId="1742021667">
-    <w:abstractNumId w:val="16"/>
+  <w:num w:numId="69" w16cid:durableId="588465984">
+    <w:abstractNumId w:val="120"/>
   </w:num>
-  <w:num w:numId="63" w16cid:durableId="2066682632">
-    <w:abstractNumId w:val="75"/>
+  <w:num w:numId="70" w16cid:durableId="736050760">
+    <w:abstractNumId w:val="117"/>
   </w:num>
-  <w:num w:numId="64" w16cid:durableId="1151481317">
-    <w:abstractNumId w:val="45"/>
+  <w:num w:numId="71" w16cid:durableId="318506799">
+    <w:abstractNumId w:val="137"/>
   </w:num>
-  <w:num w:numId="65" w16cid:durableId="1244413112">
-    <w:abstractNumId w:val="76"/>
+  <w:num w:numId="72" w16cid:durableId="1500805310">
+    <w:abstractNumId w:val="35"/>
   </w:num>
-  <w:num w:numId="66" w16cid:durableId="448478745">
+  <w:num w:numId="73" w16cid:durableId="1432972824">
+    <w:abstractNumId w:val="72"/>
+  </w:num>
+  <w:num w:numId="74" w16cid:durableId="1879078890">
     <w:abstractNumId w:val="11"/>
   </w:num>
-  <w:num w:numId="67" w16cid:durableId="402678510">
-    <w:abstractNumId w:val="102"/>
-  </w:num>
-  <w:num w:numId="68" w16cid:durableId="74939744">
-    <w:abstractNumId w:val="65"/>
-  </w:num>
-  <w:num w:numId="69" w16cid:durableId="588465984">
-    <w:abstractNumId w:val="118"/>
-  </w:num>
-  <w:num w:numId="70" w16cid:durableId="736050760">
-    <w:abstractNumId w:val="115"/>
-  </w:num>
-  <w:num w:numId="71" w16cid:durableId="318506799">
-    <w:abstractNumId w:val="135"/>
-  </w:num>
-  <w:num w:numId="72" w16cid:durableId="1500805310">
-    <w:abstractNumId w:val="33"/>
-  </w:num>
-  <w:num w:numId="73" w16cid:durableId="1432972824">
-    <w:abstractNumId w:val="70"/>
-  </w:num>
-  <w:num w:numId="74" w16cid:durableId="1879078890">
-    <w:abstractNumId w:val="9"/>
-  </w:num>
   <w:num w:numId="75" w16cid:durableId="579170817">
-    <w:abstractNumId w:val="7"/>
+    <w:abstractNumId w:val="8"/>
   </w:num>
   <w:num w:numId="76" w16cid:durableId="1921331480">
-    <w:abstractNumId w:val="117"/>
+    <w:abstractNumId w:val="119"/>
   </w:num>
   <w:num w:numId="77" w16cid:durableId="443185753">
-    <w:abstractNumId w:val="72"/>
+    <w:abstractNumId w:val="74"/>
   </w:num>
   <w:num w:numId="78" w16cid:durableId="2075270469">
-    <w:abstractNumId w:val="119"/>
+    <w:abstractNumId w:val="121"/>
   </w:num>
   <w:num w:numId="79" w16cid:durableId="1327589571">
-    <w:abstractNumId w:val="124"/>
+    <w:abstractNumId w:val="126"/>
     <w:lvlOverride w:ilvl="0">
       <w:startOverride w:val="1"/>
     </w:lvlOverride>
@@ -35015,202 +35533,208 @@
     </w:lvlOverride>
   </w:num>
   <w:num w:numId="80" w16cid:durableId="1794204911">
-    <w:abstractNumId w:val="88"/>
+    <w:abstractNumId w:val="90"/>
   </w:num>
   <w:num w:numId="81" w16cid:durableId="2038658572">
-    <w:abstractNumId w:val="13"/>
+    <w:abstractNumId w:val="15"/>
   </w:num>
   <w:num w:numId="82" w16cid:durableId="1791436310">
-    <w:abstractNumId w:val="85"/>
+    <w:abstractNumId w:val="87"/>
   </w:num>
   <w:num w:numId="83" w16cid:durableId="1712991609">
-    <w:abstractNumId w:val="134"/>
+    <w:abstractNumId w:val="136"/>
   </w:num>
   <w:num w:numId="84" w16cid:durableId="654987850">
     <w:abstractNumId w:val="0"/>
   </w:num>
   <w:num w:numId="85" w16cid:durableId="868834166">
-    <w:abstractNumId w:val="112"/>
+    <w:abstractNumId w:val="114"/>
   </w:num>
   <w:num w:numId="86" w16cid:durableId="402534293">
-    <w:abstractNumId w:val="25"/>
+    <w:abstractNumId w:val="27"/>
   </w:num>
   <w:num w:numId="87" w16cid:durableId="911893230">
-    <w:abstractNumId w:val="44"/>
+    <w:abstractNumId w:val="46"/>
   </w:num>
   <w:num w:numId="88" w16cid:durableId="218517846">
-    <w:abstractNumId w:val="60"/>
+    <w:abstractNumId w:val="62"/>
   </w:num>
   <w:num w:numId="89" w16cid:durableId="136457170">
-    <w:abstractNumId w:val="137"/>
+    <w:abstractNumId w:val="139"/>
   </w:num>
   <w:num w:numId="90" w16cid:durableId="1070270335">
-    <w:abstractNumId w:val="6"/>
+    <w:abstractNumId w:val="7"/>
   </w:num>
   <w:num w:numId="91" w16cid:durableId="902764300">
-    <w:abstractNumId w:val="105"/>
+    <w:abstractNumId w:val="107"/>
   </w:num>
   <w:num w:numId="92" w16cid:durableId="1613247183">
-    <w:abstractNumId w:val="50"/>
+    <w:abstractNumId w:val="52"/>
   </w:num>
   <w:num w:numId="93" w16cid:durableId="2103992570">
-    <w:abstractNumId w:val="71"/>
+    <w:abstractNumId w:val="73"/>
   </w:num>
   <w:num w:numId="94" w16cid:durableId="584923388">
+    <w:abstractNumId w:val="39"/>
+  </w:num>
+  <w:num w:numId="95" w16cid:durableId="1228538196">
+    <w:abstractNumId w:val="86"/>
+  </w:num>
+  <w:num w:numId="96" w16cid:durableId="837887914">
+    <w:abstractNumId w:val="56"/>
+  </w:num>
+  <w:num w:numId="97" w16cid:durableId="1692609171">
+    <w:abstractNumId w:val="9"/>
+  </w:num>
+  <w:num w:numId="98" w16cid:durableId="2039624229">
+    <w:abstractNumId w:val="106"/>
+  </w:num>
+  <w:num w:numId="99" w16cid:durableId="59057119">
+    <w:abstractNumId w:val="14"/>
+  </w:num>
+  <w:num w:numId="100" w16cid:durableId="1525292642">
     <w:abstractNumId w:val="37"/>
   </w:num>
-  <w:num w:numId="95" w16cid:durableId="1228538196">
-    <w:abstractNumId w:val="84"/>
-  </w:num>
-  <w:num w:numId="96" w16cid:durableId="837887914">
-    <w:abstractNumId w:val="54"/>
-  </w:num>
-  <w:num w:numId="97" w16cid:durableId="1692609171">
-    <w:abstractNumId w:val="8"/>
-  </w:num>
-  <w:num w:numId="98" w16cid:durableId="2039624229">
-    <w:abstractNumId w:val="104"/>
-  </w:num>
-  <w:num w:numId="99" w16cid:durableId="59057119">
-    <w:abstractNumId w:val="12"/>
-  </w:num>
-  <w:num w:numId="100" w16cid:durableId="1525292642">
-    <w:abstractNumId w:val="35"/>
-  </w:num>
   <w:num w:numId="101" w16cid:durableId="1081759144">
-    <w:abstractNumId w:val="47"/>
+    <w:abstractNumId w:val="49"/>
   </w:num>
   <w:num w:numId="102" w16cid:durableId="1113862251">
-    <w:abstractNumId w:val="36"/>
+    <w:abstractNumId w:val="38"/>
   </w:num>
   <w:num w:numId="103" w16cid:durableId="2052419075">
-    <w:abstractNumId w:val="83"/>
+    <w:abstractNumId w:val="85"/>
   </w:num>
   <w:num w:numId="104" w16cid:durableId="261305913">
-    <w:abstractNumId w:val="108"/>
+    <w:abstractNumId w:val="110"/>
   </w:num>
   <w:num w:numId="105" w16cid:durableId="1247614452">
-    <w:abstractNumId w:val="127"/>
+    <w:abstractNumId w:val="129"/>
   </w:num>
   <w:num w:numId="106" w16cid:durableId="1964581333">
-    <w:abstractNumId w:val="55"/>
+    <w:abstractNumId w:val="57"/>
   </w:num>
   <w:num w:numId="107" w16cid:durableId="146482879">
-    <w:abstractNumId w:val="40"/>
+    <w:abstractNumId w:val="42"/>
   </w:num>
   <w:num w:numId="108" w16cid:durableId="1025520474">
-    <w:abstractNumId w:val="90"/>
+    <w:abstractNumId w:val="92"/>
   </w:num>
   <w:num w:numId="109" w16cid:durableId="1870022338">
-    <w:abstractNumId w:val="79"/>
+    <w:abstractNumId w:val="81"/>
   </w:num>
   <w:num w:numId="110" w16cid:durableId="427894067">
-    <w:abstractNumId w:val="66"/>
+    <w:abstractNumId w:val="68"/>
   </w:num>
   <w:num w:numId="111" w16cid:durableId="744642425">
-    <w:abstractNumId w:val="123"/>
+    <w:abstractNumId w:val="125"/>
   </w:num>
   <w:num w:numId="112" w16cid:durableId="475028322">
     <w:abstractNumId w:val="2"/>
   </w:num>
   <w:num w:numId="113" w16cid:durableId="538517838">
-    <w:abstractNumId w:val="96"/>
+    <w:abstractNumId w:val="98"/>
   </w:num>
   <w:num w:numId="114" w16cid:durableId="389035545">
-    <w:abstractNumId w:val="22"/>
+    <w:abstractNumId w:val="24"/>
   </w:num>
   <w:num w:numId="115" w16cid:durableId="1503547535">
-    <w:abstractNumId w:val="74"/>
+    <w:abstractNumId w:val="76"/>
   </w:num>
   <w:num w:numId="116" w16cid:durableId="2087729910">
+    <w:abstractNumId w:val="45"/>
+  </w:num>
+  <w:num w:numId="117" w16cid:durableId="1401639264">
     <w:abstractNumId w:val="43"/>
   </w:num>
-  <w:num w:numId="117" w16cid:durableId="1401639264">
-    <w:abstractNumId w:val="41"/>
-  </w:num>
   <w:num w:numId="118" w16cid:durableId="1379013421">
-    <w:abstractNumId w:val="114"/>
+    <w:abstractNumId w:val="116"/>
   </w:num>
   <w:num w:numId="119" w16cid:durableId="2102408530">
-    <w:abstractNumId w:val="87"/>
+    <w:abstractNumId w:val="89"/>
   </w:num>
   <w:num w:numId="120" w16cid:durableId="145320126">
-    <w:abstractNumId w:val="107"/>
+    <w:abstractNumId w:val="109"/>
   </w:num>
   <w:num w:numId="121" w16cid:durableId="1378359119">
-    <w:abstractNumId w:val="110"/>
+    <w:abstractNumId w:val="112"/>
   </w:num>
   <w:num w:numId="122" w16cid:durableId="2129933546">
-    <w:abstractNumId w:val="49"/>
+    <w:abstractNumId w:val="51"/>
   </w:num>
   <w:num w:numId="123" w16cid:durableId="861087783">
-    <w:abstractNumId w:val="103"/>
+    <w:abstractNumId w:val="105"/>
   </w:num>
   <w:num w:numId="124" w16cid:durableId="951014929">
-    <w:abstractNumId w:val="73"/>
+    <w:abstractNumId w:val="75"/>
   </w:num>
   <w:num w:numId="125" w16cid:durableId="1032733120">
-    <w:abstractNumId w:val="77"/>
+    <w:abstractNumId w:val="79"/>
   </w:num>
   <w:num w:numId="126" w16cid:durableId="749425400">
-    <w:abstractNumId w:val="106"/>
+    <w:abstractNumId w:val="108"/>
   </w:num>
   <w:num w:numId="127" w16cid:durableId="1955942418">
-    <w:abstractNumId w:val="24"/>
+    <w:abstractNumId w:val="26"/>
   </w:num>
   <w:num w:numId="128" w16cid:durableId="960187554">
-    <w:abstractNumId w:val="61"/>
+    <w:abstractNumId w:val="63"/>
   </w:num>
   <w:num w:numId="129" w16cid:durableId="1242175956">
-    <w:abstractNumId w:val="86"/>
+    <w:abstractNumId w:val="88"/>
   </w:num>
   <w:num w:numId="130" w16cid:durableId="1634825230">
     <w:abstractNumId w:val="1"/>
   </w:num>
   <w:num w:numId="131" w16cid:durableId="1709644557">
+    <w:abstractNumId w:val="23"/>
+  </w:num>
+  <w:num w:numId="132" w16cid:durableId="1340696204">
+    <w:abstractNumId w:val="97"/>
+  </w:num>
+  <w:num w:numId="133" w16cid:durableId="1659922610">
+    <w:abstractNumId w:val="60"/>
+  </w:num>
+  <w:num w:numId="134" w16cid:durableId="1448505490">
+    <w:abstractNumId w:val="82"/>
+  </w:num>
+  <w:num w:numId="135" w16cid:durableId="574702044">
+    <w:abstractNumId w:val="100"/>
+  </w:num>
+  <w:num w:numId="136" w16cid:durableId="1329751342">
+    <w:abstractNumId w:val="94"/>
+  </w:num>
+  <w:num w:numId="137" w16cid:durableId="924848698">
+    <w:abstractNumId w:val="132"/>
+  </w:num>
+  <w:num w:numId="138" w16cid:durableId="373698686">
+    <w:abstractNumId w:val="96"/>
+  </w:num>
+  <w:num w:numId="139" w16cid:durableId="57559495">
+    <w:abstractNumId w:val="41"/>
+  </w:num>
+  <w:num w:numId="140" w16cid:durableId="216161760">
     <w:abstractNumId w:val="21"/>
   </w:num>
-  <w:num w:numId="132" w16cid:durableId="1340696204">
-    <w:abstractNumId w:val="95"/>
+  <w:num w:numId="141" w16cid:durableId="721056041">
+    <w:abstractNumId w:val="134"/>
   </w:num>
-  <w:num w:numId="133" w16cid:durableId="1659922610">
+  <w:num w:numId="142" w16cid:durableId="1341733515">
+    <w:abstractNumId w:val="33"/>
+  </w:num>
+  <w:num w:numId="143" w16cid:durableId="83495877">
     <w:abstractNumId w:val="58"/>
   </w:num>
-  <w:num w:numId="134" w16cid:durableId="1448505490">
-    <w:abstractNumId w:val="80"/>
-  </w:num>
-  <w:num w:numId="135" w16cid:durableId="574702044">
-    <w:abstractNumId w:val="98"/>
-  </w:num>
-  <w:num w:numId="136" w16cid:durableId="1329751342">
-    <w:abstractNumId w:val="92"/>
-  </w:num>
-  <w:num w:numId="137" w16cid:durableId="924848698">
+  <w:num w:numId="144" w16cid:durableId="681707226">
     <w:abstractNumId w:val="130"/>
   </w:num>
-  <w:num w:numId="138" w16cid:durableId="373698686">
-    <w:abstractNumId w:val="94"/>
+  <w:num w:numId="145" w16cid:durableId="1426534654">
+    <w:abstractNumId w:val="55"/>
   </w:num>
-  <w:num w:numId="139" w16cid:durableId="57559495">
-    <w:abstractNumId w:val="39"/>
+  <w:num w:numId="146" w16cid:durableId="1102646725">
+    <w:abstractNumId w:val="3"/>
   </w:num>
-  <w:num w:numId="140" w16cid:durableId="216161760">
-    <w:abstractNumId w:val="19"/>
-  </w:num>
-  <w:num w:numId="141" w16cid:durableId="721056041">
-    <w:abstractNumId w:val="132"/>
-  </w:num>
-  <w:num w:numId="142" w16cid:durableId="1341733515">
-    <w:abstractNumId w:val="31"/>
-  </w:num>
-  <w:num w:numId="143" w16cid:durableId="83495877">
-    <w:abstractNumId w:val="56"/>
-  </w:num>
-  <w:num w:numId="144" w16cid:durableId="681707226">
-    <w:abstractNumId w:val="128"/>
-  </w:num>
-  <w:num w:numId="145" w16cid:durableId="1426534654">
-    <w:abstractNumId w:val="53"/>
+  <w:num w:numId="147" w16cid:durableId="393820505">
+    <w:abstractNumId w:val="10"/>
   </w:num>
   <w:numIdMacAtCleanup w:val="142"/>
 </w:numbering>
@@ -35615,7 +36139,7 @@
     <w:name w:val="Normal"/>
     <w:aliases w:val="Body"/>
     <w:qFormat/>
-    <w:rsid w:val="00D326EE"/>
+    <w:rsid w:val="00CB1096"/>
     <w:rPr>
       <w:rFonts w:ascii="Poppins" w:hAnsi="Poppins"/>
       <w:sz w:val="20"/>
@@ -35630,7 +36154,7 @@
     <w:autoRedefine/>
     <w:uiPriority w:val="2"/>
     <w:qFormat/>
-    <w:rsid w:val="00D326EE"/>
+    <w:rsid w:val="00CB1096"/>
     <w:pPr>
       <w:keepNext/>
       <w:keepLines/>
@@ -35657,7 +36181,7 @@
     <w:link w:val="Heading2Char"/>
     <w:uiPriority w:val="3"/>
     <w:qFormat/>
-    <w:rsid w:val="00D326EE"/>
+    <w:rsid w:val="00CB1096"/>
     <w:pPr>
       <w:pageBreakBefore w:val="0"/>
       <w:numPr>
@@ -35678,7 +36202,7 @@
     <w:link w:val="Heading3Char"/>
     <w:uiPriority w:val="4"/>
     <w:qFormat/>
-    <w:rsid w:val="00D326EE"/>
+    <w:rsid w:val="00CB1096"/>
     <w:pPr>
       <w:keepNext/>
       <w:keepLines/>
@@ -35700,7 +36224,7 @@
     <w:link w:val="Heading4Char"/>
     <w:uiPriority w:val="5"/>
     <w:qFormat/>
-    <w:rsid w:val="00D326EE"/>
+    <w:rsid w:val="00CB1096"/>
     <w:pPr>
       <w:keepNext/>
       <w:keepLines/>
@@ -35720,7 +36244,7 @@
     <w:next w:val="Normal"/>
     <w:link w:val="Heading5Char"/>
     <w:uiPriority w:val="9"/>
-    <w:rsid w:val="00D326EE"/>
+    <w:rsid w:val="00CB1096"/>
     <w:pPr>
       <w:keepNext/>
       <w:keepLines/>
@@ -35739,7 +36263,7 @@
     <w:link w:val="Heading6Char"/>
     <w:uiPriority w:val="9"/>
     <w:qFormat/>
-    <w:rsid w:val="00D326EE"/>
+    <w:rsid w:val="00CB1096"/>
     <w:pPr>
       <w:keepNext/>
       <w:keepLines/>
@@ -35758,7 +36282,7 @@
     <w:link w:val="Heading7Char"/>
     <w:uiPriority w:val="9"/>
     <w:qFormat/>
-    <w:rsid w:val="00D326EE"/>
+    <w:rsid w:val="00CB1096"/>
     <w:pPr>
       <w:keepNext/>
       <w:keepLines/>
@@ -35780,7 +36304,7 @@
     <w:uiPriority w:val="9"/>
     <w:semiHidden/>
     <w:qFormat/>
-    <w:rsid w:val="00D326EE"/>
+    <w:rsid w:val="00CB1096"/>
     <w:pPr>
       <w:keepNext/>
       <w:keepLines/>
@@ -35802,7 +36326,7 @@
     <w:uiPriority w:val="9"/>
     <w:semiHidden/>
     <w:qFormat/>
-    <w:rsid w:val="00D326EE"/>
+    <w:rsid w:val="00CB1096"/>
     <w:pPr>
       <w:keepNext/>
       <w:keepLines/>
@@ -35823,7 +36347,7 @@
     <w:uiPriority w:val="1"/>
     <w:semiHidden/>
     <w:unhideWhenUsed/>
-    <w:rsid w:val="00D326EE"/>
+    <w:rsid w:val="00CB1096"/>
   </w:style>
   <w:style w:type="table" w:default="1" w:styleId="TableNormal">
     <w:name w:val="Normal Table"/>
@@ -35845,13 +36369,13 @@
     <w:uiPriority w:val="99"/>
     <w:semiHidden/>
     <w:unhideWhenUsed/>
-    <w:rsid w:val="00D326EE"/>
+    <w:rsid w:val="00CB1096"/>
   </w:style>
   <w:style w:type="table" w:styleId="TableGrid">
     <w:name w:val="Table Grid"/>
     <w:basedOn w:val="TableNormal"/>
     <w:uiPriority w:val="39"/>
-    <w:rsid w:val="00D326EE"/>
+    <w:rsid w:val="00CB1096"/>
     <w:pPr>
       <w:spacing w:after="0" w:line="240" w:lineRule="auto"/>
     </w:pPr>
@@ -35870,7 +36394,7 @@
     <w:name w:val="Plain Table 5"/>
     <w:basedOn w:val="TableNormal"/>
     <w:uiPriority w:val="45"/>
-    <w:rsid w:val="00D326EE"/>
+    <w:rsid w:val="00CB1096"/>
     <w:pPr>
       <w:spacing w:after="0" w:line="240" w:lineRule="auto"/>
     </w:pPr>
@@ -35990,7 +36514,7 @@
     <w:name w:val="Plain Table 2"/>
     <w:basedOn w:val="TableNormal"/>
     <w:uiPriority w:val="42"/>
-    <w:rsid w:val="00D326EE"/>
+    <w:rsid w:val="00CB1096"/>
     <w:pPr>
       <w:spacing w:after="0" w:line="240" w:lineRule="auto"/>
     </w:pPr>
@@ -36070,7 +36594,7 @@
     <w:name w:val="List Table 3"/>
     <w:basedOn w:val="TableNormal"/>
     <w:uiPriority w:val="48"/>
-    <w:rsid w:val="00D326EE"/>
+    <w:rsid w:val="00CB1096"/>
     <w:pPr>
       <w:spacing w:after="0" w:line="240" w:lineRule="auto"/>
     </w:pPr>
@@ -36194,7 +36718,7 @@
     <w:name w:val="List Table 5 Dark"/>
     <w:basedOn w:val="TableNormal"/>
     <w:uiPriority w:val="50"/>
-    <w:rsid w:val="00D326EE"/>
+    <w:rsid w:val="00CB1096"/>
     <w:pPr>
       <w:spacing w:after="0" w:line="240" w:lineRule="auto"/>
     </w:pPr>
@@ -36328,7 +36852,7 @@
     <w:name w:val="List Table 5 Dark Accent 6"/>
     <w:basedOn w:val="TableNormal"/>
     <w:uiPriority w:val="50"/>
-    <w:rsid w:val="00D326EE"/>
+    <w:rsid w:val="00CB1096"/>
     <w:pPr>
       <w:spacing w:after="0" w:line="240" w:lineRule="auto"/>
     </w:pPr>
@@ -36458,11 +36982,11 @@
       </w:tcPr>
     </w:tblStylePr>
   </w:style>
-  <w:style w:type="table" w:styleId="GridTable7Colorful-Accent6">
+  <w:style w:type="table" w:styleId="GridTable7ColourfulAccent6">
     <w:name w:val="Grid Table 7 Colorful Accent 6"/>
     <w:basedOn w:val="TableNormal"/>
     <w:uiPriority w:val="52"/>
-    <w:rsid w:val="00D326EE"/>
+    <w:rsid w:val="00CB1096"/>
     <w:pPr>
       <w:spacing w:after="0" w:line="240" w:lineRule="auto"/>
     </w:pPr>
@@ -36601,7 +37125,7 @@
     <w:name w:val="Grid Table 2 Accent 6"/>
     <w:basedOn w:val="TableNormal"/>
     <w:uiPriority w:val="47"/>
-    <w:rsid w:val="00D326EE"/>
+    <w:rsid w:val="00CB1096"/>
     <w:pPr>
       <w:spacing w:after="0" w:line="240" w:lineRule="auto"/>
     </w:pPr>
@@ -36678,7 +37202,7 @@
     <w:link w:val="HeaderChar"/>
     <w:uiPriority w:val="99"/>
     <w:unhideWhenUsed/>
-    <w:rsid w:val="00D326EE"/>
+    <w:rsid w:val="00CB1096"/>
     <w:pPr>
       <w:tabs>
         <w:tab w:val="center" w:pos="4513"/>
@@ -36692,7 +37216,7 @@
     <w:basedOn w:val="DefaultParagraphFont"/>
     <w:link w:val="Header"/>
     <w:uiPriority w:val="99"/>
-    <w:rsid w:val="00D326EE"/>
+    <w:rsid w:val="00CB1096"/>
     <w:rPr>
       <w:rFonts w:ascii="Poppins" w:hAnsi="Poppins"/>
       <w:sz w:val="20"/>
@@ -36704,7 +37228,7 @@
     <w:link w:val="FooterChar"/>
     <w:uiPriority w:val="99"/>
     <w:unhideWhenUsed/>
-    <w:rsid w:val="00D326EE"/>
+    <w:rsid w:val="00CB1096"/>
     <w:pPr>
       <w:tabs>
         <w:tab w:val="center" w:pos="4513"/>
@@ -36718,7 +37242,7 @@
     <w:basedOn w:val="DefaultParagraphFont"/>
     <w:link w:val="Footer"/>
     <w:uiPriority w:val="99"/>
-    <w:rsid w:val="00D326EE"/>
+    <w:rsid w:val="00CB1096"/>
     <w:rPr>
       <w:rFonts w:ascii="Poppins" w:hAnsi="Poppins"/>
       <w:sz w:val="20"/>
@@ -36729,7 +37253,7 @@
     <w:basedOn w:val="DefaultParagraphFont"/>
     <w:uiPriority w:val="99"/>
     <w:semiHidden/>
-    <w:rsid w:val="00D326EE"/>
+    <w:rsid w:val="00CB1096"/>
     <w:rPr>
       <w:color w:val="808080"/>
     </w:rPr>
@@ -36740,7 +37264,7 @@
     <w:basedOn w:val="DefaultParagraphFont"/>
     <w:link w:val="Heading1"/>
     <w:uiPriority w:val="2"/>
-    <w:rsid w:val="00D326EE"/>
+    <w:rsid w:val="00CB1096"/>
     <w:rPr>
       <w:rFonts w:ascii="Poppins" w:eastAsiaTheme="majorEastAsia" w:hAnsi="Poppins" w:cstheme="majorBidi"/>
       <w:b/>
@@ -36755,7 +37279,7 @@
     <w:basedOn w:val="DefaultParagraphFont"/>
     <w:link w:val="Heading2"/>
     <w:uiPriority w:val="3"/>
-    <w:rsid w:val="00D326EE"/>
+    <w:rsid w:val="00CB1096"/>
     <w:rPr>
       <w:rFonts w:ascii="Poppins" w:eastAsiaTheme="majorEastAsia" w:hAnsi="Poppins" w:cstheme="majorBidi"/>
       <w:b/>
@@ -36770,7 +37294,7 @@
     <w:basedOn w:val="DefaultParagraphFont"/>
     <w:link w:val="Heading3"/>
     <w:uiPriority w:val="4"/>
-    <w:rsid w:val="00D326EE"/>
+    <w:rsid w:val="00CB1096"/>
     <w:rPr>
       <w:rFonts w:ascii="Poppins SemiBold" w:eastAsiaTheme="majorEastAsia" w:hAnsi="Poppins SemiBold" w:cstheme="majorBidi"/>
       <w:color w:val="282864"/>
@@ -36784,7 +37308,7 @@
     <w:basedOn w:val="DefaultParagraphFont"/>
     <w:link w:val="Heading4"/>
     <w:uiPriority w:val="5"/>
-    <w:rsid w:val="00D326EE"/>
+    <w:rsid w:val="00CB1096"/>
     <w:rPr>
       <w:rFonts w:ascii="Poppins" w:eastAsiaTheme="majorEastAsia" w:hAnsi="Poppins" w:cstheme="majorBidi"/>
       <w:iCs/>
@@ -36797,7 +37321,7 @@
     <w:basedOn w:val="DefaultParagraphFont"/>
     <w:link w:val="Heading5"/>
     <w:uiPriority w:val="9"/>
-    <w:rsid w:val="00D326EE"/>
+    <w:rsid w:val="00CB1096"/>
     <w:rPr>
       <w:rFonts w:asciiTheme="majorHAnsi" w:eastAsiaTheme="majorEastAsia" w:hAnsiTheme="majorHAnsi" w:cstheme="majorBidi"/>
       <w:color w:val="1E1E4A" w:themeColor="accent1" w:themeShade="BF"/>
@@ -36809,7 +37333,7 @@
     <w:basedOn w:val="DefaultParagraphFont"/>
     <w:link w:val="Heading6"/>
     <w:uiPriority w:val="9"/>
-    <w:rsid w:val="00D326EE"/>
+    <w:rsid w:val="00CB1096"/>
     <w:rPr>
       <w:rFonts w:asciiTheme="majorHAnsi" w:eastAsiaTheme="majorEastAsia" w:hAnsiTheme="majorHAnsi" w:cstheme="majorBidi"/>
       <w:color w:val="141431" w:themeColor="accent1" w:themeShade="7F"/>
@@ -36821,7 +37345,7 @@
     <w:basedOn w:val="DefaultParagraphFont"/>
     <w:link w:val="Heading7"/>
     <w:uiPriority w:val="9"/>
-    <w:rsid w:val="00D326EE"/>
+    <w:rsid w:val="00CB1096"/>
     <w:rPr>
       <w:rFonts w:asciiTheme="majorHAnsi" w:eastAsiaTheme="majorEastAsia" w:hAnsiTheme="majorHAnsi" w:cstheme="majorBidi"/>
       <w:i/>
@@ -36836,7 +37360,7 @@
     <w:link w:val="Heading8"/>
     <w:uiPriority w:val="9"/>
     <w:semiHidden/>
-    <w:rsid w:val="00D326EE"/>
+    <w:rsid w:val="00CB1096"/>
     <w:rPr>
       <w:rFonts w:asciiTheme="majorHAnsi" w:eastAsiaTheme="majorEastAsia" w:hAnsiTheme="majorHAnsi" w:cstheme="majorBidi"/>
       <w:color w:val="38388C" w:themeColor="text1" w:themeTint="D8"/>
@@ -36850,7 +37374,7 @@
     <w:link w:val="Heading9"/>
     <w:uiPriority w:val="9"/>
     <w:semiHidden/>
-    <w:rsid w:val="00D326EE"/>
+    <w:rsid w:val="00CB1096"/>
     <w:rPr>
       <w:rFonts w:asciiTheme="majorHAnsi" w:eastAsiaTheme="majorEastAsia" w:hAnsiTheme="majorHAnsi" w:cstheme="majorBidi"/>
       <w:i/>
@@ -36868,7 +37392,7 @@
     <w:uiPriority w:val="35"/>
     <w:unhideWhenUsed/>
     <w:qFormat/>
-    <w:rsid w:val="00D326EE"/>
+    <w:rsid w:val="00CB1096"/>
     <w:pPr>
       <w:spacing w:after="200" w:line="240" w:lineRule="auto"/>
     </w:pPr>
@@ -36886,7 +37410,7 @@
     <w:next w:val="Normal"/>
     <w:link w:val="TitleChar"/>
     <w:uiPriority w:val="10"/>
-    <w:rsid w:val="00D326EE"/>
+    <w:rsid w:val="00CB1096"/>
     <w:pPr>
       <w:spacing w:after="0" w:line="240" w:lineRule="auto"/>
       <w:contextualSpacing/>
@@ -36907,7 +37431,7 @@
     <w:basedOn w:val="DefaultParagraphFont"/>
     <w:link w:val="Title"/>
     <w:uiPriority w:val="10"/>
-    <w:rsid w:val="00D326EE"/>
+    <w:rsid w:val="00CB1096"/>
     <w:rPr>
       <w:rFonts w:ascii="Poppins" w:eastAsiaTheme="majorEastAsia" w:hAnsi="Poppins" w:cstheme="majorBidi"/>
       <w:b/>
@@ -36924,7 +37448,7 @@
     <w:next w:val="Normal"/>
     <w:link w:val="SubtitleChar"/>
     <w:uiPriority w:val="11"/>
-    <w:rsid w:val="00D326EE"/>
+    <w:rsid w:val="00CB1096"/>
     <w:pPr>
       <w:numPr>
         <w:ilvl w:val="1"/>
@@ -36941,7 +37465,7 @@
     <w:basedOn w:val="DefaultParagraphFont"/>
     <w:link w:val="Subtitle"/>
     <w:uiPriority w:val="11"/>
-    <w:rsid w:val="00D326EE"/>
+    <w:rsid w:val="00CB1096"/>
     <w:rPr>
       <w:rFonts w:ascii="Poppins" w:eastAsiaTheme="minorEastAsia" w:hAnsi="Poppins" w:cstheme="majorBidi"/>
       <w:b/>
@@ -36956,7 +37480,7 @@
     <w:name w:val="Strong"/>
     <w:basedOn w:val="DefaultParagraphFont"/>
     <w:uiPriority w:val="22"/>
-    <w:rsid w:val="00D326EE"/>
+    <w:rsid w:val="00CB1096"/>
     <w:rPr>
       <w:b/>
       <w:bCs/>
@@ -36966,7 +37490,7 @@
     <w:name w:val="Emphasis"/>
     <w:basedOn w:val="DefaultParagraphFont"/>
     <w:uiPriority w:val="20"/>
-    <w:rsid w:val="00D326EE"/>
+    <w:rsid w:val="00CB1096"/>
     <w:rPr>
       <w:i/>
       <w:iCs/>
@@ -36975,7 +37499,7 @@
   <w:style w:type="paragraph" w:styleId="NoSpacing">
     <w:name w:val="No Spacing"/>
     <w:uiPriority w:val="1"/>
-    <w:rsid w:val="00D326EE"/>
+    <w:rsid w:val="00CB1096"/>
     <w:pPr>
       <w:spacing w:after="0" w:line="240" w:lineRule="auto"/>
     </w:pPr>
@@ -36986,7 +37510,7 @@
     <w:next w:val="Normal"/>
     <w:link w:val="QuoteChar"/>
     <w:uiPriority w:val="29"/>
-    <w:rsid w:val="00D326EE"/>
+    <w:rsid w:val="00CB1096"/>
     <w:pPr>
       <w:spacing w:before="200"/>
       <w:ind w:left="864" w:right="864"/>
@@ -37003,7 +37527,7 @@
     <w:basedOn w:val="DefaultParagraphFont"/>
     <w:link w:val="Quote"/>
     <w:uiPriority w:val="29"/>
-    <w:rsid w:val="00D326EE"/>
+    <w:rsid w:val="00CB1096"/>
     <w:rPr>
       <w:rFonts w:ascii="Poppins" w:hAnsi="Poppins"/>
       <w:i/>
@@ -37018,7 +37542,7 @@
     <w:next w:val="Normal"/>
     <w:link w:val="IntenseQuoteChar"/>
     <w:uiPriority w:val="30"/>
-    <w:rsid w:val="00D326EE"/>
+    <w:rsid w:val="00CB1096"/>
     <w:pPr>
       <w:pBdr>
         <w:top w:val="single" w:sz="4" w:space="10" w:color="282864" w:themeColor="accent1"/>
@@ -37039,7 +37563,7 @@
     <w:basedOn w:val="DefaultParagraphFont"/>
     <w:link w:val="IntenseQuote"/>
     <w:uiPriority w:val="30"/>
-    <w:rsid w:val="00D326EE"/>
+    <w:rsid w:val="00CB1096"/>
     <w:rPr>
       <w:rFonts w:ascii="Poppins" w:hAnsi="Poppins"/>
       <w:i/>
@@ -37052,7 +37576,7 @@
     <w:name w:val="Subtle Emphasis"/>
     <w:basedOn w:val="DefaultParagraphFont"/>
     <w:uiPriority w:val="19"/>
-    <w:rsid w:val="00D326EE"/>
+    <w:rsid w:val="00CB1096"/>
     <w:rPr>
       <w:i/>
       <w:iCs/>
@@ -37063,7 +37587,7 @@
     <w:name w:val="Intense Emphasis"/>
     <w:basedOn w:val="DefaultParagraphFont"/>
     <w:uiPriority w:val="21"/>
-    <w:rsid w:val="00D326EE"/>
+    <w:rsid w:val="00CB1096"/>
     <w:rPr>
       <w:i/>
       <w:iCs/>
@@ -37074,7 +37598,7 @@
     <w:name w:val="Subtle Reference"/>
     <w:basedOn w:val="DefaultParagraphFont"/>
     <w:uiPriority w:val="31"/>
-    <w:rsid w:val="00D326EE"/>
+    <w:rsid w:val="00CB1096"/>
     <w:rPr>
       <w:smallCaps/>
       <w:color w:val="5353BA" w:themeColor="text1" w:themeTint="A5"/>
@@ -37084,7 +37608,7 @@
     <w:name w:val="Intense Reference"/>
     <w:basedOn w:val="DefaultParagraphFont"/>
     <w:uiPriority w:val="32"/>
-    <w:rsid w:val="00D326EE"/>
+    <w:rsid w:val="00CB1096"/>
     <w:rPr>
       <w:b/>
       <w:bCs/>
@@ -37097,7 +37621,7 @@
     <w:name w:val="Book Title"/>
     <w:basedOn w:val="DefaultParagraphFont"/>
     <w:uiPriority w:val="33"/>
-    <w:rsid w:val="00D326EE"/>
+    <w:rsid w:val="00CB1096"/>
     <w:rPr>
       <w:b/>
       <w:bCs/>
@@ -37114,7 +37638,7 @@
     <w:uiPriority w:val="39"/>
     <w:unhideWhenUsed/>
     <w:qFormat/>
-    <w:rsid w:val="00D326EE"/>
+    <w:rsid w:val="00CB1096"/>
     <w:pPr>
       <w:pageBreakBefore w:val="0"/>
       <w:numPr>
@@ -37127,7 +37651,7 @@
     <w:name w:val="List Paragraph"/>
     <w:basedOn w:val="Normal"/>
     <w:uiPriority w:val="34"/>
-    <w:rsid w:val="00D326EE"/>
+    <w:rsid w:val="00CB1096"/>
     <w:pPr>
       <w:ind w:left="720"/>
       <w:contextualSpacing/>
@@ -37140,7 +37664,7 @@
     <w:autoRedefine/>
     <w:uiPriority w:val="39"/>
     <w:unhideWhenUsed/>
-    <w:rsid w:val="00D326EE"/>
+    <w:rsid w:val="00CB1096"/>
     <w:pPr>
       <w:spacing w:after="100"/>
     </w:pPr>
@@ -37152,7 +37676,7 @@
     <w:autoRedefine/>
     <w:uiPriority w:val="39"/>
     <w:unhideWhenUsed/>
-    <w:rsid w:val="00D326EE"/>
+    <w:rsid w:val="00CB1096"/>
     <w:pPr>
       <w:spacing w:after="100"/>
       <w:ind w:left="320"/>
@@ -37165,7 +37689,7 @@
     <w:autoRedefine/>
     <w:uiPriority w:val="39"/>
     <w:unhideWhenUsed/>
-    <w:rsid w:val="00D326EE"/>
+    <w:rsid w:val="00CB1096"/>
     <w:pPr>
       <w:spacing w:after="100"/>
       <w:ind w:left="640"/>
@@ -37176,7 +37700,7 @@
     <w:basedOn w:val="DefaultParagraphFont"/>
     <w:uiPriority w:val="99"/>
     <w:unhideWhenUsed/>
-    <w:rsid w:val="00D326EE"/>
+    <w:rsid w:val="00CB1096"/>
     <w:rPr>
       <w:color w:val="7BACE4" w:themeColor="hyperlink"/>
       <w:u w:val="single"/>
@@ -37189,7 +37713,7 @@
     <w:autoRedefine/>
     <w:uiPriority w:val="39"/>
     <w:unhideWhenUsed/>
-    <w:rsid w:val="00D326EE"/>
+    <w:rsid w:val="00CB1096"/>
     <w:pPr>
       <w:spacing w:after="100"/>
       <w:ind w:left="960"/>
@@ -37200,7 +37724,7 @@
     <w:basedOn w:val="TOCHeading"/>
     <w:next w:val="Normal"/>
     <w:qFormat/>
-    <w:rsid w:val="00D326EE"/>
+    <w:rsid w:val="00CB1096"/>
     <w:rPr>
       <w:sz w:val="40"/>
       <w:szCs w:val="24"/>
@@ -37211,7 +37735,7 @@
     <w:basedOn w:val="Normal"/>
     <w:next w:val="Normal"/>
     <w:qFormat/>
-    <w:rsid w:val="00D326EE"/>
+    <w:rsid w:val="00CB1096"/>
     <w:rPr>
       <w:color w:val="282864" w:themeColor="text1"/>
       <w:sz w:val="24"/>
@@ -37923,6 +38447,31 @@
 </file>
 
 <file path=customXml/item2.xml><?xml version="1.0" encoding="utf-8"?>
+<?mso-contentType ?>
+<FormTemplates xmlns="http://schemas.microsoft.com/sharepoint/v3/contenttype/forms">
+  <Display>DocumentLibraryForm</Display>
+  <Edit>DocumentLibraryForm</Edit>
+  <New>DocumentLibraryForm</New>
+</FormTemplates>
+</file>
+
+<file path=customXml/item3.xml><?xml version="1.0" encoding="utf-8"?>
+<p:properties xmlns:p="http://schemas.microsoft.com/office/2006/metadata/properties" xmlns:xsi="http://www.w3.org/2001/XMLSchema-instance" xmlns:pc="http://schemas.microsoft.com/office/infopath/2007/PartnerControls">
+  <documentManagement>
+    <TaxCatchAll xmlns="d0b9ae9d-b9ff-4ac6-9f08-4bf5543ea0ed" xsi:nil="true"/>
+    <lcf76f155ced4ddcb4097134ff3c332f xmlns="ab69df74-806e-4205-bc11-cddf1df0a3e1">
+      <Terms xmlns="http://schemas.microsoft.com/office/infopath/2007/PartnerControls"/>
+    </lcf76f155ced4ddcb4097134ff3c332f>
+    <CompanyName xmlns="ab69df74-806e-4205-bc11-cddf1df0a3e1" xsi:nil="true"/>
+  </documentManagement>
+</p:properties>
+</file>
+
+<file path=customXml/item4.xml><?xml version="1.0" encoding="utf-8"?>
+<b:Sources xmlns:b="http://schemas.openxmlformats.org/officeDocument/2006/bibliography" xmlns="http://schemas.openxmlformats.org/officeDocument/2006/bibliography" SelectedStyle="\APASixthEditionOfficeOnline.xsl" StyleName="APA" Version="6"/>
+</file>
+
+<file path=customXml/item5.xml><?xml version="1.0" encoding="utf-8"?>
 <ct:contentTypeSchema xmlns:ct="http://schemas.microsoft.com/office/2006/metadata/contentType" xmlns:ma="http://schemas.microsoft.com/office/2006/metadata/properties/metaAttributes" ct:_="" ma:_="" ma:contentTypeName="Document" ma:contentTypeID="0x01010045AA7F7F54632E4B863E70A91F1E2AE6" ma:contentTypeVersion="16" ma:contentTypeDescription="Create a new document." ma:contentTypeScope="" ma:versionID="b3a51e989e7584c984d64dee7090483a">
   <xsd:schema xmlns:xsd="http://www.w3.org/2001/XMLSchema" xmlns:xs="http://www.w3.org/2001/XMLSchema" xmlns:p="http://schemas.microsoft.com/office/2006/metadata/properties" xmlns:ns2="ab69df74-806e-4205-bc11-cddf1df0a3e1" xmlns:ns3="d0b9ae9d-b9ff-4ac6-9f08-4bf5543ea0ed" targetNamespace="http://schemas.microsoft.com/office/2006/metadata/properties" ma:root="true" ma:fieldsID="0740cd2af45862089ed0aecb8c9e4c54" ns2:_="" ns3:_="">
     <xsd:import namespace="ab69df74-806e-4205-bc11-cddf1df0a3e1"/>
@@ -38167,31 +38716,6 @@
 </ct:contentTypeSchema>
 </file>
 
-<file path=customXml/item3.xml><?xml version="1.0" encoding="utf-8"?>
-<?mso-contentType ?>
-<FormTemplates xmlns="http://schemas.microsoft.com/sharepoint/v3/contenttype/forms">
-  <Display>DocumentLibraryForm</Display>
-  <Edit>DocumentLibraryForm</Edit>
-  <New>DocumentLibraryForm</New>
-</FormTemplates>
-</file>
-
-<file path=customXml/item4.xml><?xml version="1.0" encoding="utf-8"?>
-<p:properties xmlns:p="http://schemas.microsoft.com/office/2006/metadata/properties" xmlns:xsi="http://www.w3.org/2001/XMLSchema-instance" xmlns:pc="http://schemas.microsoft.com/office/infopath/2007/PartnerControls">
-  <documentManagement>
-    <TaxCatchAll xmlns="d0b9ae9d-b9ff-4ac6-9f08-4bf5543ea0ed" xsi:nil="true"/>
-    <lcf76f155ced4ddcb4097134ff3c332f xmlns="ab69df74-806e-4205-bc11-cddf1df0a3e1">
-      <Terms xmlns="http://schemas.microsoft.com/office/infopath/2007/PartnerControls"/>
-    </lcf76f155ced4ddcb4097134ff3c332f>
-    <CompanyName xmlns="ab69df74-806e-4205-bc11-cddf1df0a3e1" xsi:nil="true"/>
-  </documentManagement>
-</p:properties>
-</file>
-
-<file path=customXml/item5.xml><?xml version="1.0" encoding="utf-8"?>
-<b:Sources xmlns:b="http://schemas.openxmlformats.org/officeDocument/2006/bibliography" xmlns="http://schemas.openxmlformats.org/officeDocument/2006/bibliography" SelectedStyle="\APASixthEditionOfficeOnline.xsl" StyleName="APA" Version="6"/>
-</file>
-
 <file path=customXml/itemProps1.xml><?xml version="1.0" encoding="utf-8"?>
 <ds:datastoreItem xmlns:ds="http://schemas.openxmlformats.org/officeDocument/2006/customXml" ds:itemID="{55AF091B-3C7A-41E3-B477-F2FDAA23CFDA}">
   <ds:schemaRefs>
@@ -38201,6 +38725,33 @@
 </file>
 
 <file path=customXml/itemProps2.xml><?xml version="1.0" encoding="utf-8"?>
+<ds:datastoreItem xmlns:ds="http://schemas.openxmlformats.org/officeDocument/2006/customXml" ds:itemID="{2072409F-AD5D-4085-AEE9-9754C5D9E00C}">
+  <ds:schemaRefs>
+    <ds:schemaRef ds:uri="http://schemas.microsoft.com/sharepoint/v3/contenttype/forms"/>
+  </ds:schemaRefs>
+</ds:datastoreItem>
+</file>
+
+<file path=customXml/itemProps3.xml><?xml version="1.0" encoding="utf-8"?>
+<ds:datastoreItem xmlns:ds="http://schemas.openxmlformats.org/officeDocument/2006/customXml" ds:itemID="{1BD5F70C-6275-43D5-9D9D-1ABC457572A7}">
+  <ds:schemaRefs>
+    <ds:schemaRef ds:uri="http://schemas.microsoft.com/office/2006/metadata/properties"/>
+    <ds:schemaRef ds:uri="http://schemas.microsoft.com/office/infopath/2007/PartnerControls"/>
+    <ds:schemaRef ds:uri="d0b9ae9d-b9ff-4ac6-9f08-4bf5543ea0ed"/>
+    <ds:schemaRef ds:uri="ab69df74-806e-4205-bc11-cddf1df0a3e1"/>
+  </ds:schemaRefs>
+</ds:datastoreItem>
+</file>
+
+<file path=customXml/itemProps4.xml><?xml version="1.0" encoding="utf-8"?>
+<ds:datastoreItem xmlns:ds="http://schemas.openxmlformats.org/officeDocument/2006/customXml" ds:itemID="{2A4ED582-8087-44EF-8CFD-FB5437CBC6AE}">
+  <ds:schemaRefs>
+    <ds:schemaRef ds:uri="http://schemas.openxmlformats.org/officeDocument/2006/bibliography"/>
+  </ds:schemaRefs>
+</ds:datastoreItem>
+</file>
+
+<file path=customXml/itemProps5.xml><?xml version="1.0" encoding="utf-8"?>
 <ds:datastoreItem xmlns:ds="http://schemas.openxmlformats.org/officeDocument/2006/customXml" ds:itemID="{EEF5E79D-862C-432A-B991-0DE66D53F92C}">
   <ds:schemaRefs>
     <ds:schemaRef ds:uri="http://schemas.microsoft.com/office/2006/metadata/contentType"/>
@@ -38217,31 +38768,4 @@
     <ds:schemaRef ds:uri="http://schemas.microsoft.com/internal/obd"/>
   </ds:schemaRefs>
 </ds:datastoreItem>
-</file>
-
-<file path=customXml/itemProps3.xml><?xml version="1.0" encoding="utf-8"?>
-<ds:datastoreItem xmlns:ds="http://schemas.openxmlformats.org/officeDocument/2006/customXml" ds:itemID="{2072409F-AD5D-4085-AEE9-9754C5D9E00C}">
-  <ds:schemaRefs>
-    <ds:schemaRef ds:uri="http://schemas.microsoft.com/sharepoint/v3/contenttype/forms"/>
-  </ds:schemaRefs>
-</ds:datastoreItem>
-</file>
-
-<file path=customXml/itemProps4.xml><?xml version="1.0" encoding="utf-8"?>
-<ds:datastoreItem xmlns:ds="http://schemas.openxmlformats.org/officeDocument/2006/customXml" ds:itemID="{1BD5F70C-6275-43D5-9D9D-1ABC457572A7}">
-  <ds:schemaRefs>
-    <ds:schemaRef ds:uri="http://schemas.microsoft.com/office/2006/metadata/properties"/>
-    <ds:schemaRef ds:uri="http://schemas.microsoft.com/office/infopath/2007/PartnerControls"/>
-    <ds:schemaRef ds:uri="d0b9ae9d-b9ff-4ac6-9f08-4bf5543ea0ed"/>
-    <ds:schemaRef ds:uri="ab69df74-806e-4205-bc11-cddf1df0a3e1"/>
-  </ds:schemaRefs>
-</ds:datastoreItem>
-</file>
-
-<file path=customXml/itemProps5.xml><?xml version="1.0" encoding="utf-8"?>
-<ds:datastoreItem xmlns:ds="http://schemas.openxmlformats.org/officeDocument/2006/customXml" ds:itemID="{2A4ED582-8087-44EF-8CFD-FB5437CBC6AE}">
-  <ds:schemaRefs>
-    <ds:schemaRef ds:uri="http://schemas.openxmlformats.org/officeDocument/2006/bibliography"/>
-  </ds:schemaRefs>
-</ds:datastoreItem>
 </file>
</xml_diff>